<commit_message>
Update resume PDF and DOCX in uploads
Co-Authored-By: Claude Opus 4.7 (1M context) <noreply@anthropic.com>
</commit_message>
<xml_diff>
--- a/uploads/Efrain_Plascencia_Resume.docx
+++ b/uploads/Efrain_Plascencia_Resume.docx
@@ -333,7 +333,13 @@
         <w:rPr>
           <w:rFonts w:eastAsia="Inter" w:cs="Inter"/>
         </w:rPr>
-        <w:t>Automotive software engineer with 10+ years leading quality, integration, and delivery of connected-vehicle and telematics systems across OEM programs at Toyota, Mercedes-Benz, Hyundai, and PACCAR. Deep hands-on experience with DCM and infotainment head units, in-vehicle ECU communication, and backend/cloud integration for user-facing features including account registration, profile activation, and remote services. Skilled technical liaison across app, head-unit, and server teams — coordinating test strategies, triaging bugs, running cross-functional meetings, and driving root-cause analysis across hardware and software stacks.</w:t>
+        <w:t>Automotive software engineer with 10+ years leading quality, integration, and delivery of connected-vehicle and telematics systems across OEM programs at Toyota, Mercedes-Benz, Hyundai, and PACCAR. Deep hands-on experience with DCM and infotainment head units, in-vehicle ECU communication, and backend/cloud integration for user-facing features including account registration, profile activation, and remote services. Skilled technical liaison across app, head-unit, and server teams — coordinating test strateg</w:t>
+      </w:r>
+      <w:r>
+        <w:rPr>
+          <w:rFonts w:eastAsia="Inter" w:cs="Inter"/>
+        </w:rPr>
+        <w:t>ies, triaging bugs, running cross-functional meetings, and driving root-cause analysis across hardware and software stacks.</w:t>
       </w:r>
     </w:p>
     <w:p>
@@ -1028,7 +1034,6 @@
           <w:rFonts w:eastAsia="Inter" w:cs="Inter"/>
           <w:color w:val="154C8C"/>
         </w:rPr>
-        <w:lastRenderedPageBreak/>
         <w:t xml:space="preserve">— </w:t>
       </w:r>
       <w:r>
@@ -1071,6 +1076,7 @@
           <w:spacing w:val="24"/>
           <w:sz w:val="16"/>
         </w:rPr>
+        <w:lastRenderedPageBreak/>
         <w:t xml:space="preserve">EXPERIENCE   </w:t>
       </w:r>
       <w:r>
@@ -1679,7 +1685,6 @@
           <w:spacing w:val="20"/>
           <w:sz w:val="18"/>
         </w:rPr>
-        <w:lastRenderedPageBreak/>
         <w:t xml:space="preserve">04   </w:t>
       </w:r>
       <w:r>
@@ -1753,6 +1758,7 @@
           <w:spacing w:val="24"/>
           <w:sz w:val="17"/>
         </w:rPr>
+        <w:lastRenderedPageBreak/>
         <w:t xml:space="preserve">PROCESS &amp; TOOLING   </w:t>
       </w:r>
     </w:p>
@@ -2144,134 +2150,48 @@
     </w:p>
     <w:p>
       <w:pPr>
+        <w:pBdr>
+          <w:bottom w:val="single" w:sz="4" w:space="4" w:color="DDD9D1"/>
+        </w:pBdr>
+        <w:spacing w:before="320" w:after="120"/>
+      </w:pPr>
+      <w:r>
+        <w:rPr>
+          <w:rFonts w:ascii="JetBrains Mono" w:eastAsia="JetBrains Mono" w:hAnsi="JetBrains Mono" w:cs="JetBrains Mono"/>
+          <w:color w:val="A8A5A0"/>
+          <w:spacing w:val="20"/>
+          <w:sz w:val="18"/>
+        </w:rPr>
+        <w:t xml:space="preserve">XX   </w:t>
+      </w:r>
+      <w:r>
+        <w:rPr>
+          <w:rFonts w:ascii="JetBrains Mono" w:eastAsia="JetBrains Mono" w:hAnsi="JetBrains Mono" w:cs="JetBrains Mono"/>
+          <w:color w:val="1A1A1A"/>
+          <w:spacing w:val="30"/>
+          <w:sz w:val="18"/>
+        </w:rPr>
+        <w:t>COMPANION SITE</w:t>
+      </w:r>
+    </w:p>
+    <w:p>
+      <w:pPr>
         <w:spacing w:after="80"/>
-      </w:pPr>
-      <w:r>
-        <w:t xml:space="preserve">XX    COMPANION SITE </w:t>
-      </w:r>
-    </w:p>
-    <w:tbl>
-      <w:tblPr>
-        <w:tblpPr w:leftFromText="45" w:rightFromText="45" w:vertAnchor="text"/>
-        <w:tblW w:w="0" w:type="auto"/>
-        <w:tblCellSpacing w:w="0" w:type="dxa"/>
-        <w:tblCellMar>
-          <w:left w:w="0" w:type="dxa"/>
-          <w:right w:w="0" w:type="dxa"/>
-        </w:tblCellMar>
-        <w:tblLook w:val="04A0" w:firstRow="1" w:lastRow="0" w:firstColumn="1" w:lastColumn="0" w:noHBand="0" w:noVBand="1"/>
-      </w:tblPr>
-      <w:tblGrid>
-        <w:gridCol w:w="6"/>
-        <w:gridCol w:w="10794"/>
-      </w:tblGrid>
-      <w:tr>
-        <w:trPr>
-          <w:gridAfter w:val="1"/>
-          <w:tblCellSpacing w:w="0" w:type="dxa"/>
-        </w:trPr>
-        <w:tc>
-          <w:tcPr>
-            <w:tcW w:w="690" w:type="dxa"/>
-            <w:vAlign w:val="center"/>
-            <w:hideMark/>
-          </w:tcPr>
-          <w:p>
-            <w:pPr>
-              <w:spacing w:after="80"/>
-            </w:pPr>
-          </w:p>
-        </w:tc>
-      </w:tr>
-      <w:tr>
-        <w:trPr>
-          <w:tblCellSpacing w:w="0" w:type="dxa"/>
-        </w:trPr>
-        <w:tc>
-          <w:tcPr>
-            <w:tcW w:w="0" w:type="auto"/>
-            <w:vAlign w:val="center"/>
-            <w:hideMark/>
-          </w:tcPr>
-          <w:p>
-            <w:pPr>
-              <w:spacing w:after="80"/>
-            </w:pPr>
-          </w:p>
-        </w:tc>
-        <w:tc>
-          <w:tcPr>
-            <w:tcW w:w="0" w:type="auto"/>
-            <w:vAlign w:val="center"/>
-            <w:hideMark/>
-          </w:tcPr>
-          <w:p>
-            <w:pPr>
-              <w:spacing w:after="80"/>
-            </w:pPr>
-            <w:r>
-              <w:rPr>
-                <w:noProof/>
-              </w:rPr>
-              <w:drawing>
-                <wp:inline distT="0" distB="0" distL="0" distR="0" wp14:anchorId="6E1E5798" wp14:editId="3751C485">
-                  <wp:extent cx="6858000" cy="9525"/>
-                  <wp:effectExtent l="0" t="0" r="0" b="0"/>
-                  <wp:docPr id="1849474855" name="Picture 4"/>
-                  <wp:cNvGraphicFramePr>
-                    <a:graphicFrameLocks xmlns:a="http://schemas.openxmlformats.org/drawingml/2006/main" noChangeAspect="1"/>
-                  </wp:cNvGraphicFramePr>
-                  <a:graphic xmlns:a="http://schemas.openxmlformats.org/drawingml/2006/main">
-                    <a:graphicData uri="http://schemas.openxmlformats.org/drawingml/2006/picture">
-                      <pic:pic xmlns:pic="http://schemas.openxmlformats.org/drawingml/2006/picture">
-                        <pic:nvPicPr>
-                          <pic:cNvPr id="0" name="Picture 11"/>
-                          <pic:cNvPicPr>
-                            <a:picLocks noChangeAspect="1" noChangeArrowheads="1"/>
-                          </pic:cNvPicPr>
-                        </pic:nvPicPr>
-                        <pic:blipFill>
-                          <a:blip r:embed="rId7">
-                            <a:extLst>
-                              <a:ext uri="{28A0092B-C50C-407E-A947-70E740481C1C}">
-                                <a14:useLocalDpi xmlns:a14="http://schemas.microsoft.com/office/drawing/2010/main" val="0"/>
-                              </a:ext>
-                            </a:extLst>
-                          </a:blip>
-                          <a:srcRect/>
-                          <a:stretch>
-                            <a:fillRect/>
-                          </a:stretch>
-                        </pic:blipFill>
-                        <pic:spPr bwMode="auto">
-                          <a:xfrm>
-                            <a:off x="0" y="0"/>
-                            <a:ext cx="6858000" cy="9525"/>
-                          </a:xfrm>
-                          <a:prstGeom prst="rect">
-                            <a:avLst/>
-                          </a:prstGeom>
-                          <a:noFill/>
-                          <a:ln>
-                            <a:noFill/>
-                          </a:ln>
-                        </pic:spPr>
-                      </pic:pic>
-                    </a:graphicData>
-                  </a:graphic>
-                </wp:inline>
-              </w:drawing>
-            </w:r>
-          </w:p>
-        </w:tc>
-      </w:tr>
-    </w:tbl>
-    <w:p>
-      <w:pPr>
-        <w:spacing w:after="80"/>
-      </w:pPr>
-      <w:r>
-        <w:t>www.efrain.me</w:t>
+        <w:rPr>
+          <w:rFonts w:ascii="JetBrains Mono" w:eastAsia="JetBrains Mono" w:hAnsi="JetBrains Mono" w:cs="JetBrains Mono"/>
+          <w:color w:val="6A6A6A"/>
+          <w:spacing w:val="20"/>
+          <w:sz w:val="16"/>
+        </w:rPr>
+      </w:pPr>
+      <w:r>
+        <w:rPr>
+          <w:rFonts w:ascii="JetBrains Mono" w:eastAsia="JetBrains Mono" w:hAnsi="JetBrains Mono" w:cs="JetBrains Mono"/>
+          <w:color w:val="6A6A6A"/>
+          <w:spacing w:val="16"/>
+          <w:sz w:val="18"/>
+        </w:rPr>
+        <w:t>https://www.efrain.me/</w:t>
       </w:r>
     </w:p>
     <w:tbl>
@@ -2363,10 +2283,10 @@
                     <pic:cNvPicPr/>
                   </pic:nvPicPr>
                   <pic:blipFill>
-                    <a:blip r:embed="rId8">
+                    <a:blip r:embed="rId7">
                       <a:extLst>
                         <a:ext uri="{96DAC541-7B7A-43D3-8B79-37D633B846F1}">
-                          <asvg:svgBlip xmlns:asvg="http://schemas.microsoft.com/office/drawing/2016/SVG/main" r:embed="rId9"/>
+                          <asvg:svgBlip xmlns:asvg="http://schemas.microsoft.com/office/drawing/2016/SVG/main" r:embed="rId8"/>
                         </a:ext>
                       </a:extLst>
                     </a:blip>
@@ -2995,7 +2915,7 @@
   <w:style w:type="paragraph" w:default="1" w:styleId="Normal">
     <w:name w:val="Normal"/>
     <w:qFormat/>
-    <w:rsid w:val="00FC693F"/>
+    <w:rsid w:val="00A211F0"/>
     <w:rPr>
       <w:rFonts w:ascii="Inter" w:hAnsi="Inter"/>
       <w:color w:val="3A3A3A"/>

</xml_diff>

<commit_message>
Regenerate downloadable resume with X link and kytimes tech tags
make_resume.py now renders the X/Twitter contact link and the
project tech-stack tags (#-prefixed mono chips, mirroring the site),
bringing the DOCX/PDF back in sync with resume-data.js.

Co-Authored-By: Claude Fable 5 <noreply@anthropic.com>
Claude-Session: https://claude.ai/code/session_019qgKRsNgNysMTg9WQprRMm
</commit_message>
<xml_diff>
--- a/uploads/Efrain_Plascencia_Resume.docx
+++ b/uploads/Efrain_Plascencia_Resume.docx
@@ -93,7 +93,7 @@
           <w:sz w:val="16"/>
           <w:spacing w:val="20"/>
         </w:rPr>
-        <w:t>DALLAS–FORT WORTH, TX   ·   213.321.7937   ·   EFRAIN.PLASCENCIA@GMAIL.COM   ·   LINKEDIN.COM/IN/EFRAINP   ·   GITHUB.COM/FRIN-BOT</w:t>
+        <w:t>DALLAS–FORT WORTH, TX   ·   213.321.7937   ·   EFRAIN.PLASCENCIA@GMAIL.COM   ·   LINKEDIN.COM/IN/EFRAINP   ·   GITHUB.COM/FRIN-BOT   ·   X.COM/EFRAINPLASC</w:t>
       </w:r>
     </w:p>
     <w:p>
@@ -2272,6 +2272,218 @@
     </w:p>
     <w:p>
       <w:pPr>
+        <w:spacing w:before="80" w:after="40"/>
+      </w:pPr>
+      <w:r>
+        <w:rPr>
+          <w:rFonts w:ascii="JetBrains Mono" w:hAnsi="JetBrains Mono" w:cs="JetBrains Mono" w:eastAsia="JetBrains Mono"/>
+          <w:b w:val="0"/>
+          <w:i w:val="0"/>
+          <w:color w:val="154C8C"/>
+          <w:sz w:val="17"/>
+        </w:rPr>
+        <w:t>#</w:t>
+      </w:r>
+      <w:r>
+        <w:rPr>
+          <w:rFonts w:ascii="JetBrains Mono" w:hAnsi="JetBrains Mono" w:cs="JetBrains Mono" w:eastAsia="JetBrains Mono"/>
+          <w:b w:val="0"/>
+          <w:i w:val="0"/>
+          <w:color w:val="6A6A6A"/>
+          <w:sz w:val="17"/>
+          <w:spacing w:val="12"/>
+        </w:rPr>
+        <w:t>Linear</w:t>
+      </w:r>
+      <w:r>
+        <w:rPr>
+          <w:rFonts w:ascii="JetBrains Mono" w:hAnsi="JetBrains Mono" w:cs="JetBrains Mono" w:eastAsia="JetBrains Mono"/>
+          <w:b w:val="0"/>
+          <w:i w:val="0"/>
+          <w:color w:val="6A6A6A"/>
+          <w:sz w:val="17"/>
+        </w:rPr>
+        <w:t xml:space="preserve">   </w:t>
+      </w:r>
+      <w:r>
+        <w:rPr>
+          <w:rFonts w:ascii="JetBrains Mono" w:hAnsi="JetBrains Mono" w:cs="JetBrains Mono" w:eastAsia="JetBrains Mono"/>
+          <w:b w:val="0"/>
+          <w:i w:val="0"/>
+          <w:color w:val="154C8C"/>
+          <w:sz w:val="17"/>
+        </w:rPr>
+        <w:t>#</w:t>
+      </w:r>
+      <w:r>
+        <w:rPr>
+          <w:rFonts w:ascii="JetBrains Mono" w:hAnsi="JetBrains Mono" w:cs="JetBrains Mono" w:eastAsia="JetBrains Mono"/>
+          <w:b w:val="0"/>
+          <w:i w:val="0"/>
+          <w:color w:val="6A6A6A"/>
+          <w:sz w:val="17"/>
+          <w:spacing w:val="12"/>
+        </w:rPr>
+        <w:t>ClaudeCodeCLI</w:t>
+      </w:r>
+      <w:r>
+        <w:rPr>
+          <w:rFonts w:ascii="JetBrains Mono" w:hAnsi="JetBrains Mono" w:cs="JetBrains Mono" w:eastAsia="JetBrains Mono"/>
+          <w:b w:val="0"/>
+          <w:i w:val="0"/>
+          <w:color w:val="6A6A6A"/>
+          <w:sz w:val="17"/>
+        </w:rPr>
+        <w:t xml:space="preserve">   </w:t>
+      </w:r>
+      <w:r>
+        <w:rPr>
+          <w:rFonts w:ascii="JetBrains Mono" w:hAnsi="JetBrains Mono" w:cs="JetBrains Mono" w:eastAsia="JetBrains Mono"/>
+          <w:b w:val="0"/>
+          <w:i w:val="0"/>
+          <w:color w:val="154C8C"/>
+          <w:sz w:val="17"/>
+        </w:rPr>
+        <w:t>#</w:t>
+      </w:r>
+      <w:r>
+        <w:rPr>
+          <w:rFonts w:ascii="JetBrains Mono" w:hAnsi="JetBrains Mono" w:cs="JetBrains Mono" w:eastAsia="JetBrains Mono"/>
+          <w:b w:val="0"/>
+          <w:i w:val="0"/>
+          <w:color w:val="6A6A6A"/>
+          <w:sz w:val="17"/>
+          <w:spacing w:val="12"/>
+        </w:rPr>
+        <w:t>Vercel</w:t>
+      </w:r>
+      <w:r>
+        <w:rPr>
+          <w:rFonts w:ascii="JetBrains Mono" w:hAnsi="JetBrains Mono" w:cs="JetBrains Mono" w:eastAsia="JetBrains Mono"/>
+          <w:b w:val="0"/>
+          <w:i w:val="0"/>
+          <w:color w:val="6A6A6A"/>
+          <w:sz w:val="17"/>
+        </w:rPr>
+        <w:t xml:space="preserve">   </w:t>
+      </w:r>
+      <w:r>
+        <w:rPr>
+          <w:rFonts w:ascii="JetBrains Mono" w:hAnsi="JetBrains Mono" w:cs="JetBrains Mono" w:eastAsia="JetBrains Mono"/>
+          <w:b w:val="0"/>
+          <w:i w:val="0"/>
+          <w:color w:val="154C8C"/>
+          <w:sz w:val="17"/>
+        </w:rPr>
+        <w:t>#</w:t>
+      </w:r>
+      <w:r>
+        <w:rPr>
+          <w:rFonts w:ascii="JetBrains Mono" w:hAnsi="JetBrains Mono" w:cs="JetBrains Mono" w:eastAsia="JetBrains Mono"/>
+          <w:b w:val="0"/>
+          <w:i w:val="0"/>
+          <w:color w:val="6A6A6A"/>
+          <w:sz w:val="17"/>
+          <w:spacing w:val="12"/>
+        </w:rPr>
+        <w:t>Neon.Tech</w:t>
+      </w:r>
+      <w:r>
+        <w:rPr>
+          <w:rFonts w:ascii="JetBrains Mono" w:hAnsi="JetBrains Mono" w:cs="JetBrains Mono" w:eastAsia="JetBrains Mono"/>
+          <w:b w:val="0"/>
+          <w:i w:val="0"/>
+          <w:color w:val="6A6A6A"/>
+          <w:sz w:val="17"/>
+        </w:rPr>
+        <w:t xml:space="preserve">   </w:t>
+      </w:r>
+      <w:r>
+        <w:rPr>
+          <w:rFonts w:ascii="JetBrains Mono" w:hAnsi="JetBrains Mono" w:cs="JetBrains Mono" w:eastAsia="JetBrains Mono"/>
+          <w:b w:val="0"/>
+          <w:i w:val="0"/>
+          <w:color w:val="154C8C"/>
+          <w:sz w:val="17"/>
+        </w:rPr>
+        <w:t>#</w:t>
+      </w:r>
+      <w:r>
+        <w:rPr>
+          <w:rFonts w:ascii="JetBrains Mono" w:hAnsi="JetBrains Mono" w:cs="JetBrains Mono" w:eastAsia="JetBrains Mono"/>
+          <w:b w:val="0"/>
+          <w:i w:val="0"/>
+          <w:color w:val="6A6A6A"/>
+          <w:sz w:val="17"/>
+          <w:spacing w:val="12"/>
+        </w:rPr>
+        <w:t>Stripe</w:t>
+      </w:r>
+      <w:r>
+        <w:rPr>
+          <w:rFonts w:ascii="JetBrains Mono" w:hAnsi="JetBrains Mono" w:cs="JetBrains Mono" w:eastAsia="JetBrains Mono"/>
+          <w:b w:val="0"/>
+          <w:i w:val="0"/>
+          <w:color w:val="6A6A6A"/>
+          <w:sz w:val="17"/>
+        </w:rPr>
+        <w:t xml:space="preserve">   </w:t>
+      </w:r>
+      <w:r>
+        <w:rPr>
+          <w:rFonts w:ascii="JetBrains Mono" w:hAnsi="JetBrains Mono" w:cs="JetBrains Mono" w:eastAsia="JetBrains Mono"/>
+          <w:b w:val="0"/>
+          <w:i w:val="0"/>
+          <w:color w:val="154C8C"/>
+          <w:sz w:val="17"/>
+        </w:rPr>
+        <w:t>#</w:t>
+      </w:r>
+      <w:r>
+        <w:rPr>
+          <w:rFonts w:ascii="JetBrains Mono" w:hAnsi="JetBrains Mono" w:cs="JetBrains Mono" w:eastAsia="JetBrains Mono"/>
+          <w:b w:val="0"/>
+          <w:i w:val="0"/>
+          <w:color w:val="6A6A6A"/>
+          <w:sz w:val="17"/>
+          <w:spacing w:val="12"/>
+        </w:rPr>
+        <w:t>OAuth</w:t>
+      </w:r>
+      <w:r>
+        <w:rPr>
+          <w:rFonts w:ascii="JetBrains Mono" w:hAnsi="JetBrains Mono" w:cs="JetBrains Mono" w:eastAsia="JetBrains Mono"/>
+          <w:b w:val="0"/>
+          <w:i w:val="0"/>
+          <w:color w:val="6A6A6A"/>
+          <w:sz w:val="17"/>
+        </w:rPr>
+        <w:t xml:space="preserve">   </w:t>
+      </w:r>
+      <w:r>
+        <w:rPr>
+          <w:rFonts w:ascii="JetBrains Mono" w:hAnsi="JetBrains Mono" w:cs="JetBrains Mono" w:eastAsia="JetBrains Mono"/>
+          <w:b w:val="0"/>
+          <w:i w:val="0"/>
+          <w:color w:val="154C8C"/>
+          <w:sz w:val="17"/>
+        </w:rPr>
+        <w:t>#</w:t>
+      </w:r>
+      <w:r>
+        <w:rPr>
+          <w:rFonts w:ascii="JetBrains Mono" w:hAnsi="JetBrains Mono" w:cs="JetBrains Mono" w:eastAsia="JetBrains Mono"/>
+          <w:b w:val="0"/>
+          <w:i w:val="0"/>
+          <w:color w:val="6A6A6A"/>
+          <w:sz w:val="17"/>
+          <w:spacing w:val="12"/>
+        </w:rPr>
+        <w:t>GitHub</w:t>
+      </w:r>
+    </w:p>
+    <w:p>
+      <w:pPr>
         <w:spacing w:before="320" w:after="120"/>
         <w:pBdr>
           <w:bottom w:val="single" w:sz="4" w:space="4" w:color="DDD9D1"/>

</xml_diff>

<commit_message>
Reorder downloadable resume newest-first and condense older roles
Section 03 now renders the timeline reversed (current role first,
education last); the site map keeps its chronological scroll order.
Older entries get condensed resumeBullets overrides in resume-data.js
(CSULB 2->1, Hyundai 4->2, Mercedes 4->2, Toyota 5->3) that only the
document generator uses - the site cards still show the full bullets.
Previous DOCX/PDF archived with a 26_08_05 date suffix in uploads/.

Co-Authored-By: Claude Fable 5 <noreply@anthropic.com>
Claude-Session: https://claude.ai/code/session_019qgKRsNgNysMTg9WQprRMm
</commit_message>
<xml_diff>
--- a/uploads/Efrain_Plascencia_Resume.docx
+++ b/uploads/Efrain_Plascencia_Resume.docx
@@ -730,7 +730,7 @@
           <w:sz w:val="16"/>
           <w:spacing w:val="24"/>
         </w:rPr>
-        <w:t xml:space="preserve">EDUCATION   </w:t>
+        <w:t xml:space="preserve">EXPERIENCE   </w:t>
       </w:r>
       <w:r>
         <w:rPr>
@@ -740,7 +740,7 @@
           <w:color w:val="1A1A1A"/>
           <w:sz w:val="26"/>
         </w:rPr>
-        <w:t>Bachelor of Science, Computer Science</w:t>
+        <w:t>Head of Business Development &amp; Engineering</w:t>
       </w:r>
       <w:r>
         <w:tab/>
@@ -754,7 +754,7 @@
           <w:sz w:val="17"/>
           <w:spacing w:val="20"/>
         </w:rPr>
-        <w:t>2008 — 2012</w:t>
+        <w:t>APR 2023 — PRESENT</w:t>
       </w:r>
     </w:p>
     <w:p>
@@ -770,7 +770,7 @@
           <w:sz w:val="18"/>
           <w:spacing w:val="12"/>
         </w:rPr>
-        <w:t>California State University, Long Beach</w:t>
+        <w:t>GEMMACON North America</w:t>
       </w:r>
       <w:r>
         <w:rPr>
@@ -790,7 +790,7 @@
           <w:color w:val="6A6A6A"/>
           <w:sz w:val="18"/>
         </w:rPr>
-        <w:t>Long Beach, CA</w:t>
+        <w:t>Long Beach, CA (Remote from DFW)</w:t>
       </w:r>
     </w:p>
     <w:p>
@@ -816,7 +816,7 @@
           <w:color w:val="3A3A3A"/>
           <w:sz w:val="20"/>
         </w:rPr>
-        <w:t>Four-year degree in Computer Science — foundation in systems, algorithms, and software architecture.</w:t>
+        <w:t>Built and lead a cross-functional technical team from the ground up — validating software for advanced automotive computing platforms including infotainment head units, domain controllers, and SDV architectures.</w:t>
       </w:r>
     </w:p>
     <w:p>
@@ -842,86 +842,7 @@
           <w:color w:val="3A3A3A"/>
           <w:sz w:val="20"/>
         </w:rPr>
-        <w:t>Bay-adjacent campus that launched a career in West-Coast automotive software.</w:t>
-      </w:r>
-    </w:p>
-    <w:p>
-      <w:pPr>
-        <w:spacing w:before="160" w:after="20"/>
-        <w:tabs>
-          <w:tab w:val="right" w:pos="10800"/>
-        </w:tabs>
-      </w:pPr>
-      <w:r>
-        <w:rPr>
-          <w:rFonts w:ascii="JetBrains Mono" w:hAnsi="JetBrains Mono" w:cs="JetBrains Mono" w:eastAsia="JetBrains Mono"/>
-          <w:b w:val="0"/>
-          <w:i w:val="0"/>
-          <w:color w:val="154C8C"/>
-          <w:sz w:val="16"/>
-          <w:spacing w:val="24"/>
-        </w:rPr>
-        <w:t xml:space="preserve">EXPERIENCE   </w:t>
-      </w:r>
-      <w:r>
-        <w:rPr>
-          <w:rFonts w:ascii="Inter Tight" w:hAnsi="Inter Tight" w:cs="Inter Tight" w:eastAsia="Inter Tight"/>
-          <w:b w:val="0"/>
-          <w:i w:val="0"/>
-          <w:color w:val="1A1A1A"/>
-          <w:sz w:val="26"/>
-        </w:rPr>
-        <w:t>Quality Engineer — Telematics</w:t>
-      </w:r>
-      <w:r>
-        <w:tab/>
-      </w:r>
-      <w:r>
-        <w:rPr>
-          <w:rFonts w:ascii="JetBrains Mono" w:hAnsi="JetBrains Mono" w:cs="JetBrains Mono" w:eastAsia="JetBrains Mono"/>
-          <w:b w:val="0"/>
-          <w:i w:val="0"/>
-          <w:color w:val="6A6A6A"/>
-          <w:sz w:val="17"/>
-          <w:spacing w:val="20"/>
-        </w:rPr>
-        <w:t>2013 — 2017</w:t>
-      </w:r>
-    </w:p>
-    <w:p>
-      <w:pPr>
-        <w:spacing w:after="80"/>
-      </w:pPr>
-      <w:r>
-        <w:rPr>
-          <w:rFonts w:ascii="JetBrains Mono" w:hAnsi="JetBrains Mono" w:cs="JetBrains Mono" w:eastAsia="JetBrains Mono"/>
-          <w:b w:val="0"/>
-          <w:i w:val="0"/>
-          <w:color w:val="3A3A3A"/>
-          <w:sz w:val="18"/>
-          <w:spacing w:val="12"/>
-        </w:rPr>
-        <w:t>Hyundai Autoever Telematics America</w:t>
-      </w:r>
-      <w:r>
-        <w:rPr>
-          <w:rFonts w:ascii="JetBrains Mono" w:hAnsi="JetBrains Mono" w:cs="JetBrains Mono" w:eastAsia="JetBrains Mono"/>
-          <w:b w:val="0"/>
-          <w:i w:val="0"/>
-          <w:color w:val="A8A5A0"/>
-          <w:sz w:val="18"/>
-        </w:rPr>
-        <w:t xml:space="preserve">   ·   </w:t>
-      </w:r>
-      <w:r>
-        <w:rPr>
-          <w:rFonts w:ascii="JetBrains Mono" w:hAnsi="JetBrains Mono" w:cs="JetBrains Mono" w:eastAsia="JetBrains Mono"/>
-          <w:b w:val="0"/>
-          <w:i w:val="0"/>
-          <w:color w:val="6A6A6A"/>
-          <w:sz w:val="18"/>
-        </w:rPr>
-        <w:t>Fountain Valley, CA</w:t>
+        <w:t>Primary technical liaison across OEM programs — aligning client architects, embedded developers, backend/cloud teams, and QA on specifications, interfaces, and release criteria.</w:t>
       </w:r>
     </w:p>
     <w:p>
@@ -947,7 +868,7 @@
           <w:color w:val="3A3A3A"/>
           <w:sz w:val="20"/>
         </w:rPr>
-        <w:t>Designed and implemented QA processes for Hyundai telematics systems — full stack from DCM and head unit to backend connectivity.</w:t>
+        <w:t>Author test strategies and triage processes that resolve complex defects spanning app, head-unit, and server layers — reducing turnaround on cross-domain issues.</w:t>
       </w:r>
     </w:p>
     <w:p>
@@ -973,451 +894,7 @@
           <w:color w:val="3A3A3A"/>
           <w:sz w:val="20"/>
         </w:rPr>
-        <w:t>Validated hardware–software integrations across embedded firmware, cloud APIs, and mobile clients — improving first-pass reliability of connected features.</w:t>
-      </w:r>
-    </w:p>
-    <w:p>
-      <w:pPr>
-        <w:spacing w:before="40" w:after="40"/>
-        <w:ind w:left="288" w:hanging="288"/>
-      </w:pPr>
-      <w:r>
-        <w:rPr>
-          <w:rFonts w:ascii="Inter" w:hAnsi="Inter" w:cs="Inter" w:eastAsia="Inter"/>
-          <w:b w:val="0"/>
-          <w:i w:val="0"/>
-          <w:color w:val="154C8C"/>
-          <w:sz w:val="20"/>
-        </w:rPr>
-        <w:t xml:space="preserve">— </w:t>
-      </w:r>
-      <w:r>
-        <w:rPr>
-          <w:rFonts w:ascii="Inter" w:hAnsi="Inter" w:cs="Inter" w:eastAsia="Inter"/>
-          <w:b w:val="0"/>
-          <w:i w:val="0"/>
-          <w:color w:val="3A3A3A"/>
-          <w:sz w:val="20"/>
-        </w:rPr>
-        <w:t>Took on diverse responsibilities in a startup-scale environment: UAT, basic DevOps for deployment pipelines, early-stage requirements gathering.</w:t>
-      </w:r>
-    </w:p>
-    <w:p>
-      <w:pPr>
-        <w:spacing w:before="40" w:after="40"/>
-        <w:ind w:left="288" w:hanging="288"/>
-      </w:pPr>
-      <w:r>
-        <w:rPr>
-          <w:rFonts w:ascii="Inter" w:hAnsi="Inter" w:cs="Inter" w:eastAsia="Inter"/>
-          <w:b w:val="0"/>
-          <w:i w:val="0"/>
-          <w:color w:val="154C8C"/>
-          <w:sz w:val="20"/>
-        </w:rPr>
-        <w:t xml:space="preserve">— </w:t>
-      </w:r>
-      <w:r>
-        <w:rPr>
-          <w:rFonts w:ascii="Inter" w:hAnsi="Inter" w:cs="Inter" w:eastAsia="Inter"/>
-          <w:b w:val="0"/>
-          <w:i w:val="0"/>
-          <w:color w:val="3A3A3A"/>
-          <w:sz w:val="20"/>
-        </w:rPr>
-        <w:t>Built a generalist skill set across business analysis, product, and release management.</w:t>
-      </w:r>
-    </w:p>
-    <w:p>
-      <w:pPr>
-        <w:spacing w:before="160" w:after="20"/>
-        <w:tabs>
-          <w:tab w:val="right" w:pos="10800"/>
-        </w:tabs>
-      </w:pPr>
-      <w:r>
-        <w:rPr>
-          <w:rFonts w:ascii="JetBrains Mono" w:hAnsi="JetBrains Mono" w:cs="JetBrains Mono" w:eastAsia="JetBrains Mono"/>
-          <w:b w:val="0"/>
-          <w:i w:val="0"/>
-          <w:color w:val="154C8C"/>
-          <w:sz w:val="16"/>
-          <w:spacing w:val="24"/>
-        </w:rPr>
-        <w:t xml:space="preserve">EXPERIENCE   </w:t>
-      </w:r>
-      <w:r>
-        <w:rPr>
-          <w:rFonts w:ascii="Inter Tight" w:hAnsi="Inter Tight" w:cs="Inter Tight" w:eastAsia="Inter Tight"/>
-          <w:b w:val="0"/>
-          <w:i w:val="0"/>
-          <w:color w:val="1A1A1A"/>
-          <w:sz w:val="26"/>
-        </w:rPr>
-        <w:t>End-to-End Quality Engineer</w:t>
-      </w:r>
-      <w:r>
-        <w:tab/>
-      </w:r>
-      <w:r>
-        <w:rPr>
-          <w:rFonts w:ascii="JetBrains Mono" w:hAnsi="JetBrains Mono" w:cs="JetBrains Mono" w:eastAsia="JetBrains Mono"/>
-          <w:b w:val="0"/>
-          <w:i w:val="0"/>
-          <w:color w:val="6A6A6A"/>
-          <w:sz w:val="17"/>
-          <w:spacing w:val="20"/>
-        </w:rPr>
-        <w:t>MAR 2017 — MAR 2020</w:t>
-      </w:r>
-    </w:p>
-    <w:p>
-      <w:pPr>
-        <w:spacing w:after="80"/>
-      </w:pPr>
-      <w:r>
-        <w:rPr>
-          <w:rFonts w:ascii="JetBrains Mono" w:hAnsi="JetBrains Mono" w:cs="JetBrains Mono" w:eastAsia="JetBrains Mono"/>
-          <w:b w:val="0"/>
-          <w:i w:val="0"/>
-          <w:color w:val="3A3A3A"/>
-          <w:sz w:val="18"/>
-          <w:spacing w:val="12"/>
-        </w:rPr>
-        <w:t>Mercedes-Benz R&amp;D North America</w:t>
-      </w:r>
-      <w:r>
-        <w:rPr>
-          <w:rFonts w:ascii="JetBrains Mono" w:hAnsi="JetBrains Mono" w:cs="JetBrains Mono" w:eastAsia="JetBrains Mono"/>
-          <w:b w:val="0"/>
-          <w:i w:val="0"/>
-          <w:color w:val="A8A5A0"/>
-          <w:sz w:val="18"/>
-        </w:rPr>
-        <w:t xml:space="preserve">   ·   </w:t>
-      </w:r>
-      <w:r>
-        <w:rPr>
-          <w:rFonts w:ascii="JetBrains Mono" w:hAnsi="JetBrains Mono" w:cs="JetBrains Mono" w:eastAsia="JetBrains Mono"/>
-          <w:b w:val="0"/>
-          <w:i w:val="0"/>
-          <w:color w:val="6A6A6A"/>
-          <w:sz w:val="18"/>
-        </w:rPr>
-        <w:t>Long Beach, CA</w:t>
-      </w:r>
-    </w:p>
-    <w:p>
-      <w:pPr>
-        <w:spacing w:before="40" w:after="40"/>
-        <w:ind w:left="288" w:hanging="288"/>
-      </w:pPr>
-      <w:r>
-        <w:rPr>
-          <w:rFonts w:ascii="Inter" w:hAnsi="Inter" w:cs="Inter" w:eastAsia="Inter"/>
-          <w:b w:val="0"/>
-          <w:i w:val="0"/>
-          <w:color w:val="154C8C"/>
-          <w:sz w:val="20"/>
-        </w:rPr>
-        <w:t xml:space="preserve">— </w:t>
-      </w:r>
-      <w:r>
-        <w:rPr>
-          <w:rFonts w:ascii="Inter" w:hAnsi="Inter" w:cs="Inter" w:eastAsia="Inter"/>
-          <w:b w:val="0"/>
-          <w:i w:val="0"/>
-          <w:color w:val="3A3A3A"/>
-          <w:sz w:val="20"/>
-        </w:rPr>
-        <w:t>Led end-to-end testing for integrated vehicle systems — head unit, smartphones, digital assistants (Siri, Alexa), wearables, and IoT devices in premium automotive settings.</w:t>
-      </w:r>
-    </w:p>
-    <w:p>
-      <w:pPr>
-        <w:spacing w:before="40" w:after="40"/>
-        <w:ind w:left="288" w:hanging="288"/>
-      </w:pPr>
-      <w:r>
-        <w:rPr>
-          <w:rFonts w:ascii="Inter" w:hAnsi="Inter" w:cs="Inter" w:eastAsia="Inter"/>
-          <w:b w:val="0"/>
-          <w:i w:val="0"/>
-          <w:color w:val="154C8C"/>
-          <w:sz w:val="20"/>
-        </w:rPr>
-        <w:t xml:space="preserve">— </w:t>
-      </w:r>
-      <w:r>
-        <w:rPr>
-          <w:rFonts w:ascii="Inter" w:hAnsi="Inter" w:cs="Inter" w:eastAsia="Inter"/>
-          <w:b w:val="0"/>
-          <w:i w:val="0"/>
-          <w:color w:val="3A3A3A"/>
-          <w:sz w:val="20"/>
-        </w:rPr>
-        <w:t>Designed detailed test strategies for software–hardware interactions on infotainment and telematics platforms.</w:t>
-      </w:r>
-    </w:p>
-    <w:p>
-      <w:pPr>
-        <w:spacing w:before="40" w:after="40"/>
-        <w:ind w:left="288" w:hanging="288"/>
-      </w:pPr>
-      <w:r>
-        <w:rPr>
-          <w:rFonts w:ascii="Inter" w:hAnsi="Inter" w:cs="Inter" w:eastAsia="Inter"/>
-          <w:b w:val="0"/>
-          <w:i w:val="0"/>
-          <w:color w:val="154C8C"/>
-          <w:sz w:val="20"/>
-        </w:rPr>
-        <w:t xml:space="preserve">— </w:t>
-      </w:r>
-      <w:r>
-        <w:rPr>
-          <w:rFonts w:ascii="Inter" w:hAnsi="Inter" w:cs="Inter" w:eastAsia="Inter"/>
-          <w:b w:val="0"/>
-          <w:i w:val="0"/>
-          <w:color w:val="3A3A3A"/>
-          <w:sz w:val="20"/>
-        </w:rPr>
-        <w:t>Identified and closed integration defects that improved system compatibility and UX consistency.</w:t>
-      </w:r>
-    </w:p>
-    <w:p>
-      <w:pPr>
-        <w:spacing w:before="40" w:after="40"/>
-        <w:ind w:left="288" w:hanging="288"/>
-      </w:pPr>
-      <w:r>
-        <w:rPr>
-          <w:rFonts w:ascii="Inter" w:hAnsi="Inter" w:cs="Inter" w:eastAsia="Inter"/>
-          <w:b w:val="0"/>
-          <w:i w:val="0"/>
-          <w:color w:val="154C8C"/>
-          <w:sz w:val="20"/>
-        </w:rPr>
-        <w:t xml:space="preserve">— </w:t>
-      </w:r>
-      <w:r>
-        <w:rPr>
-          <w:rFonts w:ascii="Inter" w:hAnsi="Inter" w:cs="Inter" w:eastAsia="Inter"/>
-          <w:b w:val="0"/>
-          <w:i w:val="0"/>
-          <w:color w:val="3A3A3A"/>
-          <w:sz w:val="20"/>
-        </w:rPr>
-        <w:t>Collaborated with business and engineering teams in Mexico — aligning regional requirements into global test processes for multi-market launches.</w:t>
-      </w:r>
-    </w:p>
-    <w:p>
-      <w:pPr>
-        <w:spacing w:before="160" w:after="20"/>
-        <w:tabs>
-          <w:tab w:val="right" w:pos="10800"/>
-        </w:tabs>
-      </w:pPr>
-      <w:r>
-        <w:rPr>
-          <w:rFonts w:ascii="JetBrains Mono" w:hAnsi="JetBrains Mono" w:cs="JetBrains Mono" w:eastAsia="JetBrains Mono"/>
-          <w:b w:val="0"/>
-          <w:i w:val="0"/>
-          <w:color w:val="154C8C"/>
-          <w:sz w:val="16"/>
-          <w:spacing w:val="24"/>
-        </w:rPr>
-        <w:t xml:space="preserve">EXPERIENCE   </w:t>
-      </w:r>
-      <w:r>
-        <w:rPr>
-          <w:rFonts w:ascii="Inter Tight" w:hAnsi="Inter Tight" w:cs="Inter Tight" w:eastAsia="Inter Tight"/>
-          <w:b w:val="0"/>
-          <w:i w:val="0"/>
-          <w:color w:val="1A1A1A"/>
-          <w:sz w:val="26"/>
-        </w:rPr>
-        <w:t>Senior Test Engineer — Connected Services</w:t>
-      </w:r>
-      <w:r>
-        <w:tab/>
-      </w:r>
-      <w:r>
-        <w:rPr>
-          <w:rFonts w:ascii="JetBrains Mono" w:hAnsi="JetBrains Mono" w:cs="JetBrains Mono" w:eastAsia="JetBrains Mono"/>
-          <w:b w:val="0"/>
-          <w:i w:val="0"/>
-          <w:color w:val="6A6A6A"/>
-          <w:sz w:val="17"/>
-          <w:spacing w:val="20"/>
-        </w:rPr>
-        <w:t>MAR 2020 — DEC 2022</w:t>
-      </w:r>
-    </w:p>
-    <w:p>
-      <w:pPr>
-        <w:spacing w:after="80"/>
-      </w:pPr>
-      <w:r>
-        <w:rPr>
-          <w:rFonts w:ascii="JetBrains Mono" w:hAnsi="JetBrains Mono" w:cs="JetBrains Mono" w:eastAsia="JetBrains Mono"/>
-          <w:b w:val="0"/>
-          <w:i w:val="0"/>
-          <w:color w:val="3A3A3A"/>
-          <w:sz w:val="18"/>
-          <w:spacing w:val="12"/>
-        </w:rPr>
-        <w:t>Toyota Motor North America</w:t>
-      </w:r>
-      <w:r>
-        <w:rPr>
-          <w:rFonts w:ascii="JetBrains Mono" w:hAnsi="JetBrains Mono" w:cs="JetBrains Mono" w:eastAsia="JetBrains Mono"/>
-          <w:b w:val="0"/>
-          <w:i w:val="0"/>
-          <w:color w:val="A8A5A0"/>
-          <w:sz w:val="18"/>
-        </w:rPr>
-        <w:t xml:space="preserve">   ·   </w:t>
-      </w:r>
-      <w:r>
-        <w:rPr>
-          <w:rFonts w:ascii="JetBrains Mono" w:hAnsi="JetBrains Mono" w:cs="JetBrains Mono" w:eastAsia="JetBrains Mono"/>
-          <w:b w:val="0"/>
-          <w:i w:val="0"/>
-          <w:color w:val="6A6A6A"/>
-          <w:sz w:val="18"/>
-        </w:rPr>
-        <w:t>Plano, TX</w:t>
-      </w:r>
-    </w:p>
-    <w:p>
-      <w:pPr>
-        <w:spacing w:before="40" w:after="40"/>
-        <w:ind w:left="288" w:hanging="288"/>
-      </w:pPr>
-      <w:r>
-        <w:rPr>
-          <w:rFonts w:ascii="Inter" w:hAnsi="Inter" w:cs="Inter" w:eastAsia="Inter"/>
-          <w:b w:val="0"/>
-          <w:i w:val="0"/>
-          <w:color w:val="154C8C"/>
-          <w:sz w:val="20"/>
-        </w:rPr>
-        <w:t xml:space="preserve">— </w:t>
-      </w:r>
-      <w:r>
-        <w:rPr>
-          <w:rFonts w:ascii="Inter" w:hAnsi="Inter" w:cs="Inter" w:eastAsia="Inter"/>
-          <w:b w:val="0"/>
-          <w:i w:val="0"/>
-          <w:color w:val="3A3A3A"/>
-          <w:sz w:val="20"/>
-        </w:rPr>
-        <w:t>2.5 years on Toyota connected-vehicle applications — working directly with product, app, head-unit, and backend teams on user-facing telematics features.</w:t>
-      </w:r>
-    </w:p>
-    <w:p>
-      <w:pPr>
-        <w:spacing w:before="40" w:after="40"/>
-        <w:ind w:left="288" w:hanging="288"/>
-      </w:pPr>
-      <w:r>
-        <w:rPr>
-          <w:rFonts w:ascii="Inter" w:hAnsi="Inter" w:cs="Inter" w:eastAsia="Inter"/>
-          <w:b w:val="0"/>
-          <w:i w:val="0"/>
-          <w:color w:val="154C8C"/>
-          <w:sz w:val="20"/>
-        </w:rPr>
-        <w:t xml:space="preserve">— </w:t>
-      </w:r>
-      <w:r>
-        <w:rPr>
-          <w:rFonts w:ascii="Inter" w:hAnsi="Inter" w:cs="Inter" w:eastAsia="Inter"/>
-          <w:b w:val="0"/>
-          <w:i w:val="0"/>
-          <w:color w:val="3A3A3A"/>
-          <w:sz w:val="20"/>
-        </w:rPr>
-        <w:t>Owned the technical path for end-to-end validation of user profile, registration, and account-activation flows across mobile app, vehicle head unit, and server.</w:t>
-      </w:r>
-    </w:p>
-    <w:p>
-      <w:pPr>
-        <w:spacing w:before="40" w:after="40"/>
-        <w:ind w:left="288" w:hanging="288"/>
-      </w:pPr>
-      <w:r>
-        <w:rPr>
-          <w:rFonts w:ascii="Inter" w:hAnsi="Inter" w:cs="Inter" w:eastAsia="Inter"/>
-          <w:b w:val="0"/>
-          <w:i w:val="0"/>
-          <w:color w:val="154C8C"/>
-          <w:sz w:val="20"/>
-        </w:rPr>
-        <w:t xml:space="preserve">— </w:t>
-      </w:r>
-      <w:r>
-        <w:rPr>
-          <w:rFonts w:ascii="Inter" w:hAnsi="Inter" w:cs="Inter" w:eastAsia="Inter"/>
-          <w:b w:val="0"/>
-          <w:i w:val="0"/>
-          <w:color w:val="3A3A3A"/>
-          <w:sz w:val="20"/>
-        </w:rPr>
-        <w:t>Validated service activations across cloud backends and the in-vehicle DCM — identifying and closing specification gaps before release.</w:t>
-      </w:r>
-    </w:p>
-    <w:p>
-      <w:pPr>
-        <w:spacing w:before="40" w:after="40"/>
-        <w:ind w:left="288" w:hanging="288"/>
-      </w:pPr>
-      <w:r>
-        <w:rPr>
-          <w:rFonts w:ascii="Inter" w:hAnsi="Inter" w:cs="Inter" w:eastAsia="Inter"/>
-          <w:b w:val="0"/>
-          <w:i w:val="0"/>
-          <w:color w:val="154C8C"/>
-          <w:sz w:val="20"/>
-        </w:rPr>
-        <w:t xml:space="preserve">— </w:t>
-      </w:r>
-      <w:r>
-        <w:rPr>
-          <w:rFonts w:ascii="Inter" w:hAnsi="Inter" w:cs="Inter" w:eastAsia="Inter"/>
-          <w:b w:val="0"/>
-          <w:i w:val="0"/>
-          <w:color w:val="3A3A3A"/>
-          <w:sz w:val="20"/>
-        </w:rPr>
-        <w:t>Authored and translated test cases from Japan HQ and North America product requirements; led defect triage with global engineering counterparts across time zones.</w:t>
-      </w:r>
-    </w:p>
-    <w:p>
-      <w:pPr>
-        <w:spacing w:before="40" w:after="40"/>
-        <w:ind w:left="288" w:hanging="288"/>
-      </w:pPr>
-      <w:r>
-        <w:rPr>
-          <w:rFonts w:ascii="Inter" w:hAnsi="Inter" w:cs="Inter" w:eastAsia="Inter"/>
-          <w:b w:val="0"/>
-          <w:i w:val="0"/>
-          <w:color w:val="154C8C"/>
-          <w:sz w:val="20"/>
-        </w:rPr>
-        <w:t xml:space="preserve">— </w:t>
-      </w:r>
-      <w:r>
-        <w:rPr>
-          <w:rFonts w:ascii="Inter" w:hAnsi="Inter" w:cs="Inter" w:eastAsia="Inter"/>
-          <w:b w:val="0"/>
-          <w:i w:val="0"/>
-          <w:color w:val="3A3A3A"/>
-          <w:sz w:val="20"/>
-        </w:rPr>
-        <w:t>Acted as technical escalation point — reading and interpreting app and service-layer code to reproduce issues and assign ownership accurately.</w:t>
+        <w:t>Grew engineering headcount by 300% while partnering with global teams across North America, Europe, and Asia.</w:t>
       </w:r>
     </w:p>
     <w:p>
@@ -1629,7 +1106,7 @@
           <w:color w:val="1A1A1A"/>
           <w:sz w:val="26"/>
         </w:rPr>
-        <w:t>Head of Business Development &amp; Engineering</w:t>
+        <w:t>Senior Test Engineer — Connected Services</w:t>
       </w:r>
       <w:r>
         <w:tab/>
@@ -1643,7 +1120,7 @@
           <w:sz w:val="17"/>
           <w:spacing w:val="20"/>
         </w:rPr>
-        <w:t>APR 2023 — PRESENT</w:t>
+        <w:t>MAR 2020 — DEC 2022</w:t>
       </w:r>
     </w:p>
     <w:p>
@@ -1659,7 +1136,7 @@
           <w:sz w:val="18"/>
           <w:spacing w:val="12"/>
         </w:rPr>
-        <w:t>GEMMACON North America</w:t>
+        <w:t>Toyota Motor North America</w:t>
       </w:r>
       <w:r>
         <w:rPr>
@@ -1679,7 +1156,7 @@
           <w:color w:val="6A6A6A"/>
           <w:sz w:val="18"/>
         </w:rPr>
-        <w:t>Long Beach, CA (Remote from DFW)</w:t>
+        <w:t>Plano, TX</w:t>
       </w:r>
     </w:p>
     <w:p>
@@ -1705,7 +1182,7 @@
           <w:color w:val="3A3A3A"/>
           <w:sz w:val="20"/>
         </w:rPr>
-        <w:t>Built and lead a cross-functional technical team from the ground up — validating software for advanced automotive computing platforms including infotainment head units, domain controllers, and SDV architectures.</w:t>
+        <w:t>Owned end-to-end validation of user profile, registration, and account-activation flows across mobile app, vehicle head unit, and cloud backend for Toyota connected-vehicle applications.</w:t>
       </w:r>
     </w:p>
     <w:p>
@@ -1731,7 +1208,7 @@
           <w:color w:val="3A3A3A"/>
           <w:sz w:val="20"/>
         </w:rPr>
-        <w:t>Primary technical liaison across OEM programs — aligning client architects, embedded developers, backend/cloud teams, and QA on specifications, interfaces, and release criteria.</w:t>
+        <w:t>Validated service activations across cloud backends and the in-vehicle DCM — closing specification gaps before release.</w:t>
       </w:r>
     </w:p>
     <w:p>
@@ -1757,7 +1234,86 @@
           <w:color w:val="3A3A3A"/>
           <w:sz w:val="20"/>
         </w:rPr>
-        <w:t>Author test strategies and triage processes that resolve complex defects spanning app, head-unit, and server layers — reducing turnaround on cross-domain issues.</w:t>
+        <w:t>Authored and translated test cases between Japan HQ and North America; led global defect triage and served as technical escalation point, reading app and service-layer code to assign ownership.</w:t>
+      </w:r>
+    </w:p>
+    <w:p>
+      <w:pPr>
+        <w:spacing w:before="160" w:after="20"/>
+        <w:tabs>
+          <w:tab w:val="right" w:pos="10800"/>
+        </w:tabs>
+      </w:pPr>
+      <w:r>
+        <w:rPr>
+          <w:rFonts w:ascii="JetBrains Mono" w:hAnsi="JetBrains Mono" w:cs="JetBrains Mono" w:eastAsia="JetBrains Mono"/>
+          <w:b w:val="0"/>
+          <w:i w:val="0"/>
+          <w:color w:val="154C8C"/>
+          <w:sz w:val="16"/>
+          <w:spacing w:val="24"/>
+        </w:rPr>
+        <w:t xml:space="preserve">EXPERIENCE   </w:t>
+      </w:r>
+      <w:r>
+        <w:rPr>
+          <w:rFonts w:ascii="Inter Tight" w:hAnsi="Inter Tight" w:cs="Inter Tight" w:eastAsia="Inter Tight"/>
+          <w:b w:val="0"/>
+          <w:i w:val="0"/>
+          <w:color w:val="1A1A1A"/>
+          <w:sz w:val="26"/>
+        </w:rPr>
+        <w:t>End-to-End Quality Engineer</w:t>
+      </w:r>
+      <w:r>
+        <w:tab/>
+      </w:r>
+      <w:r>
+        <w:rPr>
+          <w:rFonts w:ascii="JetBrains Mono" w:hAnsi="JetBrains Mono" w:cs="JetBrains Mono" w:eastAsia="JetBrains Mono"/>
+          <w:b w:val="0"/>
+          <w:i w:val="0"/>
+          <w:color w:val="6A6A6A"/>
+          <w:sz w:val="17"/>
+          <w:spacing w:val="20"/>
+        </w:rPr>
+        <w:t>MAR 2017 — MAR 2020</w:t>
+      </w:r>
+    </w:p>
+    <w:p>
+      <w:pPr>
+        <w:spacing w:after="80"/>
+      </w:pPr>
+      <w:r>
+        <w:rPr>
+          <w:rFonts w:ascii="JetBrains Mono" w:hAnsi="JetBrains Mono" w:cs="JetBrains Mono" w:eastAsia="JetBrains Mono"/>
+          <w:b w:val="0"/>
+          <w:i w:val="0"/>
+          <w:color w:val="3A3A3A"/>
+          <w:sz w:val="18"/>
+          <w:spacing w:val="12"/>
+        </w:rPr>
+        <w:t>Mercedes-Benz R&amp;D North America</w:t>
+      </w:r>
+      <w:r>
+        <w:rPr>
+          <w:rFonts w:ascii="JetBrains Mono" w:hAnsi="JetBrains Mono" w:cs="JetBrains Mono" w:eastAsia="JetBrains Mono"/>
+          <w:b w:val="0"/>
+          <w:i w:val="0"/>
+          <w:color w:val="A8A5A0"/>
+          <w:sz w:val="18"/>
+        </w:rPr>
+        <w:t xml:space="preserve">   ·   </w:t>
+      </w:r>
+      <w:r>
+        <w:rPr>
+          <w:rFonts w:ascii="JetBrains Mono" w:hAnsi="JetBrains Mono" w:cs="JetBrains Mono" w:eastAsia="JetBrains Mono"/>
+          <w:b w:val="0"/>
+          <w:i w:val="0"/>
+          <w:color w:val="6A6A6A"/>
+          <w:sz w:val="18"/>
+        </w:rPr>
+        <w:t>Long Beach, CA</w:t>
       </w:r>
     </w:p>
     <w:p>
@@ -1783,7 +1339,269 @@
           <w:color w:val="3A3A3A"/>
           <w:sz w:val="20"/>
         </w:rPr>
-        <w:t>Grew engineering headcount by 300% while partnering with global teams across North America, Europe, and Asia.</w:t>
+        <w:t>Led end-to-end testing of integrated vehicle systems — head unit, smartphones, digital assistants (Siri, Alexa), wearables, and IoT devices — on premium infotainment and telematics platforms.</w:t>
+      </w:r>
+    </w:p>
+    <w:p>
+      <w:pPr>
+        <w:spacing w:before="40" w:after="40"/>
+        <w:ind w:left="288" w:hanging="288"/>
+      </w:pPr>
+      <w:r>
+        <w:rPr>
+          <w:rFonts w:ascii="Inter" w:hAnsi="Inter" w:cs="Inter" w:eastAsia="Inter"/>
+          <w:b w:val="0"/>
+          <w:i w:val="0"/>
+          <w:color w:val="154C8C"/>
+          <w:sz w:val="20"/>
+        </w:rPr>
+        <w:t xml:space="preserve">— </w:t>
+      </w:r>
+      <w:r>
+        <w:rPr>
+          <w:rFonts w:ascii="Inter" w:hAnsi="Inter" w:cs="Inter" w:eastAsia="Inter"/>
+          <w:b w:val="0"/>
+          <w:i w:val="0"/>
+          <w:color w:val="3A3A3A"/>
+          <w:sz w:val="20"/>
+        </w:rPr>
+        <w:t>Closed cross-system integration defects and aligned regional requirements with engineering teams in Mexico for multi-market launches.</w:t>
+      </w:r>
+    </w:p>
+    <w:p>
+      <w:pPr>
+        <w:spacing w:before="160" w:after="20"/>
+        <w:tabs>
+          <w:tab w:val="right" w:pos="10800"/>
+        </w:tabs>
+      </w:pPr>
+      <w:r>
+        <w:rPr>
+          <w:rFonts w:ascii="JetBrains Mono" w:hAnsi="JetBrains Mono" w:cs="JetBrains Mono" w:eastAsia="JetBrains Mono"/>
+          <w:b w:val="0"/>
+          <w:i w:val="0"/>
+          <w:color w:val="154C8C"/>
+          <w:sz w:val="16"/>
+          <w:spacing w:val="24"/>
+        </w:rPr>
+        <w:t xml:space="preserve">EXPERIENCE   </w:t>
+      </w:r>
+      <w:r>
+        <w:rPr>
+          <w:rFonts w:ascii="Inter Tight" w:hAnsi="Inter Tight" w:cs="Inter Tight" w:eastAsia="Inter Tight"/>
+          <w:b w:val="0"/>
+          <w:i w:val="0"/>
+          <w:color w:val="1A1A1A"/>
+          <w:sz w:val="26"/>
+        </w:rPr>
+        <w:t>Quality Engineer — Telematics</w:t>
+      </w:r>
+      <w:r>
+        <w:tab/>
+      </w:r>
+      <w:r>
+        <w:rPr>
+          <w:rFonts w:ascii="JetBrains Mono" w:hAnsi="JetBrains Mono" w:cs="JetBrains Mono" w:eastAsia="JetBrains Mono"/>
+          <w:b w:val="0"/>
+          <w:i w:val="0"/>
+          <w:color w:val="6A6A6A"/>
+          <w:sz w:val="17"/>
+          <w:spacing w:val="20"/>
+        </w:rPr>
+        <w:t>2013 — 2017</w:t>
+      </w:r>
+    </w:p>
+    <w:p>
+      <w:pPr>
+        <w:spacing w:after="80"/>
+      </w:pPr>
+      <w:r>
+        <w:rPr>
+          <w:rFonts w:ascii="JetBrains Mono" w:hAnsi="JetBrains Mono" w:cs="JetBrains Mono" w:eastAsia="JetBrains Mono"/>
+          <w:b w:val="0"/>
+          <w:i w:val="0"/>
+          <w:color w:val="3A3A3A"/>
+          <w:sz w:val="18"/>
+          <w:spacing w:val="12"/>
+        </w:rPr>
+        <w:t>Hyundai Autoever Telematics America</w:t>
+      </w:r>
+      <w:r>
+        <w:rPr>
+          <w:rFonts w:ascii="JetBrains Mono" w:hAnsi="JetBrains Mono" w:cs="JetBrains Mono" w:eastAsia="JetBrains Mono"/>
+          <w:b w:val="0"/>
+          <w:i w:val="0"/>
+          <w:color w:val="A8A5A0"/>
+          <w:sz w:val="18"/>
+        </w:rPr>
+        <w:t xml:space="preserve">   ·   </w:t>
+      </w:r>
+      <w:r>
+        <w:rPr>
+          <w:rFonts w:ascii="JetBrains Mono" w:hAnsi="JetBrains Mono" w:cs="JetBrains Mono" w:eastAsia="JetBrains Mono"/>
+          <w:b w:val="0"/>
+          <w:i w:val="0"/>
+          <w:color w:val="6A6A6A"/>
+          <w:sz w:val="18"/>
+        </w:rPr>
+        <w:t>Fountain Valley, CA</w:t>
+      </w:r>
+    </w:p>
+    <w:p>
+      <w:pPr>
+        <w:spacing w:before="40" w:after="40"/>
+        <w:ind w:left="288" w:hanging="288"/>
+      </w:pPr>
+      <w:r>
+        <w:rPr>
+          <w:rFonts w:ascii="Inter" w:hAnsi="Inter" w:cs="Inter" w:eastAsia="Inter"/>
+          <w:b w:val="0"/>
+          <w:i w:val="0"/>
+          <w:color w:val="154C8C"/>
+          <w:sz w:val="20"/>
+        </w:rPr>
+        <w:t xml:space="preserve">— </w:t>
+      </w:r>
+      <w:r>
+        <w:rPr>
+          <w:rFonts w:ascii="Inter" w:hAnsi="Inter" w:cs="Inter" w:eastAsia="Inter"/>
+          <w:b w:val="0"/>
+          <w:i w:val="0"/>
+          <w:color w:val="3A3A3A"/>
+          <w:sz w:val="20"/>
+        </w:rPr>
+        <w:t>Designed and implemented QA processes for Hyundai telematics systems — DCM, head unit, and backend connectivity — validating hardware–software integrations across embedded firmware, cloud APIs, and mobile clients.</w:t>
+      </w:r>
+    </w:p>
+    <w:p>
+      <w:pPr>
+        <w:spacing w:before="40" w:after="40"/>
+        <w:ind w:left="288" w:hanging="288"/>
+      </w:pPr>
+      <w:r>
+        <w:rPr>
+          <w:rFonts w:ascii="Inter" w:hAnsi="Inter" w:cs="Inter" w:eastAsia="Inter"/>
+          <w:b w:val="0"/>
+          <w:i w:val="0"/>
+          <w:color w:val="154C8C"/>
+          <w:sz w:val="20"/>
+        </w:rPr>
+        <w:t xml:space="preserve">— </w:t>
+      </w:r>
+      <w:r>
+        <w:rPr>
+          <w:rFonts w:ascii="Inter" w:hAnsi="Inter" w:cs="Inter" w:eastAsia="Inter"/>
+          <w:b w:val="0"/>
+          <w:i w:val="0"/>
+          <w:color w:val="3A3A3A"/>
+          <w:sz w:val="20"/>
+        </w:rPr>
+        <w:t>Built a generalist foundation in a startup-scale environment: UAT, deployment DevOps, requirements gathering, and release management.</w:t>
+      </w:r>
+    </w:p>
+    <w:p>
+      <w:pPr>
+        <w:spacing w:before="160" w:after="20"/>
+        <w:tabs>
+          <w:tab w:val="right" w:pos="10800"/>
+        </w:tabs>
+      </w:pPr>
+      <w:r>
+        <w:rPr>
+          <w:rFonts w:ascii="JetBrains Mono" w:hAnsi="JetBrains Mono" w:cs="JetBrains Mono" w:eastAsia="JetBrains Mono"/>
+          <w:b w:val="0"/>
+          <w:i w:val="0"/>
+          <w:color w:val="154C8C"/>
+          <w:sz w:val="16"/>
+          <w:spacing w:val="24"/>
+        </w:rPr>
+        <w:t xml:space="preserve">EDUCATION   </w:t>
+      </w:r>
+      <w:r>
+        <w:rPr>
+          <w:rFonts w:ascii="Inter Tight" w:hAnsi="Inter Tight" w:cs="Inter Tight" w:eastAsia="Inter Tight"/>
+          <w:b w:val="0"/>
+          <w:i w:val="0"/>
+          <w:color w:val="1A1A1A"/>
+          <w:sz w:val="26"/>
+        </w:rPr>
+        <w:t>Bachelor of Science, Computer Science</w:t>
+      </w:r>
+      <w:r>
+        <w:tab/>
+      </w:r>
+      <w:r>
+        <w:rPr>
+          <w:rFonts w:ascii="JetBrains Mono" w:hAnsi="JetBrains Mono" w:cs="JetBrains Mono" w:eastAsia="JetBrains Mono"/>
+          <w:b w:val="0"/>
+          <w:i w:val="0"/>
+          <w:color w:val="6A6A6A"/>
+          <w:sz w:val="17"/>
+          <w:spacing w:val="20"/>
+        </w:rPr>
+        <w:t>2008 — 2012</w:t>
+      </w:r>
+    </w:p>
+    <w:p>
+      <w:pPr>
+        <w:spacing w:after="80"/>
+      </w:pPr>
+      <w:r>
+        <w:rPr>
+          <w:rFonts w:ascii="JetBrains Mono" w:hAnsi="JetBrains Mono" w:cs="JetBrains Mono" w:eastAsia="JetBrains Mono"/>
+          <w:b w:val="0"/>
+          <w:i w:val="0"/>
+          <w:color w:val="3A3A3A"/>
+          <w:sz w:val="18"/>
+          <w:spacing w:val="12"/>
+        </w:rPr>
+        <w:t>California State University, Long Beach</w:t>
+      </w:r>
+      <w:r>
+        <w:rPr>
+          <w:rFonts w:ascii="JetBrains Mono" w:hAnsi="JetBrains Mono" w:cs="JetBrains Mono" w:eastAsia="JetBrains Mono"/>
+          <w:b w:val="0"/>
+          <w:i w:val="0"/>
+          <w:color w:val="A8A5A0"/>
+          <w:sz w:val="18"/>
+        </w:rPr>
+        <w:t xml:space="preserve">   ·   </w:t>
+      </w:r>
+      <w:r>
+        <w:rPr>
+          <w:rFonts w:ascii="JetBrains Mono" w:hAnsi="JetBrains Mono" w:cs="JetBrains Mono" w:eastAsia="JetBrains Mono"/>
+          <w:b w:val="0"/>
+          <w:i w:val="0"/>
+          <w:color w:val="6A6A6A"/>
+          <w:sz w:val="18"/>
+        </w:rPr>
+        <w:t>Long Beach, CA</w:t>
+      </w:r>
+    </w:p>
+    <w:p>
+      <w:pPr>
+        <w:spacing w:before="40" w:after="40"/>
+        <w:ind w:left="288" w:hanging="288"/>
+      </w:pPr>
+      <w:r>
+        <w:rPr>
+          <w:rFonts w:ascii="Inter" w:hAnsi="Inter" w:cs="Inter" w:eastAsia="Inter"/>
+          <w:b w:val="0"/>
+          <w:i w:val="0"/>
+          <w:color w:val="154C8C"/>
+          <w:sz w:val="20"/>
+        </w:rPr>
+        <w:t xml:space="preserve">— </w:t>
+      </w:r>
+      <w:r>
+        <w:rPr>
+          <w:rFonts w:ascii="Inter" w:hAnsi="Inter" w:cs="Inter" w:eastAsia="Inter"/>
+          <w:b w:val="0"/>
+          <w:i w:val="0"/>
+          <w:color w:val="3A3A3A"/>
+          <w:sz w:val="20"/>
+        </w:rPr>
+        <w:t>Four-year degree in Computer Science — foundation in systems, algorithms, and software architecture.</w:t>
       </w:r>
     </w:p>
     <w:p>

</xml_diff>

<commit_message>
Reposition resume for FDE roles from updated LinkedIn profile
- Title line: AI Solutions Architect / Applied AI & Agentic Systems
- Summary rewritten around shipped AI systems at GEMMACON (agentic
  pipelines, document generation, containerized FastAPI services)
  grounded in 15 years of connected-vehicle validation
- GEMMACON bullets replaced with LinkedIn content: OTA Test Manager
  to Head of BD promotion, agentic intelligence system, NVIDIA
  billing system, JIRA-to-deck pipeline, candidate profiler
- Core Competencies and Technical Skills rebuilt AI-first while
  keeping automotive domain credibility
- Hyundai, Mercedes, Toyota condensed to one resume bullet each
- Contact CTA bumped to Updated Aug 2026

Co-Authored-By: Claude Fable 5 <noreply@anthropic.com>
Claude-Session: https://claude.ai/code/session_019qgKRsNgNysMTg9WQprRMm
</commit_message>
<xml_diff>
--- a/uploads/Efrain_Plascencia_Resume.docx
+++ b/uploads/Efrain_Plascencia_Resume.docx
@@ -73,7 +73,7 @@
           <w:sz w:val="17"/>
           <w:spacing w:val="26"/>
         </w:rPr>
-        <w:t>TECHNICAL LEAD   ·   CONNECTED VEHICLE &amp; TELEMATICS   ·   AUTOMOTIVE SOFTWARE</w:t>
+        <w:t>AI SOLUTIONS ARCHITECT   ·   APPLIED AI &amp; AGENTIC SYSTEMS   ·   AUTOMOTIVE SOFTWARE</w:t>
       </w:r>
     </w:p>
     <w:p>
@@ -138,7 +138,7 @@
           <w:color w:val="3A3A3A"/>
           <w:sz w:val="20"/>
         </w:rPr>
-        <w:t>Automotive software engineer with 10+ years leading quality, integration, and delivery of connected-vehicle and telematics systems across OEM programs at Toyota, Mercedes-Benz, Hyundai, and PACCAR. Deep hands-on experience with DCM and infotainment head units, in-vehicle ECU communication, and backend/cloud integration for user-facing features including account registration, profile activation, and remote services. Skilled technical liaison across app, head-unit, and server teams — coordinating test strategies, triaging bugs, running cross-functional meetings, and driving root-cause analysis across hardware and software stacks.</w:t>
+        <w:t>AI solutions architect turning messy operational problems into shipped AI systems people use every day — not demos. At GEMMACON North America, an automotive software consultancy serving international OEMs, designs and deploys the AI-driven systems client engagements run on: agentic intelligence pipelines, automated document generation, and containerized FastAPI services. Specializes in getting requirements right from stakeholders who haven't articulated them yet, then designing so the humans using the system can't easily get it wrong. Grounded in 15 years of connected-vehicle software and validation — telematics architecture, ECU diagnostics, HIL and vehicle testing — at Toyota, Mercedes-Benz R&amp;D North America, Hyundai Autoever, and PACCAR — the background that earns OEM stakeholders' trust in the first meeting.</w:t>
       </w:r>
     </w:p>
     <w:p>
@@ -210,7 +210,7 @@
                 <w:color w:val="3A3A3A"/>
                 <w:sz w:val="19"/>
               </w:rPr>
-              <w:t>DCM / Infotainment Systems</w:t>
+              <w:t>Agentic AI Systems &amp; Workflows</w:t>
             </w:r>
           </w:p>
         </w:tc>
@@ -242,7 +242,7 @@
                 <w:color w:val="3A3A3A"/>
                 <w:sz w:val="19"/>
               </w:rPr>
-              <w:t>Telematics Architecture (HW + SW)</w:t>
+              <w:t>LLM Integration &amp; RAG</w:t>
             </w:r>
           </w:p>
         </w:tc>
@@ -276,7 +276,7 @@
                 <w:color w:val="3A3A3A"/>
                 <w:sz w:val="19"/>
               </w:rPr>
-              <w:t>Connected Vehicle Applications</w:t>
+              <w:t>Forward-Deployed Engineering</w:t>
             </w:r>
           </w:p>
         </w:tc>
@@ -308,7 +308,7 @@
                 <w:color w:val="3A3A3A"/>
                 <w:sz w:val="19"/>
               </w:rPr>
-              <w:t>User Profile &amp; Account Systems</w:t>
+              <w:t>Requirements Discovery &amp; Scoping</w:t>
             </w:r>
           </w:p>
         </w:tc>
@@ -342,7 +342,7 @@
                 <w:color w:val="3A3A3A"/>
                 <w:sz w:val="19"/>
               </w:rPr>
-              <w:t>In-Vehicle ECU Integration</w:t>
+              <w:t>Rapid Prototyping to Production</w:t>
             </w:r>
           </w:p>
         </w:tc>
@@ -374,7 +374,7 @@
                 <w:color w:val="3A3A3A"/>
                 <w:sz w:val="19"/>
               </w:rPr>
-              <w:t>Backend / Cloud Integration</w:t>
+              <w:t>Python / FastAPI Service Design</w:t>
             </w:r>
           </w:p>
         </w:tc>
@@ -408,7 +408,7 @@
                 <w:color w:val="3A3A3A"/>
                 <w:sz w:val="19"/>
               </w:rPr>
-              <w:t>Technical Specification Authoring</w:t>
+              <w:t>Document &amp; Reporting Automation</w:t>
             </w:r>
           </w:p>
         </w:tc>
@@ -440,7 +440,7 @@
                 <w:color w:val="3A3A3A"/>
                 <w:sz w:val="19"/>
               </w:rPr>
-              <w:t>Bug Triage &amp; Root-Cause Analysis</w:t>
+              <w:t>Technical Pre-Sales &amp; Proposals</w:t>
             </w:r>
           </w:p>
         </w:tc>
@@ -474,7 +474,7 @@
                 <w:color w:val="3A3A3A"/>
                 <w:sz w:val="19"/>
               </w:rPr>
-              <w:t>Test Case Design &amp; Validation</w:t>
+              <w:t>Executive &amp; Stakeholder Communication</w:t>
             </w:r>
           </w:p>
         </w:tc>
@@ -497,6 +497,138 @@
                 <w:spacing w:val="16"/>
               </w:rPr>
               <w:t xml:space="preserve">10   </w:t>
+            </w:r>
+            <w:r>
+              <w:rPr>
+                <w:rFonts w:ascii="Inter" w:hAnsi="Inter" w:cs="Inter" w:eastAsia="Inter"/>
+                <w:b w:val="0"/>
+                <w:i w:val="0"/>
+                <w:color w:val="3A3A3A"/>
+                <w:sz w:val="19"/>
+              </w:rPr>
+              <w:t>Connected Vehicle &amp; Telematics</w:t>
+            </w:r>
+          </w:p>
+        </w:tc>
+      </w:tr>
+      <w:tr>
+        <w:tc>
+          <w:tcPr>
+            <w:tcW w:type="dxa" w:w="5400"/>
+          </w:tcPr>
+          <w:p>
+            <w:pPr>
+              <w:spacing w:after="40"/>
+            </w:pPr>
+            <w:r/>
+            <w:r>
+              <w:rPr>
+                <w:rFonts w:ascii="JetBrains Mono" w:hAnsi="JetBrains Mono" w:cs="JetBrains Mono" w:eastAsia="JetBrains Mono"/>
+                <w:b w:val="0"/>
+                <w:i w:val="0"/>
+                <w:color w:val="A8A5A0"/>
+                <w:sz w:val="16"/>
+                <w:spacing w:val="16"/>
+              </w:rPr>
+              <w:t xml:space="preserve">11   </w:t>
+            </w:r>
+            <w:r>
+              <w:rPr>
+                <w:rFonts w:ascii="Inter" w:hAnsi="Inter" w:cs="Inter" w:eastAsia="Inter"/>
+                <w:b w:val="0"/>
+                <w:i w:val="0"/>
+                <w:color w:val="3A3A3A"/>
+                <w:sz w:val="19"/>
+              </w:rPr>
+              <w:t>DCM / Infotainment / OTA Systems</w:t>
+            </w:r>
+          </w:p>
+        </w:tc>
+        <w:tc>
+          <w:tcPr>
+            <w:tcW w:type="dxa" w:w="5400"/>
+          </w:tcPr>
+          <w:p>
+            <w:pPr>
+              <w:spacing w:after="40"/>
+            </w:pPr>
+            <w:r/>
+            <w:r>
+              <w:rPr>
+                <w:rFonts w:ascii="JetBrains Mono" w:hAnsi="JetBrains Mono" w:cs="JetBrains Mono" w:eastAsia="JetBrains Mono"/>
+                <w:b w:val="0"/>
+                <w:i w:val="0"/>
+                <w:color w:val="A8A5A0"/>
+                <w:sz w:val="16"/>
+                <w:spacing w:val="16"/>
+              </w:rPr>
+              <w:t xml:space="preserve">12   </w:t>
+            </w:r>
+            <w:r>
+              <w:rPr>
+                <w:rFonts w:ascii="Inter" w:hAnsi="Inter" w:cs="Inter" w:eastAsia="Inter"/>
+                <w:b w:val="0"/>
+                <w:i w:val="0"/>
+                <w:color w:val="3A3A3A"/>
+                <w:sz w:val="19"/>
+              </w:rPr>
+              <w:t>Embedded &amp; Cloud Integration</w:t>
+            </w:r>
+          </w:p>
+        </w:tc>
+      </w:tr>
+      <w:tr>
+        <w:tc>
+          <w:tcPr>
+            <w:tcW w:type="dxa" w:w="5400"/>
+          </w:tcPr>
+          <w:p>
+            <w:pPr>
+              <w:spacing w:after="40"/>
+            </w:pPr>
+            <w:r/>
+            <w:r>
+              <w:rPr>
+                <w:rFonts w:ascii="JetBrains Mono" w:hAnsi="JetBrains Mono" w:cs="JetBrains Mono" w:eastAsia="JetBrains Mono"/>
+                <w:b w:val="0"/>
+                <w:i w:val="0"/>
+                <w:color w:val="A8A5A0"/>
+                <w:sz w:val="16"/>
+                <w:spacing w:val="16"/>
+              </w:rPr>
+              <w:t xml:space="preserve">13   </w:t>
+            </w:r>
+            <w:r>
+              <w:rPr>
+                <w:rFonts w:ascii="Inter" w:hAnsi="Inter" w:cs="Inter" w:eastAsia="Inter"/>
+                <w:b w:val="0"/>
+                <w:i w:val="0"/>
+                <w:color w:val="3A3A3A"/>
+                <w:sz w:val="19"/>
+              </w:rPr>
+              <w:t>Bug Triage &amp; Root-Cause Analysis</w:t>
+            </w:r>
+          </w:p>
+        </w:tc>
+        <w:tc>
+          <w:tcPr>
+            <w:tcW w:type="dxa" w:w="5400"/>
+          </w:tcPr>
+          <w:p>
+            <w:pPr>
+              <w:spacing w:after="40"/>
+            </w:pPr>
+            <w:r/>
+            <w:r>
+              <w:rPr>
+                <w:rFonts w:ascii="JetBrains Mono" w:hAnsi="JetBrains Mono" w:cs="JetBrains Mono" w:eastAsia="JetBrains Mono"/>
+                <w:b w:val="0"/>
+                <w:i w:val="0"/>
+                <w:color w:val="A8A5A0"/>
+                <w:sz w:val="16"/>
+                <w:spacing w:val="16"/>
+              </w:rPr>
+              <w:t xml:space="preserve">14   </w:t>
             </w:r>
             <w:r>
               <w:rPr>
@@ -530,7 +662,7 @@
                 <w:sz w:val="16"/>
                 <w:spacing w:val="16"/>
               </w:rPr>
-              <w:t xml:space="preserve">11   </w:t>
+              <w:t xml:space="preserve">15   </w:t>
             </w:r>
             <w:r>
               <w:rPr>
@@ -541,138 +673,6 @@
                 <w:sz w:val="19"/>
               </w:rPr>
               <w:t>Global Team Coordination</w:t>
-            </w:r>
-          </w:p>
-        </w:tc>
-        <w:tc>
-          <w:tcPr>
-            <w:tcW w:type="dxa" w:w="5400"/>
-          </w:tcPr>
-          <w:p>
-            <w:pPr>
-              <w:spacing w:after="40"/>
-            </w:pPr>
-            <w:r/>
-            <w:r>
-              <w:rPr>
-                <w:rFonts w:ascii="JetBrains Mono" w:hAnsi="JetBrains Mono" w:cs="JetBrains Mono" w:eastAsia="JetBrains Mono"/>
-                <w:b w:val="0"/>
-                <w:i w:val="0"/>
-                <w:color w:val="A8A5A0"/>
-                <w:sz w:val="16"/>
-                <w:spacing w:val="16"/>
-              </w:rPr>
-              <w:t xml:space="preserve">12   </w:t>
-            </w:r>
-            <w:r>
-              <w:rPr>
-                <w:rFonts w:ascii="Inter" w:hAnsi="Inter" w:cs="Inter" w:eastAsia="Inter"/>
-                <w:b w:val="0"/>
-                <w:i w:val="0"/>
-                <w:color w:val="3A3A3A"/>
-                <w:sz w:val="19"/>
-              </w:rPr>
-              <w:t>Embedded System Architecture</w:t>
-            </w:r>
-          </w:p>
-        </w:tc>
-      </w:tr>
-      <w:tr>
-        <w:tc>
-          <w:tcPr>
-            <w:tcW w:type="dxa" w:w="5400"/>
-          </w:tcPr>
-          <w:p>
-            <w:pPr>
-              <w:spacing w:after="40"/>
-            </w:pPr>
-            <w:r/>
-            <w:r>
-              <w:rPr>
-                <w:rFonts w:ascii="JetBrains Mono" w:hAnsi="JetBrains Mono" w:cs="JetBrains Mono" w:eastAsia="JetBrains Mono"/>
-                <w:b w:val="0"/>
-                <w:i w:val="0"/>
-                <w:color w:val="A8A5A0"/>
-                <w:sz w:val="16"/>
-                <w:spacing w:val="16"/>
-              </w:rPr>
-              <w:t xml:space="preserve">13   </w:t>
-            </w:r>
-            <w:r>
-              <w:rPr>
-                <w:rFonts w:ascii="Inter" w:hAnsi="Inter" w:cs="Inter" w:eastAsia="Inter"/>
-                <w:b w:val="0"/>
-                <w:i w:val="0"/>
-                <w:color w:val="3A3A3A"/>
-                <w:sz w:val="19"/>
-              </w:rPr>
-              <w:t>OTA Updates &amp; SDV Delivery</w:t>
-            </w:r>
-          </w:p>
-        </w:tc>
-        <w:tc>
-          <w:tcPr>
-            <w:tcW w:type="dxa" w:w="5400"/>
-          </w:tcPr>
-          <w:p>
-            <w:pPr>
-              <w:spacing w:after="40"/>
-            </w:pPr>
-            <w:r/>
-            <w:r>
-              <w:rPr>
-                <w:rFonts w:ascii="JetBrains Mono" w:hAnsi="JetBrains Mono" w:cs="JetBrains Mono" w:eastAsia="JetBrains Mono"/>
-                <w:b w:val="0"/>
-                <w:i w:val="0"/>
-                <w:color w:val="A8A5A0"/>
-                <w:sz w:val="16"/>
-                <w:spacing w:val="16"/>
-              </w:rPr>
-              <w:t xml:space="preserve">14   </w:t>
-            </w:r>
-            <w:r>
-              <w:rPr>
-                <w:rFonts w:ascii="Inter" w:hAnsi="Inter" w:cs="Inter" w:eastAsia="Inter"/>
-                <w:b w:val="0"/>
-                <w:i w:val="0"/>
-                <w:color w:val="3A3A3A"/>
-                <w:sz w:val="19"/>
-              </w:rPr>
-              <w:t>Defect Tracking (JIRA)</w:t>
-            </w:r>
-          </w:p>
-        </w:tc>
-      </w:tr>
-      <w:tr>
-        <w:tc>
-          <w:tcPr>
-            <w:tcW w:type="dxa" w:w="5400"/>
-          </w:tcPr>
-          <w:p>
-            <w:pPr>
-              <w:spacing w:after="40"/>
-            </w:pPr>
-            <w:r/>
-            <w:r>
-              <w:rPr>
-                <w:rFonts w:ascii="JetBrains Mono" w:hAnsi="JetBrains Mono" w:cs="JetBrains Mono" w:eastAsia="JetBrains Mono"/>
-                <w:b w:val="0"/>
-                <w:i w:val="0"/>
-                <w:color w:val="A8A5A0"/>
-                <w:sz w:val="16"/>
-                <w:spacing w:val="16"/>
-              </w:rPr>
-              <w:t xml:space="preserve">15   </w:t>
-            </w:r>
-            <w:r>
-              <w:rPr>
-                <w:rFonts w:ascii="Inter" w:hAnsi="Inter" w:cs="Inter" w:eastAsia="Inter"/>
-                <w:b w:val="0"/>
-                <w:i w:val="0"/>
-                <w:color w:val="3A3A3A"/>
-                <w:sz w:val="19"/>
-              </w:rPr>
-              <w:t>Agile / SDLC / Release Management</w:t>
             </w:r>
           </w:p>
         </w:tc>
@@ -816,7 +816,7 @@
           <w:color w:val="3A3A3A"/>
           <w:sz w:val="20"/>
         </w:rPr>
-        <w:t>Built and lead a cross-functional technical team from the ground up — validating software for advanced automotive computing platforms including infotainment head units, domain controllers, and SDV architectures.</w:t>
+        <w:t>Joined as OTA Test Manager; promoted within a year to lead the North America practice — commercial strategy, ICP definition, consulting proposals, and technical recruiting across engagements for Mercedes-Benz, Porsche, and NVIDIA.</w:t>
       </w:r>
     </w:p>
     <w:p>
@@ -842,7 +842,7 @@
           <w:color w:val="3A3A3A"/>
           <w:sz w:val="20"/>
         </w:rPr>
-        <w:t>Primary technical liaison across OEM programs — aligning client architects, embedded developers, backend/cloud teams, and QA on specifications, interfaces, and release criteria.</w:t>
+        <w:t>Designed and deployed an agentic intelligence system: structured search sweeps over a target-company database, a four-signal taxonomy with a 20-point scoring rubric and threshold gating, and automated briefing generation into Notion.</w:t>
       </w:r>
     </w:p>
     <w:p>
@@ -868,7 +868,7 @@
           <w:color w:val="3A3A3A"/>
           <w:sz w:val="20"/>
         </w:rPr>
-        <w:t>Author test strategies and triage processes that resolve complex defects spanning app, head-unit, and server layers — reducing turnaround on cross-domain issues.</w:t>
+        <w:t>Built the time-tracking and billing system for the NVIDIA engagement — encoding non-obvious business rules (per-engineer daily minimums, billed-vs-actual payroll reconciliation) with a containerized FastAPI reporting service, designed for error resistance by non-technical users.</w:t>
       </w:r>
     </w:p>
     <w:p>
@@ -894,7 +894,7 @@
           <w:color w:val="3A3A3A"/>
           <w:sz w:val="20"/>
         </w:rPr>
-        <w:t>Grew engineering headcount by 300% while partnering with global teams across North America, Europe, and Asia.</w:t>
+        <w:t>Shipped a Python document pipeline that converts client JIRA exports into branded executive decks, and a candidate-profiling tool that scores resumes against job descriptions and renders client-ready deliverables.</w:t>
       </w:r>
     </w:p>
     <w:p>
@@ -1182,59 +1182,7 @@
           <w:color w:val="3A3A3A"/>
           <w:sz w:val="20"/>
         </w:rPr>
-        <w:t>Owned end-to-end validation of user profile, registration, and account-activation flows across mobile app, vehicle head unit, and cloud backend for Toyota connected-vehicle applications.</w:t>
-      </w:r>
-    </w:p>
-    <w:p>
-      <w:pPr>
-        <w:spacing w:before="40" w:after="40"/>
-        <w:ind w:left="288" w:hanging="288"/>
-      </w:pPr>
-      <w:r>
-        <w:rPr>
-          <w:rFonts w:ascii="Inter" w:hAnsi="Inter" w:cs="Inter" w:eastAsia="Inter"/>
-          <w:b w:val="0"/>
-          <w:i w:val="0"/>
-          <w:color w:val="154C8C"/>
-          <w:sz w:val="20"/>
-        </w:rPr>
-        <w:t xml:space="preserve">— </w:t>
-      </w:r>
-      <w:r>
-        <w:rPr>
-          <w:rFonts w:ascii="Inter" w:hAnsi="Inter" w:cs="Inter" w:eastAsia="Inter"/>
-          <w:b w:val="0"/>
-          <w:i w:val="0"/>
-          <w:color w:val="3A3A3A"/>
-          <w:sz w:val="20"/>
-        </w:rPr>
-        <w:t>Validated service activations across cloud backends and the in-vehicle DCM — closing specification gaps before release.</w:t>
-      </w:r>
-    </w:p>
-    <w:p>
-      <w:pPr>
-        <w:spacing w:before="40" w:after="40"/>
-        <w:ind w:left="288" w:hanging="288"/>
-      </w:pPr>
-      <w:r>
-        <w:rPr>
-          <w:rFonts w:ascii="Inter" w:hAnsi="Inter" w:cs="Inter" w:eastAsia="Inter"/>
-          <w:b w:val="0"/>
-          <w:i w:val="0"/>
-          <w:color w:val="154C8C"/>
-          <w:sz w:val="20"/>
-        </w:rPr>
-        <w:t xml:space="preserve">— </w:t>
-      </w:r>
-      <w:r>
-        <w:rPr>
-          <w:rFonts w:ascii="Inter" w:hAnsi="Inter" w:cs="Inter" w:eastAsia="Inter"/>
-          <w:b w:val="0"/>
-          <w:i w:val="0"/>
-          <w:color w:val="3A3A3A"/>
-          <w:sz w:val="20"/>
-        </w:rPr>
-        <w:t>Authored and translated test cases between Japan HQ and North America; led global defect triage and served as technical escalation point, reading app and service-layer code to assign ownership.</w:t>
+        <w:t>Owned end-to-end validation of user profile, registration, and account-activation flows across mobile app, vehicle head unit, and cloud backend for Toyota connected-vehicle applications — serving as technical escalation point and leading global defect triage with Japan HQ.</w:t>
       </w:r>
     </w:p>
     <w:p>
@@ -1339,33 +1287,7 @@
           <w:color w:val="3A3A3A"/>
           <w:sz w:val="20"/>
         </w:rPr>
-        <w:t>Led end-to-end testing of integrated vehicle systems — head unit, smartphones, digital assistants (Siri, Alexa), wearables, and IoT devices — on premium infotainment and telematics platforms.</w:t>
-      </w:r>
-    </w:p>
-    <w:p>
-      <w:pPr>
-        <w:spacing w:before="40" w:after="40"/>
-        <w:ind w:left="288" w:hanging="288"/>
-      </w:pPr>
-      <w:r>
-        <w:rPr>
-          <w:rFonts w:ascii="Inter" w:hAnsi="Inter" w:cs="Inter" w:eastAsia="Inter"/>
-          <w:b w:val="0"/>
-          <w:i w:val="0"/>
-          <w:color w:val="154C8C"/>
-          <w:sz w:val="20"/>
-        </w:rPr>
-        <w:t xml:space="preserve">— </w:t>
-      </w:r>
-      <w:r>
-        <w:rPr>
-          <w:rFonts w:ascii="Inter" w:hAnsi="Inter" w:cs="Inter" w:eastAsia="Inter"/>
-          <w:b w:val="0"/>
-          <w:i w:val="0"/>
-          <w:color w:val="3A3A3A"/>
-          <w:sz w:val="20"/>
-        </w:rPr>
-        <w:t>Closed cross-system integration defects and aligned regional requirements with engineering teams in Mexico for multi-market launches.</w:t>
+        <w:t>Led end-to-end testing of integrated vehicle systems — head unit, smartphones, digital assistants (Siri, Alexa), wearables, and IoT devices — on premium infotainment and telematics platforms, closing cross-system integration defects for multi-market launches.</w:t>
       </w:r>
     </w:p>
     <w:p>
@@ -1470,33 +1392,7 @@
           <w:color w:val="3A3A3A"/>
           <w:sz w:val="20"/>
         </w:rPr>
-        <w:t>Designed and implemented QA processes for Hyundai telematics systems — DCM, head unit, and backend connectivity — validating hardware–software integrations across embedded firmware, cloud APIs, and mobile clients.</w:t>
-      </w:r>
-    </w:p>
-    <w:p>
-      <w:pPr>
-        <w:spacing w:before="40" w:after="40"/>
-        <w:ind w:left="288" w:hanging="288"/>
-      </w:pPr>
-      <w:r>
-        <w:rPr>
-          <w:rFonts w:ascii="Inter" w:hAnsi="Inter" w:cs="Inter" w:eastAsia="Inter"/>
-          <w:b w:val="0"/>
-          <w:i w:val="0"/>
-          <w:color w:val="154C8C"/>
-          <w:sz w:val="20"/>
-        </w:rPr>
-        <w:t xml:space="preserve">— </w:t>
-      </w:r>
-      <w:r>
-        <w:rPr>
-          <w:rFonts w:ascii="Inter" w:hAnsi="Inter" w:cs="Inter" w:eastAsia="Inter"/>
-          <w:b w:val="0"/>
-          <w:i w:val="0"/>
-          <w:color w:val="3A3A3A"/>
-          <w:sz w:val="20"/>
-        </w:rPr>
-        <w:t>Built a generalist foundation in a startup-scale environment: UAT, deployment DevOps, requirements gathering, and release management.</w:t>
+        <w:t>Designed QA processes for Hyundai telematics — DCM, head unit, and backend connectivity — validating hardware–software integrations across embedded firmware, cloud APIs, and mobile clients in a startup-scale environment.</w:t>
       </w:r>
     </w:p>
     <w:p>
@@ -1647,6 +1543,70 @@
           <w:sz w:val="17"/>
           <w:spacing w:val="24"/>
         </w:rPr>
+        <w:t xml:space="preserve">AI &amp; AGENTIC SYSTEMS   </w:t>
+      </w:r>
+    </w:p>
+    <w:p>
+      <w:pPr>
+        <w:spacing w:after="80" w:line="312" w:lineRule="auto"/>
+        <w:ind w:left="0"/>
+      </w:pPr>
+      <w:r>
+        <w:rPr>
+          <w:rFonts w:ascii="Inter" w:hAnsi="Inter" w:cs="Inter" w:eastAsia="Inter"/>
+          <w:b w:val="0"/>
+          <w:i w:val="0"/>
+          <w:color w:val="3A3A3A"/>
+          <w:sz w:val="20"/>
+        </w:rPr>
+        <w:t>Agentic pipelines and workflows, LLM integration (OpenAI, Perplexity), RAG, prompt engineering, scoring rubrics and threshold gating, AI agents for engineering and business workflows</w:t>
+      </w:r>
+    </w:p>
+    <w:p>
+      <w:pPr>
+        <w:spacing w:before="80" w:after="40"/>
+      </w:pPr>
+      <w:r>
+        <w:rPr>
+          <w:rFonts w:ascii="JetBrains Mono" w:hAnsi="JetBrains Mono" w:cs="JetBrains Mono" w:eastAsia="JetBrains Mono"/>
+          <w:b w:val="0"/>
+          <w:i w:val="0"/>
+          <w:color w:val="1A1A1A"/>
+          <w:sz w:val="17"/>
+          <w:spacing w:val="24"/>
+        </w:rPr>
+        <w:t xml:space="preserve">BUILDING &amp; SHIPPING   </w:t>
+      </w:r>
+    </w:p>
+    <w:p>
+      <w:pPr>
+        <w:spacing w:after="80" w:line="312" w:lineRule="auto"/>
+        <w:ind w:left="0"/>
+      </w:pPr>
+      <w:r>
+        <w:rPr>
+          <w:rFonts w:ascii="Inter" w:hAnsi="Inter" w:cs="Inter" w:eastAsia="Inter"/>
+          <w:b w:val="0"/>
+          <w:i w:val="0"/>
+          <w:color w:val="3A3A3A"/>
+          <w:sz w:val="20"/>
+        </w:rPr>
+        <w:t>Python, FastAPI, Docker, REST APIs, document automation (python-pptx), Stripe, OAuth, Vercel, Neon Postgres, Git/GitHub, Linear, Claude Code</w:t>
+      </w:r>
+    </w:p>
+    <w:p>
+      <w:pPr>
+        <w:spacing w:before="80" w:after="40"/>
+      </w:pPr>
+      <w:r>
+        <w:rPr>
+          <w:rFonts w:ascii="JetBrains Mono" w:hAnsi="JetBrains Mono" w:cs="JetBrains Mono" w:eastAsia="JetBrains Mono"/>
+          <w:b w:val="0"/>
+          <w:i w:val="0"/>
+          <w:color w:val="1A1A1A"/>
+          <w:sz w:val="17"/>
+          <w:spacing w:val="24"/>
+        </w:rPr>
         <w:t xml:space="preserve">AUTOMOTIVE DOMAINS   </w:t>
       </w:r>
     </w:p>
@@ -1695,7 +1655,7 @@
           <w:color w:val="3A3A3A"/>
           <w:sz w:val="20"/>
         </w:rPr>
-        <w:t>Embedded system architecture, hardware/software stack debugging, CAN-based diagnostics exposure, backend/cloud API integration, user profile and account service flows</w:t>
+        <w:t>Embedded system architecture, hardware/software stack debugging, CAN-based diagnostics exposure, HIL and vehicle testing, backend/cloud API integration, user profile and account service flows</w:t>
       </w:r>
     </w:p>
     <w:p>
@@ -1727,71 +1687,7 @@
           <w:color w:val="3A3A3A"/>
           <w:sz w:val="20"/>
         </w:rPr>
-        <w:t>Technical specification authoring, test case design/translation/validation, defect triage, JIRA, Confluence, Git, Agile/Scrum, release management</w:t>
-      </w:r>
-    </w:p>
-    <w:p>
-      <w:pPr>
-        <w:spacing w:before="80" w:after="40"/>
-      </w:pPr>
-      <w:r>
-        <w:rPr>
-          <w:rFonts w:ascii="JetBrains Mono" w:hAnsi="JetBrains Mono" w:cs="JetBrains Mono" w:eastAsia="JetBrains Mono"/>
-          <w:b w:val="0"/>
-          <w:i w:val="0"/>
-          <w:color w:val="1A1A1A"/>
-          <w:sz w:val="17"/>
-          <w:spacing w:val="24"/>
-        </w:rPr>
-        <w:t xml:space="preserve">CODE LITERACY   </w:t>
-      </w:r>
-    </w:p>
-    <w:p>
-      <w:pPr>
-        <w:spacing w:after="80" w:line="312" w:lineRule="auto"/>
-        <w:ind w:left="0"/>
-      </w:pPr>
-      <w:r>
-        <w:rPr>
-          <w:rFonts w:ascii="Inter" w:hAnsi="Inter" w:cs="Inter" w:eastAsia="Inter"/>
-          <w:b w:val="0"/>
-          <w:i w:val="0"/>
-          <w:color w:val="3A3A3A"/>
-          <w:sz w:val="20"/>
-        </w:rPr>
-        <w:t>Comfortable reading and interpreting application and service-layer code to reproduce defects, assign ownership, and accelerate triage across app, head-unit, and server teams</w:t>
-      </w:r>
-    </w:p>
-    <w:p>
-      <w:pPr>
-        <w:spacing w:before="80" w:after="40"/>
-      </w:pPr>
-      <w:r>
-        <w:rPr>
-          <w:rFonts w:ascii="JetBrains Mono" w:hAnsi="JetBrains Mono" w:cs="JetBrains Mono" w:eastAsia="JetBrains Mono"/>
-          <w:b w:val="0"/>
-          <w:i w:val="0"/>
-          <w:color w:val="1A1A1A"/>
-          <w:sz w:val="17"/>
-          <w:spacing w:val="24"/>
-        </w:rPr>
-        <w:t xml:space="preserve">EMERGING TECH   </w:t>
-      </w:r>
-    </w:p>
-    <w:p>
-      <w:pPr>
-        <w:spacing w:after="80" w:line="312" w:lineRule="auto"/>
-        <w:ind w:left="0"/>
-      </w:pPr>
-      <w:r>
-        <w:rPr>
-          <w:rFonts w:ascii="Inter" w:hAnsi="Inter" w:cs="Inter" w:eastAsia="Inter"/>
-          <w:b w:val="0"/>
-          <w:i w:val="0"/>
-          <w:color w:val="3A3A3A"/>
-          <w:sz w:val="20"/>
-        </w:rPr>
-        <w:t>Generative AI and LLM integration (OpenAI, Perplexity), RAG, prompt engineering, AI agents and automation for engineering workflows</w:t>
+        <w:t>Technical specification authoring, requirements discovery, test case design and validation, defect triage, JIRA, Confluence, Notion, Git, Agile/Scrum, release management</w:t>
       </w:r>
     </w:p>
     <w:p>

</xml_diff>

<commit_message>
Update GEMMACON entry to Director of AI Deployment & Solutions
LinkedIn now shows a three-role progression at GEMMACON (OTA Test
Manager 2023-24, Head of BD & Engineering 2024-25, Director of AI
Deployment & Solutions 2025-present). The single timeline entry keeps
one map stop: retitled to the Director role, progression folded into
the first bullet, and the team-building/300% headcount bullet restored
from the Head-of-BD era. Regenerated DOCX and PDF; previous version
archived with the 26_08_05b suffix.

Co-Authored-By: Claude Fable 5 <noreply@anthropic.com>
Claude-Session: https://claude.ai/code/session_019qgKRsNgNysMTg9WQprRMm
</commit_message>
<xml_diff>
--- a/uploads/Efrain_Plascencia_Resume.docx
+++ b/uploads/Efrain_Plascencia_Resume.docx
@@ -740,7 +740,7 @@
           <w:color w:val="1A1A1A"/>
           <w:sz w:val="26"/>
         </w:rPr>
-        <w:t>Head of Business Development &amp; Engineering</w:t>
+        <w:t>Director of AI Deployment &amp; Solutions</w:t>
       </w:r>
       <w:r>
         <w:tab/>
@@ -816,7 +816,7 @@
           <w:color w:val="3A3A3A"/>
           <w:sz w:val="20"/>
         </w:rPr>
-        <w:t>Joined as OTA Test Manager; promoted within a year to lead the North America practice — commercial strategy, ICP definition, consulting proposals, and technical recruiting across engagements for Mercedes-Benz, Porsche, and NVIDIA.</w:t>
+        <w:t>Joined as OTA Test Manager; promoted to Head of Business Development &amp; Engineering within a year, then to Director of AI Deployment &amp; Solutions in 2025 — leading the North America practice's AI systems, commercial strategy, and technical recruiting across engagements for Mercedes-Benz, Porsche, and NVIDIA.</w:t>
       </w:r>
     </w:p>
     <w:p>
@@ -895,6 +895,32 @@
           <w:sz w:val="20"/>
         </w:rPr>
         <w:t>Shipped a Python document pipeline that converts client JIRA exports into branded executive decks, and a candidate-profiling tool that scores resumes against job descriptions and renders client-ready deliverables.</w:t>
+      </w:r>
+    </w:p>
+    <w:p>
+      <w:pPr>
+        <w:spacing w:before="40" w:after="40"/>
+        <w:ind w:left="288" w:hanging="288"/>
+      </w:pPr>
+      <w:r>
+        <w:rPr>
+          <w:rFonts w:ascii="Inter" w:hAnsi="Inter" w:cs="Inter" w:eastAsia="Inter"/>
+          <w:b w:val="0"/>
+          <w:i w:val="0"/>
+          <w:color w:val="154C8C"/>
+          <w:sz w:val="20"/>
+        </w:rPr>
+        <w:t xml:space="preserve">— </w:t>
+      </w:r>
+      <w:r>
+        <w:rPr>
+          <w:rFonts w:ascii="Inter" w:hAnsi="Inter" w:cs="Inter" w:eastAsia="Inter"/>
+          <w:b w:val="0"/>
+          <w:i w:val="0"/>
+          <w:color w:val="3A3A3A"/>
+          <w:sz w:val="20"/>
+        </w:rPr>
+        <w:t>Built and lead a cross-functional technical team from the ground up — growing engineering headcount 300% and serving as primary technical liaison across OEM programs, validating software for infotainment head units, domain controllers, and SDV architectures.</w:t>
       </w:r>
     </w:p>
     <w:p>

</xml_diff>

<commit_message>
Split resume header contact into two lines
Line one: location, phone, email. Line two: LinkedIn, X, GitHub.
Removes the awkward mid-line wrap the single contact line had since
the X link was added. Previous version archived as 26_08_05c.

Co-Authored-By: Claude Fable 5 <noreply@anthropic.com>
Claude-Session: https://claude.ai/code/session_019qgKRsNgNysMTg9WQprRMm
</commit_message>
<xml_diff>
--- a/uploads/Efrain_Plascencia_Resume.docx
+++ b/uploads/Efrain_Plascencia_Resume.docx
@@ -80,6 +80,23 @@
       <w:pPr>
         <w:spacing w:after="40"/>
         <w:jc w:val="center"/>
+      </w:pPr>
+      <w:r>
+        <w:rPr>
+          <w:rFonts w:ascii="JetBrains Mono" w:hAnsi="JetBrains Mono" w:cs="JetBrains Mono" w:eastAsia="JetBrains Mono"/>
+          <w:b w:val="0"/>
+          <w:i w:val="0"/>
+          <w:color w:val="3A3A3A"/>
+          <w:sz w:val="16"/>
+          <w:spacing w:val="20"/>
+        </w:rPr>
+        <w:t>DALLAS–FORT WORTH, TX   ·   213.321.7937   ·   EFRAIN.PLASCENCIA@GMAIL.COM</w:t>
+      </w:r>
+    </w:p>
+    <w:p>
+      <w:pPr>
+        <w:spacing w:after="40"/>
+        <w:jc w:val="center"/>
         <w:pBdr>
           <w:bottom w:val="single" w:sz="4" w:space="4" w:color="DDD9D1"/>
         </w:pBdr>
@@ -93,7 +110,7 @@
           <w:sz w:val="16"/>
           <w:spacing w:val="20"/>
         </w:rPr>
-        <w:t>DALLAS–FORT WORTH, TX   ·   213.321.7937   ·   EFRAIN.PLASCENCIA@GMAIL.COM   ·   LINKEDIN.COM/IN/EFRAINP   ·   GITHUB.COM/FRIN-BOT   ·   X.COM/EFRAINPLASC</w:t>
+        <w:t>LINKEDIN.COM/IN/EFRAINP   ·   X.COM/EFRAINPLASC   ·   GITHUB.COM/FRIN-BOT</w:t>
       </w:r>
     </w:p>
     <w:p>

</xml_diff>

<commit_message>
Bump companion site date to Sep 2026 and refresh the downloadable resume.
Co-authored-by: Cursor <cursoragent@cursor.com>
</commit_message>
<xml_diff>
--- a/uploads/Efrain_Plascencia_Resume.docx
+++ b/uploads/Efrain_Plascencia_Resume.docx
@@ -4,13 +4,13 @@
   <w:body>
     <w:p>
       <w:pPr>
-        <w:spacing w:after="80"/>
+        <w:spacing w:after="40"/>
         <w:jc w:val="center"/>
       </w:pPr>
       <w:r>
         <w:drawing>
           <wp:inline xmlns:a="http://schemas.openxmlformats.org/drawingml/2006/main" xmlns:pic="http://schemas.openxmlformats.org/drawingml/2006/picture">
-            <wp:extent cx="1005840" cy="1005840"/>
+            <wp:extent cx="566928" cy="566928"/>
             <wp:docPr id="1" name="Picture 1"/>
             <wp:cNvGraphicFramePr>
               <a:graphicFrameLocks noChangeAspect="1"/>
@@ -23,7 +23,7 @@
                     <pic:cNvPicPr/>
                   </pic:nvPicPr>
                   <pic:blipFill>
-                    <a:blip r:embed="rId9"/>
+                    <a:blip r:embed="rId10"/>
                     <a:stretch>
                       <a:fillRect/>
                     </a:stretch>
@@ -31,7 +31,7 @@
                   <pic:spPr>
                     <a:xfrm>
                       <a:off x="0" y="0"/>
-                      <a:ext cx="1005840" cy="1005840"/>
+                      <a:ext cx="566928" cy="566928"/>
                     </a:xfrm>
                     <a:prstGeom prst="rect"/>
                   </pic:spPr>
@@ -44,33 +44,32 @@
     </w:p>
     <w:p>
       <w:pPr>
-        <w:spacing w:after="40"/>
+        <w:spacing w:after="20"/>
         <w:jc w:val="center"/>
       </w:pPr>
       <w:r>
         <w:rPr>
-          <w:rFonts w:ascii="Inter Tight" w:hAnsi="Inter Tight" w:cs="Inter Tight" w:eastAsia="Inter Tight"/>
+          <w:rFonts w:ascii="Departure Mono" w:hAnsi="Departure Mono" w:cs="Departure Mono" w:eastAsia="Departure Mono"/>
           <w:b w:val="0"/>
           <w:i w:val="0"/>
           <w:color w:val="1A1A1A"/>
-          <w:sz w:val="64"/>
-          <w:spacing w:val="-12"/>
+          <w:sz w:val="36"/>
         </w:rPr>
         <w:t>Efrain Plascencia</w:t>
       </w:r>
     </w:p>
     <w:p>
       <w:pPr>
-        <w:spacing w:after="160"/>
+        <w:spacing w:after="80"/>
         <w:jc w:val="center"/>
       </w:pPr>
       <w:r>
         <w:rPr>
-          <w:rFonts w:ascii="JetBrains Mono" w:hAnsi="JetBrains Mono" w:cs="JetBrains Mono" w:eastAsia="JetBrains Mono"/>
+          <w:rFonts w:ascii="Departure Mono" w:hAnsi="Departure Mono" w:cs="Departure Mono" w:eastAsia="Departure Mono"/>
           <w:b w:val="0"/>
           <w:i w:val="0"/>
           <w:color w:val="6A6A6A"/>
-          <w:sz w:val="17"/>
+          <w:sz w:val="15"/>
           <w:spacing w:val="26"/>
         </w:rPr>
         <w:t>AI SOLUTIONS ARCHITECT   ·   APPLIED AI &amp; AGENTIC SYSTEMS   ·   AUTOMOTIVE SOFTWARE</w:t>
@@ -78,16 +77,16 @@
     </w:p>
     <w:p>
       <w:pPr>
-        <w:spacing w:after="40"/>
+        <w:spacing w:after="20"/>
         <w:jc w:val="center"/>
       </w:pPr>
       <w:r>
         <w:rPr>
-          <w:rFonts w:ascii="JetBrains Mono" w:hAnsi="JetBrains Mono" w:cs="JetBrains Mono" w:eastAsia="JetBrains Mono"/>
+          <w:rFonts w:ascii="Departure Mono" w:hAnsi="Departure Mono" w:cs="Departure Mono" w:eastAsia="Departure Mono"/>
           <w:b w:val="0"/>
           <w:i w:val="0"/>
           <w:color w:val="3A3A3A"/>
-          <w:sz w:val="16"/>
+          <w:sz w:val="15"/>
           <w:spacing w:val="20"/>
         </w:rPr>
         <w:t>DALLAS–FORT WORTH, TX   ·   213.321.7937   ·   EFRAIN.PLASCENCIA@GMAIL.COM</w:t>
@@ -103,11 +102,11 @@
       </w:pPr>
       <w:r>
         <w:rPr>
-          <w:rFonts w:ascii="JetBrains Mono" w:hAnsi="JetBrains Mono" w:cs="JetBrains Mono" w:eastAsia="JetBrains Mono"/>
+          <w:rFonts w:ascii="Departure Mono" w:hAnsi="Departure Mono" w:cs="Departure Mono" w:eastAsia="Departure Mono"/>
           <w:b w:val="0"/>
           <w:i w:val="0"/>
           <w:color w:val="3A3A3A"/>
-          <w:sz w:val="16"/>
+          <w:sz w:val="15"/>
           <w:spacing w:val="20"/>
         </w:rPr>
         <w:t>LINKEDIN.COM/IN/EFRAINP   ·   X.COM/EFRAINPLASC   ·   GITHUB.COM/FRIN-BOT</w:t>
@@ -115,29 +114,29 @@
     </w:p>
     <w:p>
       <w:pPr>
-        <w:spacing w:before="320" w:after="120"/>
+        <w:spacing w:before="160" w:after="60"/>
         <w:pBdr>
           <w:bottom w:val="single" w:sz="4" w:space="4" w:color="DDD9D1"/>
         </w:pBdr>
       </w:pPr>
       <w:r>
         <w:rPr>
-          <w:rFonts w:ascii="JetBrains Mono" w:hAnsi="JetBrains Mono" w:cs="JetBrains Mono" w:eastAsia="JetBrains Mono"/>
+          <w:rFonts w:ascii="Departure Mono" w:hAnsi="Departure Mono" w:cs="Departure Mono" w:eastAsia="Departure Mono"/>
           <w:b w:val="0"/>
           <w:i w:val="0"/>
           <w:color w:val="A8A5A0"/>
-          <w:sz w:val="18"/>
+          <w:sz w:val="16"/>
           <w:spacing w:val="20"/>
         </w:rPr>
         <w:t xml:space="preserve">01   </w:t>
       </w:r>
       <w:r>
         <w:rPr>
-          <w:rFonts w:ascii="JetBrains Mono" w:hAnsi="JetBrains Mono" w:cs="JetBrains Mono" w:eastAsia="JetBrains Mono"/>
+          <w:rFonts w:ascii="Departure Mono" w:hAnsi="Departure Mono" w:cs="Departure Mono" w:eastAsia="Departure Mono"/>
           <w:b w:val="0"/>
           <w:i w:val="0"/>
           <w:color w:val="1A1A1A"/>
-          <w:sz w:val="18"/>
+          <w:sz w:val="16"/>
           <w:spacing w:val="30"/>
         </w:rPr>
         <w:t>PROFESSIONAL SUMMARY</w:t>
@@ -145,587 +144,229 @@
     </w:p>
     <w:p>
       <w:pPr>
-        <w:spacing w:after="80" w:line="324" w:lineRule="auto"/>
+        <w:spacing w:after="40" w:line="276" w:lineRule="auto"/>
       </w:pPr>
       <w:r>
         <w:rPr>
-          <w:rFonts w:ascii="Inter" w:hAnsi="Inter" w:cs="Inter" w:eastAsia="Inter"/>
+          <w:rFonts w:ascii="Departure Mono" w:hAnsi="Departure Mono" w:cs="Departure Mono" w:eastAsia="Departure Mono"/>
           <w:b w:val="0"/>
           <w:i w:val="0"/>
           <w:color w:val="3A3A3A"/>
-          <w:sz w:val="20"/>
+          <w:sz w:val="18"/>
         </w:rPr>
-        <w:t>AI solutions architect turning messy operational problems into shipped AI systems people use every day — not demos. At GEMMACON North America, an automotive software consultancy serving international OEMs, designs and deploys the AI-driven systems client engagements run on: agentic intelligence pipelines, automated document generation, and containerized FastAPI services. Specializes in getting requirements right from stakeholders who haven't articulated them yet, then designing so the humans using the system can't easily get it wrong. Grounded in 15 years of connected-vehicle software and validation — telematics architecture, ECU diagnostics, HIL and vehicle testing — at Toyota, Mercedes-Benz R&amp;D North America, Hyundai Autoever, and PACCAR — the background that earns OEM stakeholders' trust in the first meeting.</w:t>
+        <w:t>AI solutions architect turning messy operational problems into shipped AI systems — not demos. At GEMMACON North America, designs and deploys the AI systems OEM engagements run on: agentic pipelines, document automation, and containerized FastAPI services. Fifteen years of connected-vehicle software at Toyota, Mercedes-Benz R&amp;D North America, Hyundai Autoever, and PACCAR.</w:t>
       </w:r>
     </w:p>
     <w:p>
       <w:pPr>
-        <w:spacing w:before="320" w:after="120"/>
+        <w:spacing w:before="160" w:after="60"/>
         <w:pBdr>
           <w:bottom w:val="single" w:sz="4" w:space="4" w:color="DDD9D1"/>
         </w:pBdr>
       </w:pPr>
       <w:r>
         <w:rPr>
-          <w:rFonts w:ascii="JetBrains Mono" w:hAnsi="JetBrains Mono" w:cs="JetBrains Mono" w:eastAsia="JetBrains Mono"/>
+          <w:rFonts w:ascii="Departure Mono" w:hAnsi="Departure Mono" w:cs="Departure Mono" w:eastAsia="Departure Mono"/>
           <w:b w:val="0"/>
           <w:i w:val="0"/>
           <w:color w:val="A8A5A0"/>
-          <w:sz w:val="18"/>
+          <w:sz w:val="16"/>
           <w:spacing w:val="20"/>
         </w:rPr>
         <w:t xml:space="preserve">02   </w:t>
       </w:r>
       <w:r>
         <w:rPr>
-          <w:rFonts w:ascii="JetBrains Mono" w:hAnsi="JetBrains Mono" w:cs="JetBrains Mono" w:eastAsia="JetBrains Mono"/>
+          <w:rFonts w:ascii="Departure Mono" w:hAnsi="Departure Mono" w:cs="Departure Mono" w:eastAsia="Departure Mono"/>
           <w:b w:val="0"/>
           <w:i w:val="0"/>
           <w:color w:val="1A1A1A"/>
-          <w:sz w:val="18"/>
+          <w:sz w:val="16"/>
           <w:spacing w:val="30"/>
         </w:rPr>
         <w:t>CORE COMPETENCIES</w:t>
       </w:r>
     </w:p>
-    <w:tbl>
-      <w:tblPr>
-        <w:tblW w:type="auto" w:w="0"/>
-        <w:tblLayout w:type="autofit"/>
-        <w:tblLook w:firstColumn="1" w:firstRow="1" w:lastColumn="0" w:lastRow="0" w:noHBand="0" w:noVBand="1" w:val="04A0"/>
-      </w:tblPr>
-      <w:tblGrid>
-        <w:gridCol w:w="5400"/>
-        <w:gridCol w:w="5400"/>
-      </w:tblGrid>
-      <w:tr>
-        <w:tc>
-          <w:tcPr>
-            <w:tcW w:type="dxa" w:w="5400"/>
-          </w:tcPr>
-          <w:p>
-            <w:pPr>
-              <w:spacing w:after="40"/>
-            </w:pPr>
-            <w:r/>
-            <w:r>
-              <w:rPr>
-                <w:rFonts w:ascii="JetBrains Mono" w:hAnsi="JetBrains Mono" w:cs="JetBrains Mono" w:eastAsia="JetBrains Mono"/>
-                <w:b w:val="0"/>
-                <w:i w:val="0"/>
-                <w:color w:val="A8A5A0"/>
-                <w:sz w:val="16"/>
-                <w:spacing w:val="16"/>
-              </w:rPr>
-              <w:t xml:space="preserve">01   </w:t>
-            </w:r>
-            <w:r>
-              <w:rPr>
-                <w:rFonts w:ascii="Inter" w:hAnsi="Inter" w:cs="Inter" w:eastAsia="Inter"/>
-                <w:b w:val="0"/>
-                <w:i w:val="0"/>
-                <w:color w:val="3A3A3A"/>
-                <w:sz w:val="19"/>
-              </w:rPr>
-              <w:t>Agentic AI Systems &amp; Workflows</w:t>
-            </w:r>
-          </w:p>
-        </w:tc>
-        <w:tc>
-          <w:tcPr>
-            <w:tcW w:type="dxa" w:w="5400"/>
-          </w:tcPr>
-          <w:p>
-            <w:pPr>
-              <w:spacing w:after="40"/>
-            </w:pPr>
-            <w:r/>
-            <w:r>
-              <w:rPr>
-                <w:rFonts w:ascii="JetBrains Mono" w:hAnsi="JetBrains Mono" w:cs="JetBrains Mono" w:eastAsia="JetBrains Mono"/>
-                <w:b w:val="0"/>
-                <w:i w:val="0"/>
-                <w:color w:val="A8A5A0"/>
-                <w:sz w:val="16"/>
-                <w:spacing w:val="16"/>
-              </w:rPr>
-              <w:t xml:space="preserve">02   </w:t>
-            </w:r>
-            <w:r>
-              <w:rPr>
-                <w:rFonts w:ascii="Inter" w:hAnsi="Inter" w:cs="Inter" w:eastAsia="Inter"/>
-                <w:b w:val="0"/>
-                <w:i w:val="0"/>
-                <w:color w:val="3A3A3A"/>
-                <w:sz w:val="19"/>
-              </w:rPr>
-              <w:t>LLM Integration &amp; RAG</w:t>
-            </w:r>
-          </w:p>
-        </w:tc>
-      </w:tr>
-      <w:tr>
-        <w:tc>
-          <w:tcPr>
-            <w:tcW w:type="dxa" w:w="5400"/>
-          </w:tcPr>
-          <w:p>
-            <w:pPr>
-              <w:spacing w:after="40"/>
-            </w:pPr>
-            <w:r/>
-            <w:r>
-              <w:rPr>
-                <w:rFonts w:ascii="JetBrains Mono" w:hAnsi="JetBrains Mono" w:cs="JetBrains Mono" w:eastAsia="JetBrains Mono"/>
-                <w:b w:val="0"/>
-                <w:i w:val="0"/>
-                <w:color w:val="A8A5A0"/>
-                <w:sz w:val="16"/>
-                <w:spacing w:val="16"/>
-              </w:rPr>
-              <w:t xml:space="preserve">03   </w:t>
-            </w:r>
-            <w:r>
-              <w:rPr>
-                <w:rFonts w:ascii="Inter" w:hAnsi="Inter" w:cs="Inter" w:eastAsia="Inter"/>
-                <w:b w:val="0"/>
-                <w:i w:val="0"/>
-                <w:color w:val="3A3A3A"/>
-                <w:sz w:val="19"/>
-              </w:rPr>
-              <w:t>Forward-Deployed Engineering</w:t>
-            </w:r>
-          </w:p>
-        </w:tc>
-        <w:tc>
-          <w:tcPr>
-            <w:tcW w:type="dxa" w:w="5400"/>
-          </w:tcPr>
-          <w:p>
-            <w:pPr>
-              <w:spacing w:after="40"/>
-            </w:pPr>
-            <w:r/>
-            <w:r>
-              <w:rPr>
-                <w:rFonts w:ascii="JetBrains Mono" w:hAnsi="JetBrains Mono" w:cs="JetBrains Mono" w:eastAsia="JetBrains Mono"/>
-                <w:b w:val="0"/>
-                <w:i w:val="0"/>
-                <w:color w:val="A8A5A0"/>
-                <w:sz w:val="16"/>
-                <w:spacing w:val="16"/>
-              </w:rPr>
-              <w:t xml:space="preserve">04   </w:t>
-            </w:r>
-            <w:r>
-              <w:rPr>
-                <w:rFonts w:ascii="Inter" w:hAnsi="Inter" w:cs="Inter" w:eastAsia="Inter"/>
-                <w:b w:val="0"/>
-                <w:i w:val="0"/>
-                <w:color w:val="3A3A3A"/>
-                <w:sz w:val="19"/>
-              </w:rPr>
-              <w:t>Requirements Discovery &amp; Scoping</w:t>
-            </w:r>
-          </w:p>
-        </w:tc>
-      </w:tr>
-      <w:tr>
-        <w:tc>
-          <w:tcPr>
-            <w:tcW w:type="dxa" w:w="5400"/>
-          </w:tcPr>
-          <w:p>
-            <w:pPr>
-              <w:spacing w:after="40"/>
-            </w:pPr>
-            <w:r/>
-            <w:r>
-              <w:rPr>
-                <w:rFonts w:ascii="JetBrains Mono" w:hAnsi="JetBrains Mono" w:cs="JetBrains Mono" w:eastAsia="JetBrains Mono"/>
-                <w:b w:val="0"/>
-                <w:i w:val="0"/>
-                <w:color w:val="A8A5A0"/>
-                <w:sz w:val="16"/>
-                <w:spacing w:val="16"/>
-              </w:rPr>
-              <w:t xml:space="preserve">05   </w:t>
-            </w:r>
-            <w:r>
-              <w:rPr>
-                <w:rFonts w:ascii="Inter" w:hAnsi="Inter" w:cs="Inter" w:eastAsia="Inter"/>
-                <w:b w:val="0"/>
-                <w:i w:val="0"/>
-                <w:color w:val="3A3A3A"/>
-                <w:sz w:val="19"/>
-              </w:rPr>
-              <w:t>Rapid Prototyping to Production</w:t>
-            </w:r>
-          </w:p>
-        </w:tc>
-        <w:tc>
-          <w:tcPr>
-            <w:tcW w:type="dxa" w:w="5400"/>
-          </w:tcPr>
-          <w:p>
-            <w:pPr>
-              <w:spacing w:after="40"/>
-            </w:pPr>
-            <w:r/>
-            <w:r>
-              <w:rPr>
-                <w:rFonts w:ascii="JetBrains Mono" w:hAnsi="JetBrains Mono" w:cs="JetBrains Mono" w:eastAsia="JetBrains Mono"/>
-                <w:b w:val="0"/>
-                <w:i w:val="0"/>
-                <w:color w:val="A8A5A0"/>
-                <w:sz w:val="16"/>
-                <w:spacing w:val="16"/>
-              </w:rPr>
-              <w:t xml:space="preserve">06   </w:t>
-            </w:r>
-            <w:r>
-              <w:rPr>
-                <w:rFonts w:ascii="Inter" w:hAnsi="Inter" w:cs="Inter" w:eastAsia="Inter"/>
-                <w:b w:val="0"/>
-                <w:i w:val="0"/>
-                <w:color w:val="3A3A3A"/>
-                <w:sz w:val="19"/>
-              </w:rPr>
-              <w:t>Python / FastAPI Service Design</w:t>
-            </w:r>
-          </w:p>
-        </w:tc>
-      </w:tr>
-      <w:tr>
-        <w:tc>
-          <w:tcPr>
-            <w:tcW w:type="dxa" w:w="5400"/>
-          </w:tcPr>
-          <w:p>
-            <w:pPr>
-              <w:spacing w:after="40"/>
-            </w:pPr>
-            <w:r/>
-            <w:r>
-              <w:rPr>
-                <w:rFonts w:ascii="JetBrains Mono" w:hAnsi="JetBrains Mono" w:cs="JetBrains Mono" w:eastAsia="JetBrains Mono"/>
-                <w:b w:val="0"/>
-                <w:i w:val="0"/>
-                <w:color w:val="A8A5A0"/>
-                <w:sz w:val="16"/>
-                <w:spacing w:val="16"/>
-              </w:rPr>
-              <w:t xml:space="preserve">07   </w:t>
-            </w:r>
-            <w:r>
-              <w:rPr>
-                <w:rFonts w:ascii="Inter" w:hAnsi="Inter" w:cs="Inter" w:eastAsia="Inter"/>
-                <w:b w:val="0"/>
-                <w:i w:val="0"/>
-                <w:color w:val="3A3A3A"/>
-                <w:sz w:val="19"/>
-              </w:rPr>
-              <w:t>Document &amp; Reporting Automation</w:t>
-            </w:r>
-          </w:p>
-        </w:tc>
-        <w:tc>
-          <w:tcPr>
-            <w:tcW w:type="dxa" w:w="5400"/>
-          </w:tcPr>
-          <w:p>
-            <w:pPr>
-              <w:spacing w:after="40"/>
-            </w:pPr>
-            <w:r/>
-            <w:r>
-              <w:rPr>
-                <w:rFonts w:ascii="JetBrains Mono" w:hAnsi="JetBrains Mono" w:cs="JetBrains Mono" w:eastAsia="JetBrains Mono"/>
-                <w:b w:val="0"/>
-                <w:i w:val="0"/>
-                <w:color w:val="A8A5A0"/>
-                <w:sz w:val="16"/>
-                <w:spacing w:val="16"/>
-              </w:rPr>
-              <w:t xml:space="preserve">08   </w:t>
-            </w:r>
-            <w:r>
-              <w:rPr>
-                <w:rFonts w:ascii="Inter" w:hAnsi="Inter" w:cs="Inter" w:eastAsia="Inter"/>
-                <w:b w:val="0"/>
-                <w:i w:val="0"/>
-                <w:color w:val="3A3A3A"/>
-                <w:sz w:val="19"/>
-              </w:rPr>
-              <w:t>Technical Pre-Sales &amp; Proposals</w:t>
-            </w:r>
-          </w:p>
-        </w:tc>
-      </w:tr>
-      <w:tr>
-        <w:tc>
-          <w:tcPr>
-            <w:tcW w:type="dxa" w:w="5400"/>
-          </w:tcPr>
-          <w:p>
-            <w:pPr>
-              <w:spacing w:after="40"/>
-            </w:pPr>
-            <w:r/>
-            <w:r>
-              <w:rPr>
-                <w:rFonts w:ascii="JetBrains Mono" w:hAnsi="JetBrains Mono" w:cs="JetBrains Mono" w:eastAsia="JetBrains Mono"/>
-                <w:b w:val="0"/>
-                <w:i w:val="0"/>
-                <w:color w:val="A8A5A0"/>
-                <w:sz w:val="16"/>
-                <w:spacing w:val="16"/>
-              </w:rPr>
-              <w:t xml:space="preserve">09   </w:t>
-            </w:r>
-            <w:r>
-              <w:rPr>
-                <w:rFonts w:ascii="Inter" w:hAnsi="Inter" w:cs="Inter" w:eastAsia="Inter"/>
-                <w:b w:val="0"/>
-                <w:i w:val="0"/>
-                <w:color w:val="3A3A3A"/>
-                <w:sz w:val="19"/>
-              </w:rPr>
-              <w:t>Executive &amp; Stakeholder Communication</w:t>
-            </w:r>
-          </w:p>
-        </w:tc>
-        <w:tc>
-          <w:tcPr>
-            <w:tcW w:type="dxa" w:w="5400"/>
-          </w:tcPr>
-          <w:p>
-            <w:pPr>
-              <w:spacing w:after="40"/>
-            </w:pPr>
-            <w:r/>
-            <w:r>
-              <w:rPr>
-                <w:rFonts w:ascii="JetBrains Mono" w:hAnsi="JetBrains Mono" w:cs="JetBrains Mono" w:eastAsia="JetBrains Mono"/>
-                <w:b w:val="0"/>
-                <w:i w:val="0"/>
-                <w:color w:val="A8A5A0"/>
-                <w:sz w:val="16"/>
-                <w:spacing w:val="16"/>
-              </w:rPr>
-              <w:t xml:space="preserve">10   </w:t>
-            </w:r>
-            <w:r>
-              <w:rPr>
-                <w:rFonts w:ascii="Inter" w:hAnsi="Inter" w:cs="Inter" w:eastAsia="Inter"/>
-                <w:b w:val="0"/>
-                <w:i w:val="0"/>
-                <w:color w:val="3A3A3A"/>
-                <w:sz w:val="19"/>
-              </w:rPr>
-              <w:t>Connected Vehicle &amp; Telematics</w:t>
-            </w:r>
-          </w:p>
-        </w:tc>
-      </w:tr>
-      <w:tr>
-        <w:tc>
-          <w:tcPr>
-            <w:tcW w:type="dxa" w:w="5400"/>
-          </w:tcPr>
-          <w:p>
-            <w:pPr>
-              <w:spacing w:after="40"/>
-            </w:pPr>
-            <w:r/>
-            <w:r>
-              <w:rPr>
-                <w:rFonts w:ascii="JetBrains Mono" w:hAnsi="JetBrains Mono" w:cs="JetBrains Mono" w:eastAsia="JetBrains Mono"/>
-                <w:b w:val="0"/>
-                <w:i w:val="0"/>
-                <w:color w:val="A8A5A0"/>
-                <w:sz w:val="16"/>
-                <w:spacing w:val="16"/>
-              </w:rPr>
-              <w:t xml:space="preserve">11   </w:t>
-            </w:r>
-            <w:r>
-              <w:rPr>
-                <w:rFonts w:ascii="Inter" w:hAnsi="Inter" w:cs="Inter" w:eastAsia="Inter"/>
-                <w:b w:val="0"/>
-                <w:i w:val="0"/>
-                <w:color w:val="3A3A3A"/>
-                <w:sz w:val="19"/>
-              </w:rPr>
-              <w:t>DCM / Infotainment / OTA Systems</w:t>
-            </w:r>
-          </w:p>
-        </w:tc>
-        <w:tc>
-          <w:tcPr>
-            <w:tcW w:type="dxa" w:w="5400"/>
-          </w:tcPr>
-          <w:p>
-            <w:pPr>
-              <w:spacing w:after="40"/>
-            </w:pPr>
-            <w:r/>
-            <w:r>
-              <w:rPr>
-                <w:rFonts w:ascii="JetBrains Mono" w:hAnsi="JetBrains Mono" w:cs="JetBrains Mono" w:eastAsia="JetBrains Mono"/>
-                <w:b w:val="0"/>
-                <w:i w:val="0"/>
-                <w:color w:val="A8A5A0"/>
-                <w:sz w:val="16"/>
-                <w:spacing w:val="16"/>
-              </w:rPr>
-              <w:t xml:space="preserve">12   </w:t>
-            </w:r>
-            <w:r>
-              <w:rPr>
-                <w:rFonts w:ascii="Inter" w:hAnsi="Inter" w:cs="Inter" w:eastAsia="Inter"/>
-                <w:b w:val="0"/>
-                <w:i w:val="0"/>
-                <w:color w:val="3A3A3A"/>
-                <w:sz w:val="19"/>
-              </w:rPr>
-              <w:t>Embedded &amp; Cloud Integration</w:t>
-            </w:r>
-          </w:p>
-        </w:tc>
-      </w:tr>
-      <w:tr>
-        <w:tc>
-          <w:tcPr>
-            <w:tcW w:type="dxa" w:w="5400"/>
-          </w:tcPr>
-          <w:p>
-            <w:pPr>
-              <w:spacing w:after="40"/>
-            </w:pPr>
-            <w:r/>
-            <w:r>
-              <w:rPr>
-                <w:rFonts w:ascii="JetBrains Mono" w:hAnsi="JetBrains Mono" w:cs="JetBrains Mono" w:eastAsia="JetBrains Mono"/>
-                <w:b w:val="0"/>
-                <w:i w:val="0"/>
-                <w:color w:val="A8A5A0"/>
-                <w:sz w:val="16"/>
-                <w:spacing w:val="16"/>
-              </w:rPr>
-              <w:t xml:space="preserve">13   </w:t>
-            </w:r>
-            <w:r>
-              <w:rPr>
-                <w:rFonts w:ascii="Inter" w:hAnsi="Inter" w:cs="Inter" w:eastAsia="Inter"/>
-                <w:b w:val="0"/>
-                <w:i w:val="0"/>
-                <w:color w:val="3A3A3A"/>
-                <w:sz w:val="19"/>
-              </w:rPr>
-              <w:t>Bug Triage &amp; Root-Cause Analysis</w:t>
-            </w:r>
-          </w:p>
-        </w:tc>
-        <w:tc>
-          <w:tcPr>
-            <w:tcW w:type="dxa" w:w="5400"/>
-          </w:tcPr>
-          <w:p>
-            <w:pPr>
-              <w:spacing w:after="40"/>
-            </w:pPr>
-            <w:r/>
-            <w:r>
-              <w:rPr>
-                <w:rFonts w:ascii="JetBrains Mono" w:hAnsi="JetBrains Mono" w:cs="JetBrains Mono" w:eastAsia="JetBrains Mono"/>
-                <w:b w:val="0"/>
-                <w:i w:val="0"/>
-                <w:color w:val="A8A5A0"/>
-                <w:sz w:val="16"/>
-                <w:spacing w:val="16"/>
-              </w:rPr>
-              <w:t xml:space="preserve">14   </w:t>
-            </w:r>
-            <w:r>
-              <w:rPr>
-                <w:rFonts w:ascii="Inter" w:hAnsi="Inter" w:cs="Inter" w:eastAsia="Inter"/>
-                <w:b w:val="0"/>
-                <w:i w:val="0"/>
-                <w:color w:val="3A3A3A"/>
-                <w:sz w:val="19"/>
-              </w:rPr>
-              <w:t>Cross-Functional Tech Leadership</w:t>
-            </w:r>
-          </w:p>
-        </w:tc>
-      </w:tr>
-      <w:tr>
-        <w:tc>
-          <w:tcPr>
-            <w:tcW w:type="dxa" w:w="5400"/>
-          </w:tcPr>
-          <w:p>
-            <w:pPr>
-              <w:spacing w:after="40"/>
-            </w:pPr>
-            <w:r/>
-            <w:r>
-              <w:rPr>
-                <w:rFonts w:ascii="JetBrains Mono" w:hAnsi="JetBrains Mono" w:cs="JetBrains Mono" w:eastAsia="JetBrains Mono"/>
-                <w:b w:val="0"/>
-                <w:i w:val="0"/>
-                <w:color w:val="A8A5A0"/>
-                <w:sz w:val="16"/>
-                <w:spacing w:val="16"/>
-              </w:rPr>
-              <w:t xml:space="preserve">15   </w:t>
-            </w:r>
-            <w:r>
-              <w:rPr>
-                <w:rFonts w:ascii="Inter" w:hAnsi="Inter" w:cs="Inter" w:eastAsia="Inter"/>
-                <w:b w:val="0"/>
-                <w:i w:val="0"/>
-                <w:color w:val="3A3A3A"/>
-                <w:sz w:val="19"/>
-              </w:rPr>
-              <w:t>Global Team Coordination</w:t>
-            </w:r>
-          </w:p>
-        </w:tc>
-        <w:tc>
-          <w:tcPr>
-            <w:tcW w:type="dxa" w:w="5400"/>
-          </w:tcPr>
-          <w:p/>
-        </w:tc>
-      </w:tr>
-    </w:tbl>
     <w:p>
       <w:pPr>
-        <w:spacing w:before="320" w:after="120"/>
+        <w:spacing w:after="40" w:line="276" w:lineRule="auto"/>
+      </w:pPr>
+      <w:r>
+        <w:rPr>
+          <w:rFonts w:ascii="Departure Mono" w:hAnsi="Departure Mono" w:cs="Departure Mono" w:eastAsia="Departure Mono"/>
+          <w:b w:val="0"/>
+          <w:i w:val="0"/>
+          <w:color w:val="3A3A3A"/>
+          <w:sz w:val="18"/>
+        </w:rPr>
+        <w:t>Agentic systems</w:t>
+      </w:r>
+      <w:r>
+        <w:rPr>
+          <w:rFonts w:ascii="Departure Mono" w:hAnsi="Departure Mono" w:cs="Departure Mono" w:eastAsia="Departure Mono"/>
+          <w:b w:val="0"/>
+          <w:i w:val="0"/>
+          <w:color w:val="A8A5A0"/>
+          <w:sz w:val="16"/>
+        </w:rPr>
+        <w:t xml:space="preserve">  ·  </w:t>
+      </w:r>
+      <w:r>
+        <w:rPr>
+          <w:rFonts w:ascii="Departure Mono" w:hAnsi="Departure Mono" w:cs="Departure Mono" w:eastAsia="Departure Mono"/>
+          <w:b w:val="0"/>
+          <w:i w:val="0"/>
+          <w:color w:val="3A3A3A"/>
+          <w:sz w:val="18"/>
+        </w:rPr>
+        <w:t>LLM / RAG</w:t>
+      </w:r>
+      <w:r>
+        <w:rPr>
+          <w:rFonts w:ascii="Departure Mono" w:hAnsi="Departure Mono" w:cs="Departure Mono" w:eastAsia="Departure Mono"/>
+          <w:b w:val="0"/>
+          <w:i w:val="0"/>
+          <w:color w:val="A8A5A0"/>
+          <w:sz w:val="16"/>
+        </w:rPr>
+        <w:t xml:space="preserve">  ·  </w:t>
+      </w:r>
+      <w:r>
+        <w:rPr>
+          <w:rFonts w:ascii="Departure Mono" w:hAnsi="Departure Mono" w:cs="Departure Mono" w:eastAsia="Departure Mono"/>
+          <w:b w:val="0"/>
+          <w:i w:val="0"/>
+          <w:color w:val="3A3A3A"/>
+          <w:sz w:val="18"/>
+        </w:rPr>
+        <w:t>Python / FastAPI</w:t>
+      </w:r>
+      <w:r>
+        <w:rPr>
+          <w:rFonts w:ascii="Departure Mono" w:hAnsi="Departure Mono" w:cs="Departure Mono" w:eastAsia="Departure Mono"/>
+          <w:b w:val="0"/>
+          <w:i w:val="0"/>
+          <w:color w:val="A8A5A0"/>
+          <w:sz w:val="16"/>
+        </w:rPr>
+        <w:t xml:space="preserve">  ·  </w:t>
+      </w:r>
+      <w:r>
+        <w:rPr>
+          <w:rFonts w:ascii="Departure Mono" w:hAnsi="Departure Mono" w:cs="Departure Mono" w:eastAsia="Departure Mono"/>
+          <w:b w:val="0"/>
+          <w:i w:val="0"/>
+          <w:color w:val="3A3A3A"/>
+          <w:sz w:val="18"/>
+        </w:rPr>
+        <w:t>Forward-deployed engineering</w:t>
+      </w:r>
+      <w:r>
+        <w:rPr>
+          <w:rFonts w:ascii="Departure Mono" w:hAnsi="Departure Mono" w:cs="Departure Mono" w:eastAsia="Departure Mono"/>
+          <w:b w:val="0"/>
+          <w:i w:val="0"/>
+          <w:color w:val="A8A5A0"/>
+          <w:sz w:val="16"/>
+        </w:rPr>
+        <w:t xml:space="preserve">  ·  </w:t>
+      </w:r>
+      <w:r>
+        <w:rPr>
+          <w:rFonts w:ascii="Departure Mono" w:hAnsi="Departure Mono" w:cs="Departure Mono" w:eastAsia="Departure Mono"/>
+          <w:b w:val="0"/>
+          <w:i w:val="0"/>
+          <w:color w:val="3A3A3A"/>
+          <w:sz w:val="18"/>
+        </w:rPr>
+        <w:t>Requirements &amp; scoping</w:t>
+      </w:r>
+      <w:r>
+        <w:rPr>
+          <w:rFonts w:ascii="Departure Mono" w:hAnsi="Departure Mono" w:cs="Departure Mono" w:eastAsia="Departure Mono"/>
+          <w:b w:val="0"/>
+          <w:i w:val="0"/>
+          <w:color w:val="A8A5A0"/>
+          <w:sz w:val="16"/>
+        </w:rPr>
+        <w:t xml:space="preserve">  ·  </w:t>
+      </w:r>
+      <w:r>
+        <w:rPr>
+          <w:rFonts w:ascii="Departure Mono" w:hAnsi="Departure Mono" w:cs="Departure Mono" w:eastAsia="Departure Mono"/>
+          <w:b w:val="0"/>
+          <w:i w:val="0"/>
+          <w:color w:val="3A3A3A"/>
+          <w:sz w:val="18"/>
+        </w:rPr>
+        <w:t>Technical pre-sales</w:t>
+      </w:r>
+      <w:r>
+        <w:rPr>
+          <w:rFonts w:ascii="Departure Mono" w:hAnsi="Departure Mono" w:cs="Departure Mono" w:eastAsia="Departure Mono"/>
+          <w:b w:val="0"/>
+          <w:i w:val="0"/>
+          <w:color w:val="A8A5A0"/>
+          <w:sz w:val="16"/>
+        </w:rPr>
+        <w:t xml:space="preserve">  ·  </w:t>
+      </w:r>
+      <w:r>
+        <w:rPr>
+          <w:rFonts w:ascii="Departure Mono" w:hAnsi="Departure Mono" w:cs="Departure Mono" w:eastAsia="Departure Mono"/>
+          <w:b w:val="0"/>
+          <w:i w:val="0"/>
+          <w:color w:val="3A3A3A"/>
+          <w:sz w:val="18"/>
+        </w:rPr>
+        <w:t>OTA / telematics / SDV</w:t>
+      </w:r>
+      <w:r>
+        <w:rPr>
+          <w:rFonts w:ascii="Departure Mono" w:hAnsi="Departure Mono" w:cs="Departure Mono" w:eastAsia="Departure Mono"/>
+          <w:b w:val="0"/>
+          <w:i w:val="0"/>
+          <w:color w:val="A8A5A0"/>
+          <w:sz w:val="16"/>
+        </w:rPr>
+        <w:t xml:space="preserve">  ·  </w:t>
+      </w:r>
+      <w:r>
+        <w:rPr>
+          <w:rFonts w:ascii="Departure Mono" w:hAnsi="Departure Mono" w:cs="Departure Mono" w:eastAsia="Departure Mono"/>
+          <w:b w:val="0"/>
+          <w:i w:val="0"/>
+          <w:color w:val="3A3A3A"/>
+          <w:sz w:val="18"/>
+        </w:rPr>
+        <w:t>Cross-functional lead</w:t>
+      </w:r>
+    </w:p>
+    <w:p>
+      <w:pPr>
+        <w:spacing w:before="160" w:after="60"/>
         <w:pBdr>
           <w:bottom w:val="single" w:sz="4" w:space="4" w:color="DDD9D1"/>
         </w:pBdr>
       </w:pPr>
       <w:r>
         <w:rPr>
-          <w:rFonts w:ascii="JetBrains Mono" w:hAnsi="JetBrains Mono" w:cs="JetBrains Mono" w:eastAsia="JetBrains Mono"/>
+          <w:rFonts w:ascii="Departure Mono" w:hAnsi="Departure Mono" w:cs="Departure Mono" w:eastAsia="Departure Mono"/>
           <w:b w:val="0"/>
           <w:i w:val="0"/>
           <w:color w:val="A8A5A0"/>
-          <w:sz w:val="18"/>
+          <w:sz w:val="16"/>
           <w:spacing w:val="20"/>
         </w:rPr>
         <w:t xml:space="preserve">03   </w:t>
       </w:r>
       <w:r>
         <w:rPr>
-          <w:rFonts w:ascii="JetBrains Mono" w:hAnsi="JetBrains Mono" w:cs="JetBrains Mono" w:eastAsia="JetBrains Mono"/>
+          <w:rFonts w:ascii="Departure Mono" w:hAnsi="Departure Mono" w:cs="Departure Mono" w:eastAsia="Departure Mono"/>
           <w:b w:val="0"/>
           <w:i w:val="0"/>
           <w:color w:val="1A1A1A"/>
-          <w:sz w:val="18"/>
+          <w:sz w:val="16"/>
           <w:spacing w:val="30"/>
         </w:rPr>
         <w:t>PROFESSIONAL EXPERIENCE &amp; EDUCATION</w:t>
@@ -733,29 +374,29 @@
     </w:p>
     <w:p>
       <w:pPr>
-        <w:spacing w:before="160" w:after="20"/>
+        <w:spacing w:before="100" w:after="0"/>
         <w:tabs>
           <w:tab w:val="right" w:pos="10800"/>
         </w:tabs>
       </w:pPr>
       <w:r>
         <w:rPr>
-          <w:rFonts w:ascii="JetBrains Mono" w:hAnsi="JetBrains Mono" w:cs="JetBrains Mono" w:eastAsia="JetBrains Mono"/>
+          <w:rFonts w:ascii="Departure Mono" w:hAnsi="Departure Mono" w:cs="Departure Mono" w:eastAsia="Departure Mono"/>
           <w:b w:val="0"/>
           <w:i w:val="0"/>
           <w:color w:val="154C8C"/>
-          <w:sz w:val="16"/>
+          <w:sz w:val="15"/>
           <w:spacing w:val="24"/>
         </w:rPr>
         <w:t xml:space="preserve">EXPERIENCE   </w:t>
       </w:r>
       <w:r>
         <w:rPr>
-          <w:rFonts w:ascii="Inter Tight" w:hAnsi="Inter Tight" w:cs="Inter Tight" w:eastAsia="Inter Tight"/>
+          <w:rFonts w:ascii="Departure Mono" w:hAnsi="Departure Mono" w:cs="Departure Mono" w:eastAsia="Departure Mono"/>
           <w:b w:val="0"/>
           <w:i w:val="0"/>
           <w:color w:val="1A1A1A"/>
-          <w:sz w:val="26"/>
+          <w:sz w:val="22"/>
         </w:rPr>
         <w:t>Director of AI Deployment &amp; Solutions</w:t>
       </w:r>
@@ -764,11 +405,11 @@
       </w:r>
       <w:r>
         <w:rPr>
-          <w:rFonts w:ascii="JetBrains Mono" w:hAnsi="JetBrains Mono" w:cs="JetBrains Mono" w:eastAsia="JetBrains Mono"/>
+          <w:rFonts w:ascii="Departure Mono" w:hAnsi="Departure Mono" w:cs="Departure Mono" w:eastAsia="Departure Mono"/>
           <w:b w:val="0"/>
           <w:i w:val="0"/>
           <w:color w:val="6A6A6A"/>
-          <w:sz w:val="17"/>
+          <w:sz w:val="16"/>
           <w:spacing w:val="20"/>
         </w:rPr>
         <w:t>APR 2023 — PRESENT</w:t>
@@ -776,195 +417,143 @@
     </w:p>
     <w:p>
       <w:pPr>
-        <w:spacing w:after="80"/>
+        <w:spacing w:after="40"/>
       </w:pPr>
       <w:r>
         <w:rPr>
-          <w:rFonts w:ascii="JetBrains Mono" w:hAnsi="JetBrains Mono" w:cs="JetBrains Mono" w:eastAsia="JetBrains Mono"/>
+          <w:rFonts w:ascii="Departure Mono" w:hAnsi="Departure Mono" w:cs="Departure Mono" w:eastAsia="Departure Mono"/>
           <w:b w:val="0"/>
           <w:i w:val="0"/>
           <w:color w:val="3A3A3A"/>
-          <w:sz w:val="18"/>
+          <w:sz w:val="16"/>
           <w:spacing w:val="12"/>
         </w:rPr>
         <w:t>GEMMACON North America</w:t>
       </w:r>
       <w:r>
         <w:rPr>
-          <w:rFonts w:ascii="JetBrains Mono" w:hAnsi="JetBrains Mono" w:cs="JetBrains Mono" w:eastAsia="JetBrains Mono"/>
+          <w:rFonts w:ascii="Departure Mono" w:hAnsi="Departure Mono" w:cs="Departure Mono" w:eastAsia="Departure Mono"/>
           <w:b w:val="0"/>
           <w:i w:val="0"/>
           <w:color w:val="A8A5A0"/>
-          <w:sz w:val="18"/>
+          <w:sz w:val="16"/>
         </w:rPr>
         <w:t xml:space="preserve">   ·   </w:t>
       </w:r>
       <w:r>
         <w:rPr>
-          <w:rFonts w:ascii="JetBrains Mono" w:hAnsi="JetBrains Mono" w:cs="JetBrains Mono" w:eastAsia="JetBrains Mono"/>
+          <w:rFonts w:ascii="Departure Mono" w:hAnsi="Departure Mono" w:cs="Departure Mono" w:eastAsia="Departure Mono"/>
           <w:b w:val="0"/>
           <w:i w:val="0"/>
           <w:color w:val="6A6A6A"/>
-          <w:sz w:val="18"/>
+          <w:sz w:val="16"/>
         </w:rPr>
         <w:t>Long Beach, CA (Remote from DFW)</w:t>
       </w:r>
     </w:p>
     <w:p>
       <w:pPr>
-        <w:spacing w:before="40" w:after="40"/>
-        <w:ind w:left="288" w:hanging="288"/>
+        <w:spacing w:before="20" w:after="20" w:line="269" w:lineRule="auto"/>
+        <w:ind w:left="259" w:hanging="259"/>
       </w:pPr>
       <w:r>
         <w:rPr>
-          <w:rFonts w:ascii="Inter" w:hAnsi="Inter" w:cs="Inter" w:eastAsia="Inter"/>
+          <w:rFonts w:ascii="Departure Mono" w:hAnsi="Departure Mono" w:cs="Departure Mono" w:eastAsia="Departure Mono"/>
           <w:b w:val="0"/>
           <w:i w:val="0"/>
           <w:color w:val="154C8C"/>
-          <w:sz w:val="20"/>
+          <w:sz w:val="18"/>
         </w:rPr>
         <w:t xml:space="preserve">— </w:t>
       </w:r>
       <w:r>
         <w:rPr>
-          <w:rFonts w:ascii="Inter" w:hAnsi="Inter" w:cs="Inter" w:eastAsia="Inter"/>
+          <w:rFonts w:ascii="Departure Mono" w:hAnsi="Departure Mono" w:cs="Departure Mono" w:eastAsia="Departure Mono"/>
           <w:b w:val="0"/>
           <w:i w:val="0"/>
           <w:color w:val="3A3A3A"/>
-          <w:sz w:val="20"/>
+          <w:sz w:val="18"/>
         </w:rPr>
-        <w:t>Joined as OTA Test Manager; promoted to Head of Business Development &amp; Engineering within a year, then to Director of AI Deployment &amp; Solutions in 2025 — leading the North America practice's AI systems, commercial strategy, and technical recruiting across engagements for Mercedes-Benz, Porsche, and NVIDIA.</w:t>
+        <w:t>Joined as OTA Test Manager; promoted twice in two years to Director of AI Deployment &amp; Solutions — leading NA AI systems, commercial strategy, and technical recruiting across Mercedes-Benz, Porsche, and NVIDIA engagements.</w:t>
       </w:r>
     </w:p>
     <w:p>
       <w:pPr>
-        <w:spacing w:before="40" w:after="40"/>
-        <w:ind w:left="288" w:hanging="288"/>
+        <w:spacing w:before="20" w:after="20" w:line="269" w:lineRule="auto"/>
+        <w:ind w:left="259" w:hanging="259"/>
       </w:pPr>
       <w:r>
         <w:rPr>
-          <w:rFonts w:ascii="Inter" w:hAnsi="Inter" w:cs="Inter" w:eastAsia="Inter"/>
+          <w:rFonts w:ascii="Departure Mono" w:hAnsi="Departure Mono" w:cs="Departure Mono" w:eastAsia="Departure Mono"/>
           <w:b w:val="0"/>
           <w:i w:val="0"/>
           <w:color w:val="154C8C"/>
-          <w:sz w:val="20"/>
+          <w:sz w:val="18"/>
         </w:rPr>
         <w:t xml:space="preserve">— </w:t>
       </w:r>
       <w:r>
         <w:rPr>
-          <w:rFonts w:ascii="Inter" w:hAnsi="Inter" w:cs="Inter" w:eastAsia="Inter"/>
+          <w:rFonts w:ascii="Departure Mono" w:hAnsi="Departure Mono" w:cs="Departure Mono" w:eastAsia="Departure Mono"/>
           <w:b w:val="0"/>
           <w:i w:val="0"/>
           <w:color w:val="3A3A3A"/>
-          <w:sz w:val="20"/>
+          <w:sz w:val="18"/>
         </w:rPr>
-        <w:t>Designed and deployed an agentic intelligence system: structured search sweeps over a target-company database, a four-signal taxonomy with a 20-point scoring rubric and threshold gating, and automated briefing generation into Notion.</w:t>
+        <w:t>Shipped production AI: an agentic intelligence pipeline with rubric scoring and threshold gating; a containerized FastAPI billing service for NVIDIA; Python pipelines that turn JIRA exports into executive decks and score candidates against job descriptions.</w:t>
       </w:r>
     </w:p>
     <w:p>
       <w:pPr>
-        <w:spacing w:before="40" w:after="40"/>
-        <w:ind w:left="288" w:hanging="288"/>
+        <w:spacing w:before="20" w:after="20" w:line="269" w:lineRule="auto"/>
+        <w:ind w:left="259" w:hanging="259"/>
       </w:pPr>
       <w:r>
         <w:rPr>
-          <w:rFonts w:ascii="Inter" w:hAnsi="Inter" w:cs="Inter" w:eastAsia="Inter"/>
+          <w:rFonts w:ascii="Departure Mono" w:hAnsi="Departure Mono" w:cs="Departure Mono" w:eastAsia="Departure Mono"/>
           <w:b w:val="0"/>
           <w:i w:val="0"/>
           <w:color w:val="154C8C"/>
-          <w:sz w:val="20"/>
+          <w:sz w:val="18"/>
         </w:rPr>
         <w:t xml:space="preserve">— </w:t>
       </w:r>
       <w:r>
         <w:rPr>
-          <w:rFonts w:ascii="Inter" w:hAnsi="Inter" w:cs="Inter" w:eastAsia="Inter"/>
+          <w:rFonts w:ascii="Departure Mono" w:hAnsi="Departure Mono" w:cs="Departure Mono" w:eastAsia="Departure Mono"/>
           <w:b w:val="0"/>
           <w:i w:val="0"/>
           <w:color w:val="3A3A3A"/>
-          <w:sz w:val="20"/>
+          <w:sz w:val="18"/>
         </w:rPr>
-        <w:t>Built the time-tracking and billing system for the NVIDIA engagement — encoding non-obvious business rules (per-engineer daily minimums, billed-vs-actual payroll reconciliation) with a containerized FastAPI reporting service, designed for error resistance by non-technical users.</w:t>
+        <w:t>Built the NA engineering team from scratch — 300% headcount growth — and served as primary technical liaison on infotainment, domain-controller, and SDV programs.</w:t>
       </w:r>
     </w:p>
     <w:p>
       <w:pPr>
-        <w:spacing w:before="40" w:after="40"/>
-        <w:ind w:left="288" w:hanging="288"/>
-      </w:pPr>
-      <w:r>
-        <w:rPr>
-          <w:rFonts w:ascii="Inter" w:hAnsi="Inter" w:cs="Inter" w:eastAsia="Inter"/>
-          <w:b w:val="0"/>
-          <w:i w:val="0"/>
-          <w:color w:val="154C8C"/>
-          <w:sz w:val="20"/>
-        </w:rPr>
-        <w:t xml:space="preserve">— </w:t>
-      </w:r>
-      <w:r>
-        <w:rPr>
-          <w:rFonts w:ascii="Inter" w:hAnsi="Inter" w:cs="Inter" w:eastAsia="Inter"/>
-          <w:b w:val="0"/>
-          <w:i w:val="0"/>
-          <w:color w:val="3A3A3A"/>
-          <w:sz w:val="20"/>
-        </w:rPr>
-        <w:t>Shipped a Python document pipeline that converts client JIRA exports into branded executive decks, and a candidate-profiling tool that scores resumes against job descriptions and renders client-ready deliverables.</w:t>
-      </w:r>
-    </w:p>
-    <w:p>
-      <w:pPr>
-        <w:spacing w:before="40" w:after="40"/>
-        <w:ind w:left="288" w:hanging="288"/>
-      </w:pPr>
-      <w:r>
-        <w:rPr>
-          <w:rFonts w:ascii="Inter" w:hAnsi="Inter" w:cs="Inter" w:eastAsia="Inter"/>
-          <w:b w:val="0"/>
-          <w:i w:val="0"/>
-          <w:color w:val="154C8C"/>
-          <w:sz w:val="20"/>
-        </w:rPr>
-        <w:t xml:space="preserve">— </w:t>
-      </w:r>
-      <w:r>
-        <w:rPr>
-          <w:rFonts w:ascii="Inter" w:hAnsi="Inter" w:cs="Inter" w:eastAsia="Inter"/>
-          <w:b w:val="0"/>
-          <w:i w:val="0"/>
-          <w:color w:val="3A3A3A"/>
-          <w:sz w:val="20"/>
-        </w:rPr>
-        <w:t>Built and lead a cross-functional technical team from the ground up — growing engineering headcount 300% and serving as primary technical liaison across OEM programs, validating software for infotainment head units, domain controllers, and SDV architectures.</w:t>
-      </w:r>
-    </w:p>
-    <w:p>
-      <w:pPr>
-        <w:spacing w:before="160" w:after="20"/>
+        <w:spacing w:before="100" w:after="0"/>
         <w:tabs>
           <w:tab w:val="right" w:pos="10800"/>
         </w:tabs>
       </w:pPr>
       <w:r>
         <w:rPr>
-          <w:rFonts w:ascii="JetBrains Mono" w:hAnsi="JetBrains Mono" w:cs="JetBrains Mono" w:eastAsia="JetBrains Mono"/>
+          <w:rFonts w:ascii="Departure Mono" w:hAnsi="Departure Mono" w:cs="Departure Mono" w:eastAsia="Departure Mono"/>
           <w:b w:val="0"/>
           <w:i w:val="0"/>
           <w:color w:val="154C8C"/>
-          <w:sz w:val="16"/>
+          <w:sz w:val="15"/>
           <w:spacing w:val="24"/>
         </w:rPr>
         <w:t xml:space="preserve">EXPERIENCE   </w:t>
       </w:r>
       <w:r>
         <w:rPr>
-          <w:rFonts w:ascii="Inter Tight" w:hAnsi="Inter Tight" w:cs="Inter Tight" w:eastAsia="Inter Tight"/>
+          <w:rFonts w:ascii="Departure Mono" w:hAnsi="Departure Mono" w:cs="Departure Mono" w:eastAsia="Departure Mono"/>
           <w:b w:val="0"/>
           <w:i w:val="0"/>
           <w:color w:val="1A1A1A"/>
-          <w:sz w:val="26"/>
+          <w:sz w:val="22"/>
         </w:rPr>
         <w:t>Lead Test Engineer</w:t>
       </w:r>
@@ -973,11 +562,11 @@
       </w:r>
       <w:r>
         <w:rPr>
-          <w:rFonts w:ascii="JetBrains Mono" w:hAnsi="JetBrains Mono" w:cs="JetBrains Mono" w:eastAsia="JetBrains Mono"/>
+          <w:rFonts w:ascii="Departure Mono" w:hAnsi="Departure Mono" w:cs="Departure Mono" w:eastAsia="Departure Mono"/>
           <w:b w:val="0"/>
           <w:i w:val="0"/>
           <w:color w:val="6A6A6A"/>
-          <w:sz w:val="17"/>
+          <w:sz w:val="16"/>
           <w:spacing w:val="20"/>
         </w:rPr>
         <w:t>DEC 2022 — APR 2023</w:t>
@@ -985,169 +574,91 @@
     </w:p>
     <w:p>
       <w:pPr>
-        <w:spacing w:after="80"/>
+        <w:spacing w:after="40"/>
       </w:pPr>
       <w:r>
         <w:rPr>
-          <w:rFonts w:ascii="JetBrains Mono" w:hAnsi="JetBrains Mono" w:cs="JetBrains Mono" w:eastAsia="JetBrains Mono"/>
+          <w:rFonts w:ascii="Departure Mono" w:hAnsi="Departure Mono" w:cs="Departure Mono" w:eastAsia="Departure Mono"/>
           <w:b w:val="0"/>
           <w:i w:val="0"/>
           <w:color w:val="3A3A3A"/>
-          <w:sz w:val="18"/>
+          <w:sz w:val="16"/>
           <w:spacing w:val="12"/>
         </w:rPr>
         <w:t>PACCAR</w:t>
       </w:r>
       <w:r>
         <w:rPr>
-          <w:rFonts w:ascii="JetBrains Mono" w:hAnsi="JetBrains Mono" w:cs="JetBrains Mono" w:eastAsia="JetBrains Mono"/>
+          <w:rFonts w:ascii="Departure Mono" w:hAnsi="Departure Mono" w:cs="Departure Mono" w:eastAsia="Departure Mono"/>
           <w:b w:val="0"/>
           <w:i w:val="0"/>
           <w:color w:val="A8A5A0"/>
-          <w:sz w:val="18"/>
+          <w:sz w:val="16"/>
         </w:rPr>
         <w:t xml:space="preserve">   ·   </w:t>
       </w:r>
       <w:r>
         <w:rPr>
-          <w:rFonts w:ascii="JetBrains Mono" w:hAnsi="JetBrains Mono" w:cs="JetBrains Mono" w:eastAsia="JetBrains Mono"/>
+          <w:rFonts w:ascii="Departure Mono" w:hAnsi="Departure Mono" w:cs="Departure Mono" w:eastAsia="Departure Mono"/>
           <w:b w:val="0"/>
           <w:i w:val="0"/>
           <w:color w:val="6A6A6A"/>
-          <w:sz w:val="18"/>
+          <w:sz w:val="16"/>
         </w:rPr>
         <w:t>Lewisville, TX</w:t>
       </w:r>
     </w:p>
     <w:p>
       <w:pPr>
-        <w:spacing w:before="40" w:after="40"/>
-        <w:ind w:left="288" w:hanging="288"/>
+        <w:spacing w:before="20" w:after="20" w:line="269" w:lineRule="auto"/>
+        <w:ind w:left="259" w:hanging="259"/>
       </w:pPr>
       <w:r>
         <w:rPr>
-          <w:rFonts w:ascii="Inter" w:hAnsi="Inter" w:cs="Inter" w:eastAsia="Inter"/>
+          <w:rFonts w:ascii="Departure Mono" w:hAnsi="Departure Mono" w:cs="Departure Mono" w:eastAsia="Departure Mono"/>
           <w:b w:val="0"/>
           <w:i w:val="0"/>
           <w:color w:val="154C8C"/>
-          <w:sz w:val="20"/>
+          <w:sz w:val="18"/>
         </w:rPr>
         <w:t xml:space="preserve">— </w:t>
       </w:r>
       <w:r>
         <w:rPr>
-          <w:rFonts w:ascii="Inter" w:hAnsi="Inter" w:cs="Inter" w:eastAsia="Inter"/>
+          <w:rFonts w:ascii="Departure Mono" w:hAnsi="Departure Mono" w:cs="Departure Mono" w:eastAsia="Departure Mono"/>
           <w:b w:val="0"/>
           <w:i w:val="0"/>
           <w:color w:val="3A3A3A"/>
-          <w:sz w:val="20"/>
+          <w:sz w:val="18"/>
         </w:rPr>
-        <w:t>Led end-to-end validation for a new commercial-vehicle electrical/electronic architecture.</w:t>
+        <w:t>Led end-to-end validation of a new commercial-vehicle E/E architecture — ECU communication, diagnostics, and backend integration — coordinating Tier-1s and embedded teams to aggressive release milestones.</w:t>
       </w:r>
     </w:p>
     <w:p>
       <w:pPr>
-        <w:spacing w:before="40" w:after="40"/>
-        <w:ind w:left="288" w:hanging="288"/>
-      </w:pPr>
-      <w:r>
-        <w:rPr>
-          <w:rFonts w:ascii="Inter" w:hAnsi="Inter" w:cs="Inter" w:eastAsia="Inter"/>
-          <w:b w:val="0"/>
-          <w:i w:val="0"/>
-          <w:color w:val="154C8C"/>
-          <w:sz w:val="20"/>
-        </w:rPr>
-        <w:t xml:space="preserve">— </w:t>
-      </w:r>
-      <w:r>
-        <w:rPr>
-          <w:rFonts w:ascii="Inter" w:hAnsi="Inter" w:cs="Inter" w:eastAsia="Inter"/>
-          <w:b w:val="0"/>
-          <w:i w:val="0"/>
-          <w:color w:val="3A3A3A"/>
-          <w:sz w:val="20"/>
-        </w:rPr>
-        <w:t>Coordinated with Tier-1 suppliers, embedded software teams, and program management to meet aggressive release milestones.</w:t>
-      </w:r>
-    </w:p>
-    <w:p>
-      <w:pPr>
-        <w:spacing w:before="40" w:after="40"/>
-        <w:ind w:left="288" w:hanging="288"/>
-      </w:pPr>
-      <w:r>
-        <w:rPr>
-          <w:rFonts w:ascii="Inter" w:hAnsi="Inter" w:cs="Inter" w:eastAsia="Inter"/>
-          <w:b w:val="0"/>
-          <w:i w:val="0"/>
-          <w:color w:val="154C8C"/>
-          <w:sz w:val="20"/>
-        </w:rPr>
-        <w:t xml:space="preserve">— </w:t>
-      </w:r>
-      <w:r>
-        <w:rPr>
-          <w:rFonts w:ascii="Inter" w:hAnsi="Inter" w:cs="Inter" w:eastAsia="Inter"/>
-          <w:b w:val="0"/>
-          <w:i w:val="0"/>
-          <w:color w:val="3A3A3A"/>
-          <w:sz w:val="20"/>
-        </w:rPr>
-        <w:t>Designed and executed test strategies covering in-vehicle ECU communication, diagnostics, and backend network integration.</w:t>
-      </w:r>
-    </w:p>
-    <w:p>
-      <w:pPr>
-        <w:spacing w:before="40" w:after="40"/>
-        <w:ind w:left="288" w:hanging="288"/>
-      </w:pPr>
-      <w:r>
-        <w:rPr>
-          <w:rFonts w:ascii="Inter" w:hAnsi="Inter" w:cs="Inter" w:eastAsia="Inter"/>
-          <w:b w:val="0"/>
-          <w:i w:val="0"/>
-          <w:color w:val="154C8C"/>
-          <w:sz w:val="20"/>
-        </w:rPr>
-        <w:t xml:space="preserve">— </w:t>
-      </w:r>
-      <w:r>
-        <w:rPr>
-          <w:rFonts w:ascii="Inter" w:hAnsi="Inter" w:cs="Inter" w:eastAsia="Inter"/>
-          <w:b w:val="0"/>
-          <w:i w:val="0"/>
-          <w:color w:val="3A3A3A"/>
-          <w:sz w:val="20"/>
-        </w:rPr>
-        <w:t>Triaged failures and drove root-cause analysis across hardware and software stacks.</w:t>
-      </w:r>
-    </w:p>
-    <w:p>
-      <w:pPr>
-        <w:spacing w:before="160" w:after="20"/>
+        <w:spacing w:before="100" w:after="0"/>
         <w:tabs>
           <w:tab w:val="right" w:pos="10800"/>
         </w:tabs>
       </w:pPr>
       <w:r>
         <w:rPr>
-          <w:rFonts w:ascii="JetBrains Mono" w:hAnsi="JetBrains Mono" w:cs="JetBrains Mono" w:eastAsia="JetBrains Mono"/>
+          <w:rFonts w:ascii="Departure Mono" w:hAnsi="Departure Mono" w:cs="Departure Mono" w:eastAsia="Departure Mono"/>
           <w:b w:val="0"/>
           <w:i w:val="0"/>
           <w:color w:val="154C8C"/>
-          <w:sz w:val="16"/>
+          <w:sz w:val="15"/>
           <w:spacing w:val="24"/>
         </w:rPr>
         <w:t xml:space="preserve">EXPERIENCE   </w:t>
       </w:r>
       <w:r>
         <w:rPr>
-          <w:rFonts w:ascii="Inter Tight" w:hAnsi="Inter Tight" w:cs="Inter Tight" w:eastAsia="Inter Tight"/>
+          <w:rFonts w:ascii="Departure Mono" w:hAnsi="Departure Mono" w:cs="Departure Mono" w:eastAsia="Departure Mono"/>
           <w:b w:val="0"/>
           <w:i w:val="0"/>
           <w:color w:val="1A1A1A"/>
-          <w:sz w:val="26"/>
+          <w:sz w:val="22"/>
         </w:rPr>
         <w:t>Senior Test Engineer — Connected Services</w:t>
       </w:r>
@@ -1156,11 +667,11 @@
       </w:r>
       <w:r>
         <w:rPr>
-          <w:rFonts w:ascii="JetBrains Mono" w:hAnsi="JetBrains Mono" w:cs="JetBrains Mono" w:eastAsia="JetBrains Mono"/>
+          <w:rFonts w:ascii="Departure Mono" w:hAnsi="Departure Mono" w:cs="Departure Mono" w:eastAsia="Departure Mono"/>
           <w:b w:val="0"/>
           <w:i w:val="0"/>
           <w:color w:val="6A6A6A"/>
-          <w:sz w:val="17"/>
+          <w:sz w:val="16"/>
           <w:spacing w:val="20"/>
         </w:rPr>
         <w:t>MAR 2020 — DEC 2022</w:t>
@@ -1168,91 +679,91 @@
     </w:p>
     <w:p>
       <w:pPr>
-        <w:spacing w:after="80"/>
+        <w:spacing w:after="40"/>
       </w:pPr>
       <w:r>
         <w:rPr>
-          <w:rFonts w:ascii="JetBrains Mono" w:hAnsi="JetBrains Mono" w:cs="JetBrains Mono" w:eastAsia="JetBrains Mono"/>
+          <w:rFonts w:ascii="Departure Mono" w:hAnsi="Departure Mono" w:cs="Departure Mono" w:eastAsia="Departure Mono"/>
           <w:b w:val="0"/>
           <w:i w:val="0"/>
           <w:color w:val="3A3A3A"/>
-          <w:sz w:val="18"/>
+          <w:sz w:val="16"/>
           <w:spacing w:val="12"/>
         </w:rPr>
         <w:t>Toyota Motor North America</w:t>
       </w:r>
       <w:r>
         <w:rPr>
-          <w:rFonts w:ascii="JetBrains Mono" w:hAnsi="JetBrains Mono" w:cs="JetBrains Mono" w:eastAsia="JetBrains Mono"/>
+          <w:rFonts w:ascii="Departure Mono" w:hAnsi="Departure Mono" w:cs="Departure Mono" w:eastAsia="Departure Mono"/>
           <w:b w:val="0"/>
           <w:i w:val="0"/>
           <w:color w:val="A8A5A0"/>
-          <w:sz w:val="18"/>
+          <w:sz w:val="16"/>
         </w:rPr>
         <w:t xml:space="preserve">   ·   </w:t>
       </w:r>
       <w:r>
         <w:rPr>
-          <w:rFonts w:ascii="JetBrains Mono" w:hAnsi="JetBrains Mono" w:cs="JetBrains Mono" w:eastAsia="JetBrains Mono"/>
+          <w:rFonts w:ascii="Departure Mono" w:hAnsi="Departure Mono" w:cs="Departure Mono" w:eastAsia="Departure Mono"/>
           <w:b w:val="0"/>
           <w:i w:val="0"/>
           <w:color w:val="6A6A6A"/>
-          <w:sz w:val="18"/>
+          <w:sz w:val="16"/>
         </w:rPr>
         <w:t>Plano, TX</w:t>
       </w:r>
     </w:p>
     <w:p>
       <w:pPr>
-        <w:spacing w:before="40" w:after="40"/>
-        <w:ind w:left="288" w:hanging="288"/>
+        <w:spacing w:before="20" w:after="20" w:line="269" w:lineRule="auto"/>
+        <w:ind w:left="259" w:hanging="259"/>
       </w:pPr>
       <w:r>
         <w:rPr>
-          <w:rFonts w:ascii="Inter" w:hAnsi="Inter" w:cs="Inter" w:eastAsia="Inter"/>
+          <w:rFonts w:ascii="Departure Mono" w:hAnsi="Departure Mono" w:cs="Departure Mono" w:eastAsia="Departure Mono"/>
           <w:b w:val="0"/>
           <w:i w:val="0"/>
           <w:color w:val="154C8C"/>
-          <w:sz w:val="20"/>
+          <w:sz w:val="18"/>
         </w:rPr>
         <w:t xml:space="preserve">— </w:t>
       </w:r>
       <w:r>
         <w:rPr>
-          <w:rFonts w:ascii="Inter" w:hAnsi="Inter" w:cs="Inter" w:eastAsia="Inter"/>
+          <w:rFonts w:ascii="Departure Mono" w:hAnsi="Departure Mono" w:cs="Departure Mono" w:eastAsia="Departure Mono"/>
           <w:b w:val="0"/>
           <w:i w:val="0"/>
           <w:color w:val="3A3A3A"/>
-          <w:sz w:val="20"/>
+          <w:sz w:val="18"/>
         </w:rPr>
-        <w:t>Owned end-to-end validation of user profile, registration, and account-activation flows across mobile app, vehicle head unit, and cloud backend for Toyota connected-vehicle applications — serving as technical escalation point and leading global defect triage with Japan HQ.</w:t>
+        <w:t>Owned end-to-end validation of user-profile, registration, and account-activation flows across app, head unit, and cloud for Toyota connected services — technical escalation and global defect triage with Japan HQ.</w:t>
       </w:r>
     </w:p>
     <w:p>
       <w:pPr>
-        <w:spacing w:before="160" w:after="20"/>
+        <w:spacing w:before="100" w:after="0"/>
         <w:tabs>
           <w:tab w:val="right" w:pos="10800"/>
         </w:tabs>
       </w:pPr>
       <w:r>
         <w:rPr>
-          <w:rFonts w:ascii="JetBrains Mono" w:hAnsi="JetBrains Mono" w:cs="JetBrains Mono" w:eastAsia="JetBrains Mono"/>
+          <w:rFonts w:ascii="Departure Mono" w:hAnsi="Departure Mono" w:cs="Departure Mono" w:eastAsia="Departure Mono"/>
           <w:b w:val="0"/>
           <w:i w:val="0"/>
           <w:color w:val="154C8C"/>
-          <w:sz w:val="16"/>
+          <w:sz w:val="15"/>
           <w:spacing w:val="24"/>
         </w:rPr>
         <w:t xml:space="preserve">EXPERIENCE   </w:t>
       </w:r>
       <w:r>
         <w:rPr>
-          <w:rFonts w:ascii="Inter Tight" w:hAnsi="Inter Tight" w:cs="Inter Tight" w:eastAsia="Inter Tight"/>
+          <w:rFonts w:ascii="Departure Mono" w:hAnsi="Departure Mono" w:cs="Departure Mono" w:eastAsia="Departure Mono"/>
           <w:b w:val="0"/>
           <w:i w:val="0"/>
           <w:color w:val="1A1A1A"/>
-          <w:sz w:val="26"/>
+          <w:sz w:val="22"/>
         </w:rPr>
         <w:t>End-to-End Quality Engineer</w:t>
       </w:r>
@@ -1261,11 +772,11 @@
       </w:r>
       <w:r>
         <w:rPr>
-          <w:rFonts w:ascii="JetBrains Mono" w:hAnsi="JetBrains Mono" w:cs="JetBrains Mono" w:eastAsia="JetBrains Mono"/>
+          <w:rFonts w:ascii="Departure Mono" w:hAnsi="Departure Mono" w:cs="Departure Mono" w:eastAsia="Departure Mono"/>
           <w:b w:val="0"/>
           <w:i w:val="0"/>
           <w:color w:val="6A6A6A"/>
-          <w:sz w:val="17"/>
+          <w:sz w:val="16"/>
           <w:spacing w:val="20"/>
         </w:rPr>
         <w:t>MAR 2017 — MAR 2020</w:t>
@@ -1273,91 +784,91 @@
     </w:p>
     <w:p>
       <w:pPr>
-        <w:spacing w:after="80"/>
+        <w:spacing w:after="40"/>
       </w:pPr>
       <w:r>
         <w:rPr>
-          <w:rFonts w:ascii="JetBrains Mono" w:hAnsi="JetBrains Mono" w:cs="JetBrains Mono" w:eastAsia="JetBrains Mono"/>
+          <w:rFonts w:ascii="Departure Mono" w:hAnsi="Departure Mono" w:cs="Departure Mono" w:eastAsia="Departure Mono"/>
           <w:b w:val="0"/>
           <w:i w:val="0"/>
           <w:color w:val="3A3A3A"/>
-          <w:sz w:val="18"/>
+          <w:sz w:val="16"/>
           <w:spacing w:val="12"/>
         </w:rPr>
         <w:t>Mercedes-Benz R&amp;D North America</w:t>
       </w:r>
       <w:r>
         <w:rPr>
-          <w:rFonts w:ascii="JetBrains Mono" w:hAnsi="JetBrains Mono" w:cs="JetBrains Mono" w:eastAsia="JetBrains Mono"/>
+          <w:rFonts w:ascii="Departure Mono" w:hAnsi="Departure Mono" w:cs="Departure Mono" w:eastAsia="Departure Mono"/>
           <w:b w:val="0"/>
           <w:i w:val="0"/>
           <w:color w:val="A8A5A0"/>
-          <w:sz w:val="18"/>
+          <w:sz w:val="16"/>
         </w:rPr>
         <w:t xml:space="preserve">   ·   </w:t>
       </w:r>
       <w:r>
         <w:rPr>
-          <w:rFonts w:ascii="JetBrains Mono" w:hAnsi="JetBrains Mono" w:cs="JetBrains Mono" w:eastAsia="JetBrains Mono"/>
+          <w:rFonts w:ascii="Departure Mono" w:hAnsi="Departure Mono" w:cs="Departure Mono" w:eastAsia="Departure Mono"/>
           <w:b w:val="0"/>
           <w:i w:val="0"/>
           <w:color w:val="6A6A6A"/>
-          <w:sz w:val="18"/>
+          <w:sz w:val="16"/>
         </w:rPr>
         <w:t>Long Beach, CA</w:t>
       </w:r>
     </w:p>
     <w:p>
       <w:pPr>
-        <w:spacing w:before="40" w:after="40"/>
-        <w:ind w:left="288" w:hanging="288"/>
+        <w:spacing w:before="20" w:after="20" w:line="269" w:lineRule="auto"/>
+        <w:ind w:left="259" w:hanging="259"/>
       </w:pPr>
       <w:r>
         <w:rPr>
-          <w:rFonts w:ascii="Inter" w:hAnsi="Inter" w:cs="Inter" w:eastAsia="Inter"/>
+          <w:rFonts w:ascii="Departure Mono" w:hAnsi="Departure Mono" w:cs="Departure Mono" w:eastAsia="Departure Mono"/>
           <w:b w:val="0"/>
           <w:i w:val="0"/>
           <w:color w:val="154C8C"/>
-          <w:sz w:val="20"/>
+          <w:sz w:val="18"/>
         </w:rPr>
         <w:t xml:space="preserve">— </w:t>
       </w:r>
       <w:r>
         <w:rPr>
-          <w:rFonts w:ascii="Inter" w:hAnsi="Inter" w:cs="Inter" w:eastAsia="Inter"/>
+          <w:rFonts w:ascii="Departure Mono" w:hAnsi="Departure Mono" w:cs="Departure Mono" w:eastAsia="Departure Mono"/>
           <w:b w:val="0"/>
           <w:i w:val="0"/>
           <w:color w:val="3A3A3A"/>
-          <w:sz w:val="20"/>
+          <w:sz w:val="18"/>
         </w:rPr>
         <w:t>Led end-to-end testing of integrated vehicle systems — head unit, smartphones, digital assistants (Siri, Alexa), wearables, and IoT devices — on premium infotainment and telematics platforms, closing cross-system integration defects for multi-market launches.</w:t>
       </w:r>
     </w:p>
     <w:p>
       <w:pPr>
-        <w:spacing w:before="160" w:after="20"/>
+        <w:spacing w:before="100" w:after="0"/>
         <w:tabs>
           <w:tab w:val="right" w:pos="10800"/>
         </w:tabs>
       </w:pPr>
       <w:r>
         <w:rPr>
-          <w:rFonts w:ascii="JetBrains Mono" w:hAnsi="JetBrains Mono" w:cs="JetBrains Mono" w:eastAsia="JetBrains Mono"/>
+          <w:rFonts w:ascii="Departure Mono" w:hAnsi="Departure Mono" w:cs="Departure Mono" w:eastAsia="Departure Mono"/>
           <w:b w:val="0"/>
           <w:i w:val="0"/>
           <w:color w:val="154C8C"/>
-          <w:sz w:val="16"/>
+          <w:sz w:val="15"/>
           <w:spacing w:val="24"/>
         </w:rPr>
         <w:t xml:space="preserve">EXPERIENCE   </w:t>
       </w:r>
       <w:r>
         <w:rPr>
-          <w:rFonts w:ascii="Inter Tight" w:hAnsi="Inter Tight" w:cs="Inter Tight" w:eastAsia="Inter Tight"/>
+          <w:rFonts w:ascii="Departure Mono" w:hAnsi="Departure Mono" w:cs="Departure Mono" w:eastAsia="Departure Mono"/>
           <w:b w:val="0"/>
           <w:i w:val="0"/>
           <w:color w:val="1A1A1A"/>
-          <w:sz w:val="26"/>
+          <w:sz w:val="22"/>
         </w:rPr>
         <w:t>Quality Engineer — Telematics</w:t>
       </w:r>
@@ -1366,11 +877,11 @@
       </w:r>
       <w:r>
         <w:rPr>
-          <w:rFonts w:ascii="JetBrains Mono" w:hAnsi="JetBrains Mono" w:cs="JetBrains Mono" w:eastAsia="JetBrains Mono"/>
+          <w:rFonts w:ascii="Departure Mono" w:hAnsi="Departure Mono" w:cs="Departure Mono" w:eastAsia="Departure Mono"/>
           <w:b w:val="0"/>
           <w:i w:val="0"/>
           <w:color w:val="6A6A6A"/>
-          <w:sz w:val="17"/>
+          <w:sz w:val="16"/>
           <w:spacing w:val="20"/>
         </w:rPr>
         <w:t>2013 — 2017</w:t>
@@ -1378,91 +889,91 @@
     </w:p>
     <w:p>
       <w:pPr>
-        <w:spacing w:after="80"/>
+        <w:spacing w:after="40"/>
       </w:pPr>
       <w:r>
         <w:rPr>
-          <w:rFonts w:ascii="JetBrains Mono" w:hAnsi="JetBrains Mono" w:cs="JetBrains Mono" w:eastAsia="JetBrains Mono"/>
+          <w:rFonts w:ascii="Departure Mono" w:hAnsi="Departure Mono" w:cs="Departure Mono" w:eastAsia="Departure Mono"/>
           <w:b w:val="0"/>
           <w:i w:val="0"/>
           <w:color w:val="3A3A3A"/>
-          <w:sz w:val="18"/>
+          <w:sz w:val="16"/>
           <w:spacing w:val="12"/>
         </w:rPr>
         <w:t>Hyundai Autoever Telematics America</w:t>
       </w:r>
       <w:r>
         <w:rPr>
-          <w:rFonts w:ascii="JetBrains Mono" w:hAnsi="JetBrains Mono" w:cs="JetBrains Mono" w:eastAsia="JetBrains Mono"/>
+          <w:rFonts w:ascii="Departure Mono" w:hAnsi="Departure Mono" w:cs="Departure Mono" w:eastAsia="Departure Mono"/>
           <w:b w:val="0"/>
           <w:i w:val="0"/>
           <w:color w:val="A8A5A0"/>
-          <w:sz w:val="18"/>
+          <w:sz w:val="16"/>
         </w:rPr>
         <w:t xml:space="preserve">   ·   </w:t>
       </w:r>
       <w:r>
         <w:rPr>
-          <w:rFonts w:ascii="JetBrains Mono" w:hAnsi="JetBrains Mono" w:cs="JetBrains Mono" w:eastAsia="JetBrains Mono"/>
+          <w:rFonts w:ascii="Departure Mono" w:hAnsi="Departure Mono" w:cs="Departure Mono" w:eastAsia="Departure Mono"/>
           <w:b w:val="0"/>
           <w:i w:val="0"/>
           <w:color w:val="6A6A6A"/>
-          <w:sz w:val="18"/>
+          <w:sz w:val="16"/>
         </w:rPr>
         <w:t>Fountain Valley, CA</w:t>
       </w:r>
     </w:p>
     <w:p>
       <w:pPr>
-        <w:spacing w:before="40" w:after="40"/>
-        <w:ind w:left="288" w:hanging="288"/>
+        <w:spacing w:before="20" w:after="20" w:line="269" w:lineRule="auto"/>
+        <w:ind w:left="259" w:hanging="259"/>
       </w:pPr>
       <w:r>
         <w:rPr>
-          <w:rFonts w:ascii="Inter" w:hAnsi="Inter" w:cs="Inter" w:eastAsia="Inter"/>
+          <w:rFonts w:ascii="Departure Mono" w:hAnsi="Departure Mono" w:cs="Departure Mono" w:eastAsia="Departure Mono"/>
           <w:b w:val="0"/>
           <w:i w:val="0"/>
           <w:color w:val="154C8C"/>
-          <w:sz w:val="20"/>
+          <w:sz w:val="18"/>
         </w:rPr>
         <w:t xml:space="preserve">— </w:t>
       </w:r>
       <w:r>
         <w:rPr>
-          <w:rFonts w:ascii="Inter" w:hAnsi="Inter" w:cs="Inter" w:eastAsia="Inter"/>
+          <w:rFonts w:ascii="Departure Mono" w:hAnsi="Departure Mono" w:cs="Departure Mono" w:eastAsia="Departure Mono"/>
           <w:b w:val="0"/>
           <w:i w:val="0"/>
           <w:color w:val="3A3A3A"/>
-          <w:sz w:val="20"/>
+          <w:sz w:val="18"/>
         </w:rPr>
         <w:t>Designed QA processes for Hyundai telematics — DCM, head unit, and backend connectivity — validating hardware–software integrations across embedded firmware, cloud APIs, and mobile clients in a startup-scale environment.</w:t>
       </w:r>
     </w:p>
     <w:p>
       <w:pPr>
-        <w:spacing w:before="160" w:after="20"/>
+        <w:spacing w:before="100" w:after="0"/>
         <w:tabs>
           <w:tab w:val="right" w:pos="10800"/>
         </w:tabs>
       </w:pPr>
       <w:r>
         <w:rPr>
-          <w:rFonts w:ascii="JetBrains Mono" w:hAnsi="JetBrains Mono" w:cs="JetBrains Mono" w:eastAsia="JetBrains Mono"/>
+          <w:rFonts w:ascii="Departure Mono" w:hAnsi="Departure Mono" w:cs="Departure Mono" w:eastAsia="Departure Mono"/>
           <w:b w:val="0"/>
           <w:i w:val="0"/>
           <w:color w:val="154C8C"/>
-          <w:sz w:val="16"/>
+          <w:sz w:val="15"/>
           <w:spacing w:val="24"/>
         </w:rPr>
         <w:t xml:space="preserve">EDUCATION   </w:t>
       </w:r>
       <w:r>
         <w:rPr>
-          <w:rFonts w:ascii="Inter Tight" w:hAnsi="Inter Tight" w:cs="Inter Tight" w:eastAsia="Inter Tight"/>
+          <w:rFonts w:ascii="Departure Mono" w:hAnsi="Departure Mono" w:cs="Departure Mono" w:eastAsia="Departure Mono"/>
           <w:b w:val="0"/>
           <w:i w:val="0"/>
           <w:color w:val="1A1A1A"/>
-          <w:sz w:val="26"/>
+          <w:sz w:val="22"/>
         </w:rPr>
         <w:t>Bachelor of Science, Computer Science</w:t>
       </w:r>
@@ -1471,834 +982,14 @@
       </w:r>
       <w:r>
         <w:rPr>
-          <w:rFonts w:ascii="JetBrains Mono" w:hAnsi="JetBrains Mono" w:cs="JetBrains Mono" w:eastAsia="JetBrains Mono"/>
+          <w:rFonts w:ascii="Departure Mono" w:hAnsi="Departure Mono" w:cs="Departure Mono" w:eastAsia="Departure Mono"/>
           <w:b w:val="0"/>
           <w:i w:val="0"/>
           <w:color w:val="6A6A6A"/>
-          <w:sz w:val="17"/>
+          <w:sz w:val="16"/>
           <w:spacing w:val="20"/>
         </w:rPr>
         <w:t>2008 — 2012</w:t>
-      </w:r>
-    </w:p>
-    <w:p>
-      <w:pPr>
-        <w:spacing w:after="80"/>
-      </w:pPr>
-      <w:r>
-        <w:rPr>
-          <w:rFonts w:ascii="JetBrains Mono" w:hAnsi="JetBrains Mono" w:cs="JetBrains Mono" w:eastAsia="JetBrains Mono"/>
-          <w:b w:val="0"/>
-          <w:i w:val="0"/>
-          <w:color w:val="3A3A3A"/>
-          <w:sz w:val="18"/>
-          <w:spacing w:val="12"/>
-        </w:rPr>
-        <w:t>California State University, Long Beach</w:t>
-      </w:r>
-      <w:r>
-        <w:rPr>
-          <w:rFonts w:ascii="JetBrains Mono" w:hAnsi="JetBrains Mono" w:cs="JetBrains Mono" w:eastAsia="JetBrains Mono"/>
-          <w:b w:val="0"/>
-          <w:i w:val="0"/>
-          <w:color w:val="A8A5A0"/>
-          <w:sz w:val="18"/>
-        </w:rPr>
-        <w:t xml:space="preserve">   ·   </w:t>
-      </w:r>
-      <w:r>
-        <w:rPr>
-          <w:rFonts w:ascii="JetBrains Mono" w:hAnsi="JetBrains Mono" w:cs="JetBrains Mono" w:eastAsia="JetBrains Mono"/>
-          <w:b w:val="0"/>
-          <w:i w:val="0"/>
-          <w:color w:val="6A6A6A"/>
-          <w:sz w:val="18"/>
-        </w:rPr>
-        <w:t>Long Beach, CA</w:t>
-      </w:r>
-    </w:p>
-    <w:p>
-      <w:pPr>
-        <w:spacing w:before="40" w:after="40"/>
-        <w:ind w:left="288" w:hanging="288"/>
-      </w:pPr>
-      <w:r>
-        <w:rPr>
-          <w:rFonts w:ascii="Inter" w:hAnsi="Inter" w:cs="Inter" w:eastAsia="Inter"/>
-          <w:b w:val="0"/>
-          <w:i w:val="0"/>
-          <w:color w:val="154C8C"/>
-          <w:sz w:val="20"/>
-        </w:rPr>
-        <w:t xml:space="preserve">— </w:t>
-      </w:r>
-      <w:r>
-        <w:rPr>
-          <w:rFonts w:ascii="Inter" w:hAnsi="Inter" w:cs="Inter" w:eastAsia="Inter"/>
-          <w:b w:val="0"/>
-          <w:i w:val="0"/>
-          <w:color w:val="3A3A3A"/>
-          <w:sz w:val="20"/>
-        </w:rPr>
-        <w:t>Four-year degree in Computer Science — foundation in systems, algorithms, and software architecture.</w:t>
-      </w:r>
-    </w:p>
-    <w:p>
-      <w:pPr>
-        <w:spacing w:before="320" w:after="120"/>
-        <w:pBdr>
-          <w:bottom w:val="single" w:sz="4" w:space="4" w:color="DDD9D1"/>
-        </w:pBdr>
-      </w:pPr>
-      <w:r>
-        <w:rPr>
-          <w:rFonts w:ascii="JetBrains Mono" w:hAnsi="JetBrains Mono" w:cs="JetBrains Mono" w:eastAsia="JetBrains Mono"/>
-          <w:b w:val="0"/>
-          <w:i w:val="0"/>
-          <w:color w:val="A8A5A0"/>
-          <w:sz w:val="18"/>
-          <w:spacing w:val="20"/>
-        </w:rPr>
-        <w:t xml:space="preserve">04   </w:t>
-      </w:r>
-      <w:r>
-        <w:rPr>
-          <w:rFonts w:ascii="JetBrains Mono" w:hAnsi="JetBrains Mono" w:cs="JetBrains Mono" w:eastAsia="JetBrains Mono"/>
-          <w:b w:val="0"/>
-          <w:i w:val="0"/>
-          <w:color w:val="1A1A1A"/>
-          <w:sz w:val="18"/>
-          <w:spacing w:val="30"/>
-        </w:rPr>
-        <w:t>TECHNICAL SKILLS &amp; TOOLS</w:t>
-      </w:r>
-    </w:p>
-    <w:p>
-      <w:pPr>
-        <w:spacing w:before="80" w:after="40"/>
-      </w:pPr>
-      <w:r>
-        <w:rPr>
-          <w:rFonts w:ascii="JetBrains Mono" w:hAnsi="JetBrains Mono" w:cs="JetBrains Mono" w:eastAsia="JetBrains Mono"/>
-          <w:b w:val="0"/>
-          <w:i w:val="0"/>
-          <w:color w:val="1A1A1A"/>
-          <w:sz w:val="17"/>
-          <w:spacing w:val="24"/>
-        </w:rPr>
-        <w:t xml:space="preserve">AI &amp; AGENTIC SYSTEMS   </w:t>
-      </w:r>
-    </w:p>
-    <w:p>
-      <w:pPr>
-        <w:spacing w:after="80" w:line="312" w:lineRule="auto"/>
-        <w:ind w:left="0"/>
-      </w:pPr>
-      <w:r>
-        <w:rPr>
-          <w:rFonts w:ascii="Inter" w:hAnsi="Inter" w:cs="Inter" w:eastAsia="Inter"/>
-          <w:b w:val="0"/>
-          <w:i w:val="0"/>
-          <w:color w:val="3A3A3A"/>
-          <w:sz w:val="20"/>
-        </w:rPr>
-        <w:t>Agentic pipelines and workflows, LLM integration (OpenAI, Perplexity), RAG, prompt engineering, scoring rubrics and threshold gating, AI agents for engineering and business workflows</w:t>
-      </w:r>
-    </w:p>
-    <w:p>
-      <w:pPr>
-        <w:spacing w:before="80" w:after="40"/>
-      </w:pPr>
-      <w:r>
-        <w:rPr>
-          <w:rFonts w:ascii="JetBrains Mono" w:hAnsi="JetBrains Mono" w:cs="JetBrains Mono" w:eastAsia="JetBrains Mono"/>
-          <w:b w:val="0"/>
-          <w:i w:val="0"/>
-          <w:color w:val="1A1A1A"/>
-          <w:sz w:val="17"/>
-          <w:spacing w:val="24"/>
-        </w:rPr>
-        <w:t xml:space="preserve">BUILDING &amp; SHIPPING   </w:t>
-      </w:r>
-    </w:p>
-    <w:p>
-      <w:pPr>
-        <w:spacing w:after="80" w:line="312" w:lineRule="auto"/>
-        <w:ind w:left="0"/>
-      </w:pPr>
-      <w:r>
-        <w:rPr>
-          <w:rFonts w:ascii="Inter" w:hAnsi="Inter" w:cs="Inter" w:eastAsia="Inter"/>
-          <w:b w:val="0"/>
-          <w:i w:val="0"/>
-          <w:color w:val="3A3A3A"/>
-          <w:sz w:val="20"/>
-        </w:rPr>
-        <w:t>Python, FastAPI, Docker, REST APIs, document automation (python-pptx), Stripe, OAuth, Vercel, Neon Postgres, Git/GitHub, Linear, Claude Code</w:t>
-      </w:r>
-    </w:p>
-    <w:p>
-      <w:pPr>
-        <w:spacing w:before="80" w:after="40"/>
-      </w:pPr>
-      <w:r>
-        <w:rPr>
-          <w:rFonts w:ascii="JetBrains Mono" w:hAnsi="JetBrains Mono" w:cs="JetBrains Mono" w:eastAsia="JetBrains Mono"/>
-          <w:b w:val="0"/>
-          <w:i w:val="0"/>
-          <w:color w:val="1A1A1A"/>
-          <w:sz w:val="17"/>
-          <w:spacing w:val="24"/>
-        </w:rPr>
-        <w:t xml:space="preserve">AUTOMOTIVE DOMAINS   </w:t>
-      </w:r>
-    </w:p>
-    <w:p>
-      <w:pPr>
-        <w:spacing w:after="80" w:line="312" w:lineRule="auto"/>
-        <w:ind w:left="0"/>
-      </w:pPr>
-      <w:r>
-        <w:rPr>
-          <w:rFonts w:ascii="Inter" w:hAnsi="Inter" w:cs="Inter" w:eastAsia="Inter"/>
-          <w:b w:val="0"/>
-          <w:i w:val="0"/>
-          <w:color w:val="3A3A3A"/>
-          <w:sz w:val="20"/>
-        </w:rPr>
-        <w:t>DCM, Infotainment, Telematics, Connected Vehicle, ECU Communication, OTA Updates, ADAS, Software-Defined Vehicle (SDV)</w:t>
-      </w:r>
-    </w:p>
-    <w:p>
-      <w:pPr>
-        <w:spacing w:before="80" w:after="40"/>
-      </w:pPr>
-      <w:r>
-        <w:rPr>
-          <w:rFonts w:ascii="JetBrains Mono" w:hAnsi="JetBrains Mono" w:cs="JetBrains Mono" w:eastAsia="JetBrains Mono"/>
-          <w:b w:val="0"/>
-          <w:i w:val="0"/>
-          <w:color w:val="1A1A1A"/>
-          <w:sz w:val="17"/>
-          <w:spacing w:val="24"/>
-        </w:rPr>
-        <w:t xml:space="preserve">SYSTEMS &amp; INTEGRATION   </w:t>
-      </w:r>
-    </w:p>
-    <w:p>
-      <w:pPr>
-        <w:spacing w:after="80" w:line="312" w:lineRule="auto"/>
-        <w:ind w:left="0"/>
-      </w:pPr>
-      <w:r>
-        <w:rPr>
-          <w:rFonts w:ascii="Inter" w:hAnsi="Inter" w:cs="Inter" w:eastAsia="Inter"/>
-          <w:b w:val="0"/>
-          <w:i w:val="0"/>
-          <w:color w:val="3A3A3A"/>
-          <w:sz w:val="20"/>
-        </w:rPr>
-        <w:t>Embedded system architecture, hardware/software stack debugging, CAN-based diagnostics exposure, HIL and vehicle testing, backend/cloud API integration, user profile and account service flows</w:t>
-      </w:r>
-    </w:p>
-    <w:p>
-      <w:pPr>
-        <w:spacing w:before="80" w:after="40"/>
-      </w:pPr>
-      <w:r>
-        <w:rPr>
-          <w:rFonts w:ascii="JetBrains Mono" w:hAnsi="JetBrains Mono" w:cs="JetBrains Mono" w:eastAsia="JetBrains Mono"/>
-          <w:b w:val="0"/>
-          <w:i w:val="0"/>
-          <w:color w:val="1A1A1A"/>
-          <w:sz w:val="17"/>
-          <w:spacing w:val="24"/>
-        </w:rPr>
-        <w:t xml:space="preserve">PROCESS &amp; TOOLING   </w:t>
-      </w:r>
-    </w:p>
-    <w:p>
-      <w:pPr>
-        <w:spacing w:after="80" w:line="312" w:lineRule="auto"/>
-        <w:ind w:left="0"/>
-      </w:pPr>
-      <w:r>
-        <w:rPr>
-          <w:rFonts w:ascii="Inter" w:hAnsi="Inter" w:cs="Inter" w:eastAsia="Inter"/>
-          <w:b w:val="0"/>
-          <w:i w:val="0"/>
-          <w:color w:val="3A3A3A"/>
-          <w:sz w:val="20"/>
-        </w:rPr>
-        <w:t>Technical specification authoring, requirements discovery, test case design and validation, defect triage, JIRA, Confluence, Notion, Git, Agile/Scrum, release management</w:t>
-      </w:r>
-    </w:p>
-    <w:p>
-      <w:pPr>
-        <w:spacing w:before="320" w:after="120"/>
-        <w:pBdr>
-          <w:bottom w:val="single" w:sz="4" w:space="4" w:color="DDD9D1"/>
-        </w:pBdr>
-      </w:pPr>
-      <w:r>
-        <w:rPr>
-          <w:rFonts w:ascii="JetBrains Mono" w:hAnsi="JetBrains Mono" w:cs="JetBrains Mono" w:eastAsia="JetBrains Mono"/>
-          <w:b w:val="0"/>
-          <w:i w:val="0"/>
-          <w:color w:val="A8A5A0"/>
-          <w:sz w:val="18"/>
-          <w:spacing w:val="20"/>
-        </w:rPr>
-        <w:t xml:space="preserve">05   </w:t>
-      </w:r>
-      <w:r>
-        <w:rPr>
-          <w:rFonts w:ascii="JetBrains Mono" w:hAnsi="JetBrains Mono" w:cs="JetBrains Mono" w:eastAsia="JetBrains Mono"/>
-          <w:b w:val="0"/>
-          <w:i w:val="0"/>
-          <w:color w:val="1A1A1A"/>
-          <w:sz w:val="18"/>
-          <w:spacing w:val="30"/>
-        </w:rPr>
-        <w:t>HIGHLIGHTS</w:t>
-      </w:r>
-    </w:p>
-    <w:p>
-      <w:pPr>
-        <w:spacing w:before="80" w:after="20"/>
-        <w:tabs>
-          <w:tab w:val="right" w:pos="10800"/>
-        </w:tabs>
-      </w:pPr>
-      <w:r>
-        <w:rPr>
-          <w:rFonts w:ascii="Inter Tight" w:hAnsi="Inter Tight" w:cs="Inter Tight" w:eastAsia="Inter Tight"/>
-          <w:b w:val="0"/>
-          <w:i w:val="0"/>
-          <w:color w:val="1A1A1A"/>
-          <w:sz w:val="24"/>
-        </w:rPr>
-        <w:t>Guest speaker, Mercedes-Benz R&amp;D North America</w:t>
-      </w:r>
-      <w:r>
-        <w:tab/>
-      </w:r>
-      <w:r>
-        <w:rPr>
-          <w:rFonts w:ascii="JetBrains Mono" w:hAnsi="JetBrains Mono" w:cs="JetBrains Mono" w:eastAsia="JetBrains Mono"/>
-          <w:b w:val="0"/>
-          <w:i w:val="0"/>
-          <w:color w:val="154C8C"/>
-          <w:sz w:val="18"/>
-          <w:spacing w:val="20"/>
-        </w:rPr>
-        <w:t>2025</w:t>
-      </w:r>
-    </w:p>
-    <w:p>
-      <w:pPr>
-        <w:spacing w:after="80" w:line="312" w:lineRule="auto"/>
-      </w:pPr>
-      <w:r>
-        <w:rPr>
-          <w:rFonts w:ascii="Inter" w:hAnsi="Inter" w:cs="Inter" w:eastAsia="Inter"/>
-          <w:b w:val="0"/>
-          <w:i w:val="0"/>
-          <w:color w:val="3A3A3A"/>
-          <w:sz w:val="20"/>
-        </w:rPr>
-        <w:t>Returned to the Long Beach R&amp;D campus — the same site where I led end-to-end vehicle testing eight years earlier — to present on applied AI and large language models in the automotive stack.</w:t>
-      </w:r>
-    </w:p>
-    <w:p>
-      <w:pPr>
-        <w:spacing w:before="320" w:after="120"/>
-        <w:pBdr>
-          <w:bottom w:val="single" w:sz="4" w:space="4" w:color="DDD9D1"/>
-        </w:pBdr>
-      </w:pPr>
-      <w:r>
-        <w:rPr>
-          <w:rFonts w:ascii="JetBrains Mono" w:hAnsi="JetBrains Mono" w:cs="JetBrains Mono" w:eastAsia="JetBrains Mono"/>
-          <w:b w:val="0"/>
-          <w:i w:val="0"/>
-          <w:color w:val="A8A5A0"/>
-          <w:sz w:val="18"/>
-          <w:spacing w:val="20"/>
-        </w:rPr>
-        <w:t xml:space="preserve">06   </w:t>
-      </w:r>
-      <w:r>
-        <w:rPr>
-          <w:rFonts w:ascii="JetBrains Mono" w:hAnsi="JetBrains Mono" w:cs="JetBrains Mono" w:eastAsia="JetBrains Mono"/>
-          <w:b w:val="0"/>
-          <w:i w:val="0"/>
-          <w:color w:val="1A1A1A"/>
-          <w:sz w:val="18"/>
-          <w:spacing w:val="30"/>
-        </w:rPr>
-        <w:t>PROJECTS</w:t>
-      </w:r>
-    </w:p>
-    <w:p>
-      <w:pPr>
-        <w:spacing w:before="160" w:after="20"/>
-        <w:tabs>
-          <w:tab w:val="right" w:pos="10800"/>
-        </w:tabs>
-      </w:pPr>
-      <w:r>
-        <w:rPr>
-          <w:rFonts w:ascii="Inter Tight" w:hAnsi="Inter Tight" w:cs="Inter Tight" w:eastAsia="Inter Tight"/>
-          <w:b w:val="0"/>
-          <w:i w:val="0"/>
-          <w:color w:val="1A1A1A"/>
-          <w:sz w:val="26"/>
-        </w:rPr>
-        <w:t>The Knew York Times</w:t>
-      </w:r>
-      <w:r>
-        <w:tab/>
-      </w:r>
-      <w:r>
-        <w:rPr>
-          <w:rFonts w:ascii="JetBrains Mono" w:hAnsi="JetBrains Mono" w:cs="JetBrains Mono" w:eastAsia="JetBrains Mono"/>
-          <w:b w:val="0"/>
-          <w:i w:val="0"/>
-          <w:color w:val="154C8C"/>
-          <w:sz w:val="18"/>
-          <w:spacing w:val="20"/>
-        </w:rPr>
-        <w:t>2026</w:t>
-      </w:r>
-    </w:p>
-    <w:p>
-      <w:pPr>
-        <w:spacing w:after="80"/>
-      </w:pPr>
-      <w:r>
-        <w:rPr>
-          <w:rFonts w:ascii="JetBrains Mono" w:hAnsi="JetBrains Mono" w:cs="JetBrains Mono" w:eastAsia="JetBrains Mono"/>
-          <w:b w:val="0"/>
-          <w:i w:val="0"/>
-          <w:color w:val="3A3A3A"/>
-          <w:sz w:val="18"/>
-          <w:spacing w:val="12"/>
-        </w:rPr>
-        <w:t>FOUNDER</w:t>
-      </w:r>
-      <w:r>
-        <w:rPr>
-          <w:rFonts w:ascii="JetBrains Mono" w:hAnsi="JetBrains Mono" w:cs="JetBrains Mono" w:eastAsia="JetBrains Mono"/>
-          <w:b w:val="0"/>
-          <w:i w:val="0"/>
-          <w:color w:val="A8A5A0"/>
-          <w:sz w:val="18"/>
-        </w:rPr>
-        <w:t xml:space="preserve">   ·   </w:t>
-      </w:r>
-      <w:r>
-        <w:rPr>
-          <w:rFonts w:ascii="JetBrains Mono" w:hAnsi="JetBrains Mono" w:cs="JetBrains Mono" w:eastAsia="JetBrains Mono"/>
-          <w:b w:val="0"/>
-          <w:i w:val="0"/>
-          <w:color w:val="6A6A6A"/>
-          <w:sz w:val="18"/>
-        </w:rPr>
-        <w:t>kytimes.ai</w:t>
-      </w:r>
-    </w:p>
-    <w:p>
-      <w:pPr>
-        <w:spacing w:after="40" w:line="312" w:lineRule="auto"/>
-      </w:pPr>
-      <w:r>
-        <w:rPr>
-          <w:rFonts w:ascii="Inter" w:hAnsi="Inter" w:cs="Inter" w:eastAsia="Inter"/>
-          <w:b w:val="0"/>
-          <w:i w:val="0"/>
-          <w:color w:val="6A6A6A"/>
-          <w:sz w:val="20"/>
-        </w:rPr>
-        <w:t>A satirical bestseller-list platform where rankings are openly bought — built, launched, and operated as a real company.</w:t>
-      </w:r>
-    </w:p>
-    <w:p>
-      <w:pPr>
-        <w:spacing w:before="40" w:after="40"/>
-        <w:ind w:left="288" w:hanging="288"/>
-      </w:pPr>
-      <w:r>
-        <w:rPr>
-          <w:rFonts w:ascii="Inter" w:hAnsi="Inter" w:cs="Inter" w:eastAsia="Inter"/>
-          <w:b w:val="0"/>
-          <w:i w:val="0"/>
-          <w:color w:val="154C8C"/>
-          <w:sz w:val="20"/>
-        </w:rPr>
-        <w:t xml:space="preserve">— </w:t>
-      </w:r>
-      <w:r>
-        <w:rPr>
-          <w:rFonts w:ascii="Inter" w:hAnsi="Inter" w:cs="Inter" w:eastAsia="Inter"/>
-          <w:b w:val="0"/>
-          <w:i w:val="0"/>
-          <w:color w:val="3A3A3A"/>
-          <w:sz w:val="20"/>
-        </w:rPr>
-        <w:t>Designed, built, and launched a production SaaS end-to-end — weekly-updated, genre-specific bestseller lists with bid-based placement, week-by-week archives, and social sharing.</w:t>
-      </w:r>
-    </w:p>
-    <w:p>
-      <w:pPr>
-        <w:spacing w:before="40" w:after="40"/>
-        <w:ind w:left="288" w:hanging="288"/>
-      </w:pPr>
-      <w:r>
-        <w:rPr>
-          <w:rFonts w:ascii="Inter" w:hAnsi="Inter" w:cs="Inter" w:eastAsia="Inter"/>
-          <w:b w:val="0"/>
-          <w:i w:val="0"/>
-          <w:color w:val="154C8C"/>
-          <w:sz w:val="20"/>
-        </w:rPr>
-        <w:t xml:space="preserve">— </w:t>
-      </w:r>
-      <w:r>
-        <w:rPr>
-          <w:rFonts w:ascii="Inter" w:hAnsi="Inter" w:cs="Inter" w:eastAsia="Inter"/>
-          <w:b w:val="0"/>
-          <w:i w:val="0"/>
-          <w:color w:val="3A3A3A"/>
-          <w:sz w:val="20"/>
-        </w:rPr>
-        <w:t>Implemented full user management with Google and Apple OAuth — account creation, sessions, and profile flows.</w:t>
-      </w:r>
-    </w:p>
-    <w:p>
-      <w:pPr>
-        <w:spacing w:before="40" w:after="40"/>
-        <w:ind w:left="288" w:hanging="288"/>
-      </w:pPr>
-      <w:r>
-        <w:rPr>
-          <w:rFonts w:ascii="Inter" w:hAnsi="Inter" w:cs="Inter" w:eastAsia="Inter"/>
-          <w:b w:val="0"/>
-          <w:i w:val="0"/>
-          <w:color w:val="154C8C"/>
-          <w:sz w:val="20"/>
-        </w:rPr>
-        <w:t xml:space="preserve">— </w:t>
-      </w:r>
-      <w:r>
-        <w:rPr>
-          <w:rFonts w:ascii="Inter" w:hAnsi="Inter" w:cs="Inter" w:eastAsia="Inter"/>
-          <w:b w:val="0"/>
-          <w:i w:val="0"/>
-          <w:color w:val="3A3A3A"/>
-          <w:sz w:val="20"/>
-        </w:rPr>
-        <w:t>Integrated Stripe for payment processing of ranked placements — checkout, billing, and webhook-driven fulfillment.</w:t>
-      </w:r>
-    </w:p>
-    <w:p>
-      <w:pPr>
-        <w:spacing w:before="40" w:after="40"/>
-        <w:ind w:left="288" w:hanging="288"/>
-      </w:pPr>
-      <w:r>
-        <w:rPr>
-          <w:rFonts w:ascii="Inter" w:hAnsi="Inter" w:cs="Inter" w:eastAsia="Inter"/>
-          <w:b w:val="0"/>
-          <w:i w:val="0"/>
-          <w:color w:val="154C8C"/>
-          <w:sz w:val="20"/>
-        </w:rPr>
-        <w:t xml:space="preserve">— </w:t>
-      </w:r>
-      <w:r>
-        <w:rPr>
-          <w:rFonts w:ascii="Inter" w:hAnsi="Inter" w:cs="Inter" w:eastAsia="Inter"/>
-          <w:b w:val="0"/>
-          <w:i w:val="0"/>
-          <w:color w:val="3A3A3A"/>
-          <w:sz w:val="20"/>
-        </w:rPr>
-        <w:t>Formed a registered LLC and operate the product as a real business — legal disclaimers, analytics, and affiliate monetization.</w:t>
-      </w:r>
-    </w:p>
-    <w:p>
-      <w:pPr>
-        <w:spacing w:before="80" w:after="40"/>
-      </w:pPr>
-      <w:r>
-        <w:rPr>
-          <w:rFonts w:ascii="JetBrains Mono" w:hAnsi="JetBrains Mono" w:cs="JetBrains Mono" w:eastAsia="JetBrains Mono"/>
-          <w:b w:val="0"/>
-          <w:i w:val="0"/>
-          <w:color w:val="154C8C"/>
-          <w:sz w:val="17"/>
-        </w:rPr>
-        <w:t>#</w:t>
-      </w:r>
-      <w:r>
-        <w:rPr>
-          <w:rFonts w:ascii="JetBrains Mono" w:hAnsi="JetBrains Mono" w:cs="JetBrains Mono" w:eastAsia="JetBrains Mono"/>
-          <w:b w:val="0"/>
-          <w:i w:val="0"/>
-          <w:color w:val="6A6A6A"/>
-          <w:sz w:val="17"/>
-          <w:spacing w:val="12"/>
-        </w:rPr>
-        <w:t>Linear</w:t>
-      </w:r>
-      <w:r>
-        <w:rPr>
-          <w:rFonts w:ascii="JetBrains Mono" w:hAnsi="JetBrains Mono" w:cs="JetBrains Mono" w:eastAsia="JetBrains Mono"/>
-          <w:b w:val="0"/>
-          <w:i w:val="0"/>
-          <w:color w:val="6A6A6A"/>
-          <w:sz w:val="17"/>
-        </w:rPr>
-        <w:t xml:space="preserve">   </w:t>
-      </w:r>
-      <w:r>
-        <w:rPr>
-          <w:rFonts w:ascii="JetBrains Mono" w:hAnsi="JetBrains Mono" w:cs="JetBrains Mono" w:eastAsia="JetBrains Mono"/>
-          <w:b w:val="0"/>
-          <w:i w:val="0"/>
-          <w:color w:val="154C8C"/>
-          <w:sz w:val="17"/>
-        </w:rPr>
-        <w:t>#</w:t>
-      </w:r>
-      <w:r>
-        <w:rPr>
-          <w:rFonts w:ascii="JetBrains Mono" w:hAnsi="JetBrains Mono" w:cs="JetBrains Mono" w:eastAsia="JetBrains Mono"/>
-          <w:b w:val="0"/>
-          <w:i w:val="0"/>
-          <w:color w:val="6A6A6A"/>
-          <w:sz w:val="17"/>
-          <w:spacing w:val="12"/>
-        </w:rPr>
-        <w:t>ClaudeCodeCLI</w:t>
-      </w:r>
-      <w:r>
-        <w:rPr>
-          <w:rFonts w:ascii="JetBrains Mono" w:hAnsi="JetBrains Mono" w:cs="JetBrains Mono" w:eastAsia="JetBrains Mono"/>
-          <w:b w:val="0"/>
-          <w:i w:val="0"/>
-          <w:color w:val="6A6A6A"/>
-          <w:sz w:val="17"/>
-        </w:rPr>
-        <w:t xml:space="preserve">   </w:t>
-      </w:r>
-      <w:r>
-        <w:rPr>
-          <w:rFonts w:ascii="JetBrains Mono" w:hAnsi="JetBrains Mono" w:cs="JetBrains Mono" w:eastAsia="JetBrains Mono"/>
-          <w:b w:val="0"/>
-          <w:i w:val="0"/>
-          <w:color w:val="154C8C"/>
-          <w:sz w:val="17"/>
-        </w:rPr>
-        <w:t>#</w:t>
-      </w:r>
-      <w:r>
-        <w:rPr>
-          <w:rFonts w:ascii="JetBrains Mono" w:hAnsi="JetBrains Mono" w:cs="JetBrains Mono" w:eastAsia="JetBrains Mono"/>
-          <w:b w:val="0"/>
-          <w:i w:val="0"/>
-          <w:color w:val="6A6A6A"/>
-          <w:sz w:val="17"/>
-          <w:spacing w:val="12"/>
-        </w:rPr>
-        <w:t>Vercel</w:t>
-      </w:r>
-      <w:r>
-        <w:rPr>
-          <w:rFonts w:ascii="JetBrains Mono" w:hAnsi="JetBrains Mono" w:cs="JetBrains Mono" w:eastAsia="JetBrains Mono"/>
-          <w:b w:val="0"/>
-          <w:i w:val="0"/>
-          <w:color w:val="6A6A6A"/>
-          <w:sz w:val="17"/>
-        </w:rPr>
-        <w:t xml:space="preserve">   </w:t>
-      </w:r>
-      <w:r>
-        <w:rPr>
-          <w:rFonts w:ascii="JetBrains Mono" w:hAnsi="JetBrains Mono" w:cs="JetBrains Mono" w:eastAsia="JetBrains Mono"/>
-          <w:b w:val="0"/>
-          <w:i w:val="0"/>
-          <w:color w:val="154C8C"/>
-          <w:sz w:val="17"/>
-        </w:rPr>
-        <w:t>#</w:t>
-      </w:r>
-      <w:r>
-        <w:rPr>
-          <w:rFonts w:ascii="JetBrains Mono" w:hAnsi="JetBrains Mono" w:cs="JetBrains Mono" w:eastAsia="JetBrains Mono"/>
-          <w:b w:val="0"/>
-          <w:i w:val="0"/>
-          <w:color w:val="6A6A6A"/>
-          <w:sz w:val="17"/>
-          <w:spacing w:val="12"/>
-        </w:rPr>
-        <w:t>Neon.Tech</w:t>
-      </w:r>
-      <w:r>
-        <w:rPr>
-          <w:rFonts w:ascii="JetBrains Mono" w:hAnsi="JetBrains Mono" w:cs="JetBrains Mono" w:eastAsia="JetBrains Mono"/>
-          <w:b w:val="0"/>
-          <w:i w:val="0"/>
-          <w:color w:val="6A6A6A"/>
-          <w:sz w:val="17"/>
-        </w:rPr>
-        <w:t xml:space="preserve">   </w:t>
-      </w:r>
-      <w:r>
-        <w:rPr>
-          <w:rFonts w:ascii="JetBrains Mono" w:hAnsi="JetBrains Mono" w:cs="JetBrains Mono" w:eastAsia="JetBrains Mono"/>
-          <w:b w:val="0"/>
-          <w:i w:val="0"/>
-          <w:color w:val="154C8C"/>
-          <w:sz w:val="17"/>
-        </w:rPr>
-        <w:t>#</w:t>
-      </w:r>
-      <w:r>
-        <w:rPr>
-          <w:rFonts w:ascii="JetBrains Mono" w:hAnsi="JetBrains Mono" w:cs="JetBrains Mono" w:eastAsia="JetBrains Mono"/>
-          <w:b w:val="0"/>
-          <w:i w:val="0"/>
-          <w:color w:val="6A6A6A"/>
-          <w:sz w:val="17"/>
-          <w:spacing w:val="12"/>
-        </w:rPr>
-        <w:t>Stripe</w:t>
-      </w:r>
-      <w:r>
-        <w:rPr>
-          <w:rFonts w:ascii="JetBrains Mono" w:hAnsi="JetBrains Mono" w:cs="JetBrains Mono" w:eastAsia="JetBrains Mono"/>
-          <w:b w:val="0"/>
-          <w:i w:val="0"/>
-          <w:color w:val="6A6A6A"/>
-          <w:sz w:val="17"/>
-        </w:rPr>
-        <w:t xml:space="preserve">   </w:t>
-      </w:r>
-      <w:r>
-        <w:rPr>
-          <w:rFonts w:ascii="JetBrains Mono" w:hAnsi="JetBrains Mono" w:cs="JetBrains Mono" w:eastAsia="JetBrains Mono"/>
-          <w:b w:val="0"/>
-          <w:i w:val="0"/>
-          <w:color w:val="154C8C"/>
-          <w:sz w:val="17"/>
-        </w:rPr>
-        <w:t>#</w:t>
-      </w:r>
-      <w:r>
-        <w:rPr>
-          <w:rFonts w:ascii="JetBrains Mono" w:hAnsi="JetBrains Mono" w:cs="JetBrains Mono" w:eastAsia="JetBrains Mono"/>
-          <w:b w:val="0"/>
-          <w:i w:val="0"/>
-          <w:color w:val="6A6A6A"/>
-          <w:sz w:val="17"/>
-          <w:spacing w:val="12"/>
-        </w:rPr>
-        <w:t>OAuth</w:t>
-      </w:r>
-      <w:r>
-        <w:rPr>
-          <w:rFonts w:ascii="JetBrains Mono" w:hAnsi="JetBrains Mono" w:cs="JetBrains Mono" w:eastAsia="JetBrains Mono"/>
-          <w:b w:val="0"/>
-          <w:i w:val="0"/>
-          <w:color w:val="6A6A6A"/>
-          <w:sz w:val="17"/>
-        </w:rPr>
-        <w:t xml:space="preserve">   </w:t>
-      </w:r>
-      <w:r>
-        <w:rPr>
-          <w:rFonts w:ascii="JetBrains Mono" w:hAnsi="JetBrains Mono" w:cs="JetBrains Mono" w:eastAsia="JetBrains Mono"/>
-          <w:b w:val="0"/>
-          <w:i w:val="0"/>
-          <w:color w:val="154C8C"/>
-          <w:sz w:val="17"/>
-        </w:rPr>
-        <w:t>#</w:t>
-      </w:r>
-      <w:r>
-        <w:rPr>
-          <w:rFonts w:ascii="JetBrains Mono" w:hAnsi="JetBrains Mono" w:cs="JetBrains Mono" w:eastAsia="JetBrains Mono"/>
-          <w:b w:val="0"/>
-          <w:i w:val="0"/>
-          <w:color w:val="6A6A6A"/>
-          <w:sz w:val="17"/>
-          <w:spacing w:val="12"/>
-        </w:rPr>
-        <w:t>GitHub</w:t>
-      </w:r>
-    </w:p>
-    <w:p>
-      <w:pPr>
-        <w:spacing w:before="320" w:after="120"/>
-        <w:pBdr>
-          <w:bottom w:val="single" w:sz="4" w:space="4" w:color="DDD9D1"/>
-        </w:pBdr>
-      </w:pPr>
-      <w:r>
-        <w:rPr>
-          <w:rFonts w:ascii="JetBrains Mono" w:hAnsi="JetBrains Mono" w:cs="JetBrains Mono" w:eastAsia="JetBrains Mono"/>
-          <w:b w:val="0"/>
-          <w:i w:val="0"/>
-          <w:color w:val="A8A5A0"/>
-          <w:sz w:val="18"/>
-          <w:spacing w:val="20"/>
-        </w:rPr>
-        <w:t xml:space="preserve">07   </w:t>
-      </w:r>
-      <w:r>
-        <w:rPr>
-          <w:rFonts w:ascii="JetBrains Mono" w:hAnsi="JetBrains Mono" w:cs="JetBrains Mono" w:eastAsia="JetBrains Mono"/>
-          <w:b w:val="0"/>
-          <w:i w:val="0"/>
-          <w:color w:val="1A1A1A"/>
-          <w:sz w:val="18"/>
-          <w:spacing w:val="30"/>
-        </w:rPr>
-        <w:t>CERTIFICATIONS</w:t>
-      </w:r>
-    </w:p>
-    <w:p>
-      <w:pPr>
-        <w:spacing w:before="60" w:after="40"/>
-        <w:tabs>
-          <w:tab w:val="right" w:pos="10800"/>
-        </w:tabs>
-      </w:pPr>
-      <w:r>
-        <w:rPr>
-          <w:rFonts w:ascii="Inter Tight" w:hAnsi="Inter Tight" w:cs="Inter Tight" w:eastAsia="Inter Tight"/>
-          <w:b w:val="0"/>
-          <w:i w:val="0"/>
-          <w:color w:val="1A1A1A"/>
-          <w:sz w:val="24"/>
-        </w:rPr>
-        <w:t>Designing and Building AI Products and Services</w:t>
-      </w:r>
-      <w:r>
-        <w:tab/>
-      </w:r>
-      <w:r>
-        <w:rPr>
-          <w:rFonts w:ascii="JetBrains Mono" w:hAnsi="JetBrains Mono" w:cs="JetBrains Mono" w:eastAsia="JetBrains Mono"/>
-          <w:b w:val="0"/>
-          <w:i w:val="0"/>
-          <w:color w:val="154C8C"/>
-          <w:sz w:val="18"/>
-          <w:spacing w:val="20"/>
-        </w:rPr>
-        <w:t>2025</w:t>
       </w:r>
     </w:p>
     <w:p>
@@ -2307,230 +998,300 @@
       </w:pPr>
       <w:r>
         <w:rPr>
-          <w:rFonts w:ascii="JetBrains Mono" w:hAnsi="JetBrains Mono" w:cs="JetBrains Mono" w:eastAsia="JetBrains Mono"/>
+          <w:rFonts w:ascii="Departure Mono" w:hAnsi="Departure Mono" w:cs="Departure Mono" w:eastAsia="Departure Mono"/>
+          <w:b w:val="0"/>
+          <w:i w:val="0"/>
+          <w:color w:val="3A3A3A"/>
+          <w:sz w:val="16"/>
+          <w:spacing w:val="12"/>
+        </w:rPr>
+        <w:t>California State University, Long Beach</w:t>
+      </w:r>
+      <w:r>
+        <w:rPr>
+          <w:rFonts w:ascii="Departure Mono" w:hAnsi="Departure Mono" w:cs="Departure Mono" w:eastAsia="Departure Mono"/>
+          <w:b w:val="0"/>
+          <w:i w:val="0"/>
+          <w:color w:val="A8A5A0"/>
+          <w:sz w:val="16"/>
+        </w:rPr>
+        <w:t xml:space="preserve">   ·   </w:t>
+      </w:r>
+      <w:r>
+        <w:rPr>
+          <w:rFonts w:ascii="Departure Mono" w:hAnsi="Departure Mono" w:cs="Departure Mono" w:eastAsia="Departure Mono"/>
           <w:b w:val="0"/>
           <w:i w:val="0"/>
           <w:color w:val="6A6A6A"/>
-          <w:sz w:val="18"/>
-          <w:spacing w:val="16"/>
+          <w:sz w:val="16"/>
         </w:rPr>
-        <w:t>MIT xPRO — Professional Certificate Program</w:t>
+        <w:t>Long Beach, CA</w:t>
       </w:r>
     </w:p>
     <w:p>
       <w:pPr>
-        <w:spacing w:before="320" w:after="120"/>
+        <w:spacing w:before="160" w:after="60"/>
         <w:pBdr>
           <w:bottom w:val="single" w:sz="4" w:space="4" w:color="DDD9D1"/>
         </w:pBdr>
       </w:pPr>
       <w:r>
         <w:rPr>
-          <w:rFonts w:ascii="JetBrains Mono" w:hAnsi="JetBrains Mono" w:cs="JetBrains Mono" w:eastAsia="JetBrains Mono"/>
+          <w:rFonts w:ascii="Departure Mono" w:hAnsi="Departure Mono" w:cs="Departure Mono" w:eastAsia="Departure Mono"/>
           <w:b w:val="0"/>
           <w:i w:val="0"/>
           <w:color w:val="A8A5A0"/>
-          <w:sz w:val="18"/>
+          <w:sz w:val="16"/>
           <w:spacing w:val="20"/>
         </w:rPr>
-        <w:t xml:space="preserve">08   </w:t>
+        <w:t xml:space="preserve">04   </w:t>
       </w:r>
       <w:r>
         <w:rPr>
-          <w:rFonts w:ascii="JetBrains Mono" w:hAnsi="JetBrains Mono" w:cs="JetBrains Mono" w:eastAsia="JetBrains Mono"/>
+          <w:rFonts w:ascii="Departure Mono" w:hAnsi="Departure Mono" w:cs="Departure Mono" w:eastAsia="Departure Mono"/>
           <w:b w:val="0"/>
           <w:i w:val="0"/>
           <w:color w:val="1A1A1A"/>
-          <w:sz w:val="18"/>
+          <w:sz w:val="16"/>
           <w:spacing w:val="30"/>
         </w:rPr>
-        <w:t>LANGUAGES</w:t>
+        <w:t>TECHNICAL SKILLS &amp; TOOLS</w:t>
       </w:r>
     </w:p>
     <w:p>
       <w:pPr>
-        <w:spacing w:after="80"/>
+        <w:spacing w:before="20" w:after="20" w:line="264" w:lineRule="auto"/>
       </w:pPr>
       <w:r>
         <w:rPr>
-          <w:rFonts w:ascii="Inter Tight" w:hAnsi="Inter Tight" w:cs="Inter Tight" w:eastAsia="Inter Tight"/>
+          <w:rFonts w:ascii="Departure Mono" w:hAnsi="Departure Mono" w:cs="Departure Mono" w:eastAsia="Departure Mono"/>
           <w:b w:val="0"/>
           <w:i w:val="0"/>
           <w:color w:val="1A1A1A"/>
-          <w:sz w:val="22"/>
+          <w:sz w:val="15"/>
+          <w:spacing w:val="20"/>
         </w:rPr>
-        <w:t>English</w:t>
+        <w:t xml:space="preserve">AI &amp; AGENTIC SYSTEMS  </w:t>
       </w:r>
       <w:r>
         <w:rPr>
-          <w:rFonts w:ascii="JetBrains Mono" w:hAnsi="JetBrains Mono" w:cs="JetBrains Mono" w:eastAsia="JetBrains Mono"/>
+          <w:rFonts w:ascii="Departure Mono" w:hAnsi="Departure Mono" w:cs="Departure Mono" w:eastAsia="Departure Mono"/>
           <w:b w:val="0"/>
           <w:i w:val="0"/>
-          <w:color w:val="6A6A6A"/>
-          <w:sz w:val="16"/>
+          <w:color w:val="3A3A3A"/>
+          <w:sz w:val="17"/>
+        </w:rPr>
+        <w:t>Agentic pipelines, LLM/RAG, scoring rubrics, threshold gating</w:t>
+      </w:r>
+    </w:p>
+    <w:p>
+      <w:pPr>
+        <w:spacing w:before="20" w:after="20" w:line="264" w:lineRule="auto"/>
+      </w:pPr>
+      <w:r>
+        <w:rPr>
+          <w:rFonts w:ascii="Departure Mono" w:hAnsi="Departure Mono" w:cs="Departure Mono" w:eastAsia="Departure Mono"/>
+          <w:b w:val="0"/>
+          <w:i w:val="0"/>
+          <w:color w:val="1A1A1A"/>
+          <w:sz w:val="15"/>
           <w:spacing w:val="20"/>
         </w:rPr>
-        <w:t xml:space="preserve"> NATIVE</w:t>
+        <w:t xml:space="preserve">BUILDING &amp; SHIPPING  </w:t>
       </w:r>
       <w:r>
         <w:rPr>
-          <w:rFonts w:ascii="JetBrains Mono" w:hAnsi="JetBrains Mono" w:cs="JetBrains Mono" w:eastAsia="JetBrains Mono"/>
+          <w:rFonts w:ascii="Departure Mono" w:hAnsi="Departure Mono" w:cs="Departure Mono" w:eastAsia="Departure Mono"/>
+          <w:b w:val="0"/>
+          <w:i w:val="0"/>
+          <w:color w:val="3A3A3A"/>
+          <w:sz w:val="17"/>
+        </w:rPr>
+        <w:t>Python, FastAPI, Docker, REST, python-pptx, Stripe, OAuth, Vercel, Neon, GitHub</w:t>
+      </w:r>
+    </w:p>
+    <w:p>
+      <w:pPr>
+        <w:spacing w:before="20" w:after="20" w:line="264" w:lineRule="auto"/>
+      </w:pPr>
+      <w:r>
+        <w:rPr>
+          <w:rFonts w:ascii="Departure Mono" w:hAnsi="Departure Mono" w:cs="Departure Mono" w:eastAsia="Departure Mono"/>
+          <w:b w:val="0"/>
+          <w:i w:val="0"/>
+          <w:color w:val="1A1A1A"/>
+          <w:sz w:val="15"/>
+          <w:spacing w:val="20"/>
+        </w:rPr>
+        <w:t xml:space="preserve">AUTOMOTIVE DOMAINS  </w:t>
+      </w:r>
+      <w:r>
+        <w:rPr>
+          <w:rFonts w:ascii="Departure Mono" w:hAnsi="Departure Mono" w:cs="Departure Mono" w:eastAsia="Departure Mono"/>
+          <w:b w:val="0"/>
+          <w:i w:val="0"/>
+          <w:color w:val="3A3A3A"/>
+          <w:sz w:val="17"/>
+        </w:rPr>
+        <w:t>DCM, Infotainment, Telematics, Connected Vehicle, ECU, OTA, ADAS, SDV</w:t>
+      </w:r>
+    </w:p>
+    <w:p>
+      <w:pPr>
+        <w:spacing w:before="20" w:after="20" w:line="264" w:lineRule="auto"/>
+      </w:pPr>
+      <w:r>
+        <w:rPr>
+          <w:rFonts w:ascii="Departure Mono" w:hAnsi="Departure Mono" w:cs="Departure Mono" w:eastAsia="Departure Mono"/>
+          <w:b w:val="0"/>
+          <w:i w:val="0"/>
+          <w:color w:val="1A1A1A"/>
+          <w:sz w:val="15"/>
+          <w:spacing w:val="20"/>
+        </w:rPr>
+        <w:t xml:space="preserve">SYSTEMS &amp; INTEGRATION  </w:t>
+      </w:r>
+      <w:r>
+        <w:rPr>
+          <w:rFonts w:ascii="Departure Mono" w:hAnsi="Departure Mono" w:cs="Departure Mono" w:eastAsia="Departure Mono"/>
+          <w:b w:val="0"/>
+          <w:i w:val="0"/>
+          <w:color w:val="3A3A3A"/>
+          <w:sz w:val="17"/>
+        </w:rPr>
+        <w:t>Embedded architecture, HIL/vehicle testing, CAN diagnostics, cloud API integration</w:t>
+      </w:r>
+    </w:p>
+    <w:p>
+      <w:pPr>
+        <w:spacing w:before="120" w:after="0" w:line="264" w:lineRule="auto"/>
+        <w:pBdr>
+          <w:top w:val="single" w:sz="4" w:space="4" w:color="DDD9D1"/>
+        </w:pBdr>
+      </w:pPr>
+      <w:r>
+        <w:rPr>
+          <w:rFonts w:ascii="Departure Mono" w:hAnsi="Departure Mono" w:cs="Departure Mono" w:eastAsia="Departure Mono"/>
+          <w:b w:val="0"/>
+          <w:i w:val="0"/>
+          <w:color w:val="3A3A3A"/>
+          <w:sz w:val="16"/>
+        </w:rPr>
+        <w:t>MIT xPRO 2025</w:t>
+      </w:r>
+      <w:r>
+        <w:rPr>
+          <w:rFonts w:ascii="Departure Mono" w:hAnsi="Departure Mono" w:cs="Departure Mono" w:eastAsia="Departure Mono"/>
           <w:b w:val="0"/>
           <w:i w:val="0"/>
           <w:color w:val="A8A5A0"/>
-          <w:sz w:val="18"/>
+          <w:sz w:val="15"/>
         </w:rPr>
         <w:t xml:space="preserve">   ·   </w:t>
       </w:r>
       <w:r>
         <w:rPr>
-          <w:rFonts w:ascii="Inter Tight" w:hAnsi="Inter Tight" w:cs="Inter Tight" w:eastAsia="Inter Tight"/>
+          <w:rFonts w:ascii="Departure Mono" w:hAnsi="Departure Mono" w:cs="Departure Mono" w:eastAsia="Departure Mono"/>
           <w:b w:val="0"/>
           <w:i w:val="0"/>
-          <w:color w:val="1A1A1A"/>
-          <w:sz w:val="22"/>
+          <w:color w:val="3A3A3A"/>
+          <w:sz w:val="16"/>
         </w:rPr>
-        <w:t>Spanish</w:t>
+        <w:t>MBRDNA guest speaker 2025</w:t>
       </w:r>
       <w:r>
         <w:rPr>
-          <w:rFonts w:ascii="JetBrains Mono" w:hAnsi="JetBrains Mono" w:cs="JetBrains Mono" w:eastAsia="JetBrains Mono"/>
-          <w:b w:val="0"/>
-          <w:i w:val="0"/>
-          <w:color w:val="6A6A6A"/>
-          <w:sz w:val="16"/>
-          <w:spacing w:val="20"/>
-        </w:rPr>
-        <w:t xml:space="preserve"> BILINGUAL</w:t>
-      </w:r>
-      <w:r>
-        <w:rPr>
-          <w:rFonts w:ascii="JetBrains Mono" w:hAnsi="JetBrains Mono" w:cs="JetBrains Mono" w:eastAsia="JetBrains Mono"/>
+          <w:rFonts w:ascii="Departure Mono" w:hAnsi="Departure Mono" w:cs="Departure Mono" w:eastAsia="Departure Mono"/>
           <w:b w:val="0"/>
           <w:i w:val="0"/>
           <w:color w:val="A8A5A0"/>
-          <w:sz w:val="18"/>
+          <w:sz w:val="15"/>
         </w:rPr>
         <w:t xml:space="preserve">   ·   </w:t>
       </w:r>
       <w:r>
         <w:rPr>
-          <w:rFonts w:ascii="Inter Tight" w:hAnsi="Inter Tight" w:cs="Inter Tight" w:eastAsia="Inter Tight"/>
-          <w:b w:val="0"/>
-          <w:i/>
-          <w:color w:val="1A1A1A"/>
-          <w:sz w:val="22"/>
-        </w:rPr>
-        <w:t>German</w:t>
-      </w:r>
-      <w:r>
-        <w:rPr>
-          <w:rFonts w:ascii="JetBrains Mono" w:hAnsi="JetBrains Mono" w:cs="JetBrains Mono" w:eastAsia="JetBrains Mono"/>
-          <w:b w:val="0"/>
-          <w:i w:val="0"/>
-          <w:color w:val="6A6A6A"/>
-          <w:sz w:val="16"/>
-          <w:spacing w:val="20"/>
-        </w:rPr>
-        <w:t xml:space="preserve"> VERY VERY VERY LITTLE</w:t>
-      </w:r>
-    </w:p>
-    <w:p>
-      <w:pPr>
-        <w:spacing w:before="320" w:after="120"/>
-        <w:keepNext/>
-        <w:pBdr>
-          <w:bottom w:val="single" w:sz="4" w:space="4" w:color="DDD9D1"/>
-        </w:pBdr>
-      </w:pPr>
-      <w:r>
-        <w:rPr>
-          <w:rFonts w:ascii="JetBrains Mono" w:hAnsi="JetBrains Mono" w:cs="JetBrains Mono" w:eastAsia="JetBrains Mono"/>
-          <w:b w:val="0"/>
-          <w:i w:val="0"/>
-          <w:color w:val="A8A5A0"/>
-          <w:sz w:val="18"/>
-          <w:spacing w:val="20"/>
-        </w:rPr>
-        <w:t xml:space="preserve">XX   </w:t>
-      </w:r>
-      <w:r>
-        <w:rPr>
-          <w:rFonts w:ascii="JetBrains Mono" w:hAnsi="JetBrains Mono" w:cs="JetBrains Mono" w:eastAsia="JetBrains Mono"/>
-          <w:b w:val="0"/>
-          <w:i w:val="0"/>
-          <w:color w:val="1A1A1A"/>
-          <w:sz w:val="18"/>
-          <w:spacing w:val="30"/>
-        </w:rPr>
-        <w:t>COMPANION SITE</w:t>
-      </w:r>
-    </w:p>
-    <w:p>
-      <w:pPr>
-        <w:keepNext/>
-        <w:spacing w:after="80"/>
-      </w:pPr>
-      <w:r>
-        <w:rPr>
-          <w:rFonts w:ascii="JetBrains Mono" w:hAnsi="JetBrains Mono" w:cs="JetBrains Mono" w:eastAsia="JetBrains Mono"/>
+          <w:rFonts w:ascii="Departure Mono" w:hAnsi="Departure Mono" w:cs="Departure Mono" w:eastAsia="Departure Mono"/>
           <w:b w:val="0"/>
           <w:i w:val="0"/>
           <w:color w:val="3A3A3A"/>
-          <w:sz w:val="18"/>
-          <w:spacing w:val="12"/>
+          <w:sz w:val="16"/>
         </w:rPr>
-        <w:t>https://www.efrain.me/</w:t>
-      </w:r>
-    </w:p>
-    <w:p>
-      <w:pPr>
-        <w:spacing w:before="40"/>
-        <w:jc w:val="center"/>
-      </w:pPr>
-      <w:r>
-        <w:drawing>
-          <wp:inline xmlns:a="http://schemas.openxmlformats.org/drawingml/2006/main" xmlns:pic="http://schemas.openxmlformats.org/drawingml/2006/picture">
-            <wp:extent cx="1097280" cy="1097280"/>
-            <wp:docPr id="2" name="Picture 2"/>
-            <wp:cNvGraphicFramePr>
-              <a:graphicFrameLocks noChangeAspect="1"/>
-            </wp:cNvGraphicFramePr>
-            <a:graphic>
-              <a:graphicData uri="http://schemas.openxmlformats.org/drawingml/2006/picture">
-                <pic:pic>
-                  <pic:nvPicPr>
-                    <pic:cNvPr id="0" name="qr_efrain_me.png"/>
-                    <pic:cNvPicPr/>
-                  </pic:nvPicPr>
-                  <pic:blipFill>
-                    <a:blip r:embed="rId10"/>
-                    <a:stretch>
-                      <a:fillRect/>
-                    </a:stretch>
-                  </pic:blipFill>
-                  <pic:spPr>
-                    <a:xfrm>
-                      <a:off x="0" y="0"/>
-                      <a:ext cx="1097280" cy="1097280"/>
-                    </a:xfrm>
-                    <a:prstGeom prst="rect"/>
-                  </pic:spPr>
-                </pic:pic>
-              </a:graphicData>
-            </a:graphic>
-          </wp:inline>
-        </w:drawing>
+        <w:t>English · Spanish</w:t>
       </w:r>
     </w:p>
     <w:sectPr>
+      <w:footerReference w:type="default" r:id="rId9"/>
       <w:pgSz w:w="12240" w:h="15840"/>
-      <w:pgMar w:top="720" w:right="720" w:bottom="720" w:left="720" w:header="720" w:footer="720" w:gutter="0"/>
+      <w:pgMar w:top="547" w:right="720" w:bottom="1181" w:left="720" w:header="720" w:footer="317" w:gutter="0"/>
       <w:cols w:space="720"/>
       <w:docGrid w:linePitch="360"/>
     </w:sectPr>
   </w:body>
 </w:document>
+</file>
+
+<file path=word/footer1.xml><?xml version="1.0" encoding="utf-8"?>
+<w:ftr xmlns:m="http://schemas.openxmlformats.org/officeDocument/2006/math" xmlns:mc="http://schemas.openxmlformats.org/markup-compatibility/2006" xmlns:mo="http://schemas.microsoft.com/office/mac/office/2008/main" xmlns:mv="urn:schemas-microsoft-com:mac:vml" xmlns:o="urn:schemas-microsoft-com:office:office" xmlns:r="http://schemas.openxmlformats.org/officeDocument/2006/relationships" xmlns:v="urn:schemas-microsoft-com:vml" xmlns:w10="urn:schemas-microsoft-com:office:word" xmlns:w14="http://schemas.microsoft.com/office/word/2010/wordml" xmlns:w="http://schemas.openxmlformats.org/wordprocessingml/2006/main" xmlns:wne="http://schemas.microsoft.com/office/word/2006/wordml" xmlns:wp14="http://schemas.microsoft.com/office/word/2010/wordprocessingDrawing" xmlns:wp="http://schemas.openxmlformats.org/drawingml/2006/wordprocessingDrawing" xmlns:wpc="http://schemas.microsoft.com/office/word/2010/wordprocessingCanvas" xmlns:wpg="http://schemas.microsoft.com/office/word/2010/wordprocessingGroup" xmlns:wpi="http://schemas.microsoft.com/office/word/2010/wordprocessingInk" xmlns:wps="http://schemas.microsoft.com/office/word/2010/wordprocessingShape" mc:Ignorable="w14 wp14">
+  <w:p>
+    <w:pPr>
+      <w:pStyle w:val="Footer"/>
+      <w:spacing w:before="0" w:after="0"/>
+      <w:jc w:val="right"/>
+    </w:pPr>
+    <w:r>
+      <w:drawing>
+        <wp:inline xmlns:a="http://schemas.openxmlformats.org/drawingml/2006/main" xmlns:pic="http://schemas.openxmlformats.org/drawingml/2006/picture">
+          <wp:extent cx="475488" cy="475488"/>
+          <wp:docPr id="1" name="Picture 1"/>
+          <wp:cNvGraphicFramePr>
+            <a:graphicFrameLocks noChangeAspect="1"/>
+          </wp:cNvGraphicFramePr>
+          <a:graphic>
+            <a:graphicData uri="http://schemas.openxmlformats.org/drawingml/2006/picture">
+              <pic:pic>
+                <pic:nvPicPr>
+                  <pic:cNvPr id="0" name="qr_efrain_me.png"/>
+                  <pic:cNvPicPr/>
+                </pic:nvPicPr>
+                <pic:blipFill>
+                  <a:blip r:embed="rId1"/>
+                  <a:stretch>
+                    <a:fillRect/>
+                  </a:stretch>
+                </pic:blipFill>
+                <pic:spPr>
+                  <a:xfrm>
+                    <a:off x="0" y="0"/>
+                    <a:ext cx="475488" cy="475488"/>
+                  </a:xfrm>
+                  <a:prstGeom prst="rect"/>
+                </pic:spPr>
+              </pic:pic>
+            </a:graphicData>
+          </a:graphic>
+        </wp:inline>
+      </w:drawing>
+    </w:r>
+  </w:p>
+  <w:p>
+    <w:pPr>
+      <w:spacing w:before="20" w:after="0"/>
+      <w:jc w:val="right"/>
+    </w:pPr>
+    <w:r>
+      <w:rPr>
+        <w:rFonts w:ascii="Departure Mono" w:hAnsi="Departure Mono" w:cs="Departure Mono" w:eastAsia="Departure Mono"/>
+        <w:b w:val="0"/>
+        <w:i w:val="0"/>
+        <w:color w:val="6A6A6A"/>
+        <w:sz w:val="13"/>
+        <w:spacing w:val="16"/>
+      </w:rPr>
+      <w:t>COMPANION SITE</w:t>
+    </w:r>
+  </w:p>
+</w:ftr>
 </file>
 
 <file path=word/numbering.xml><?xml version="1.0" encoding="utf-8"?>
@@ -2897,9 +1658,9 @@
     <w:qFormat/>
     <w:rsid w:val="00FC693F"/>
     <w:rPr>
-      <w:rFonts w:ascii="Inter" w:hAnsi="Inter"/>
+      <w:rFonts w:ascii="Departure Mono" w:hAnsi="Departure Mono"/>
       <w:color w:val="3A3A3A"/>
-      <w:sz w:val="20"/>
+      <w:sz w:val="18"/>
     </w:rPr>
   </w:style>
   <w:style w:type="paragraph" w:styleId="Header">

</xml_diff>

<commit_message>
Ship the hero glow and refresh the resume for October 2026.
The downloadable file is the one-page version, and the site date now reads Oct 2026.

Co-authored-by: Cursor <cursoragent@cursor.com>
</commit_message>
<xml_diff>
--- a/uploads/Efrain_Plascencia_Resume.docx
+++ b/uploads/Efrain_Plascencia_Resume.docx
@@ -49,7 +49,7 @@
       </w:pPr>
       <w:r>
         <w:rPr>
-          <w:rFonts w:ascii="Departure Mono" w:hAnsi="Departure Mono" w:cs="Departure Mono" w:eastAsia="Departure Mono"/>
+          <w:rFonts w:ascii="Inter Tight" w:hAnsi="Inter Tight" w:cs="Inter Tight" w:eastAsia="Inter Tight"/>
           <w:b w:val="0"/>
           <w:i w:val="0"/>
           <w:color w:val="1A1A1A"/>
@@ -65,7 +65,7 @@
       </w:pPr>
       <w:r>
         <w:rPr>
-          <w:rFonts w:ascii="Departure Mono" w:hAnsi="Departure Mono" w:cs="Departure Mono" w:eastAsia="Departure Mono"/>
+          <w:rFonts w:ascii="JetBrains Mono" w:hAnsi="JetBrains Mono" w:cs="JetBrains Mono" w:eastAsia="JetBrains Mono"/>
           <w:b w:val="0"/>
           <w:i w:val="0"/>
           <w:color w:val="6A6A6A"/>
@@ -82,7 +82,7 @@
       </w:pPr>
       <w:r>
         <w:rPr>
-          <w:rFonts w:ascii="Departure Mono" w:hAnsi="Departure Mono" w:cs="Departure Mono" w:eastAsia="Departure Mono"/>
+          <w:rFonts w:ascii="JetBrains Mono" w:hAnsi="JetBrains Mono" w:cs="JetBrains Mono" w:eastAsia="JetBrains Mono"/>
           <w:b w:val="0"/>
           <w:i w:val="0"/>
           <w:color w:val="3A3A3A"/>
@@ -102,7 +102,7 @@
       </w:pPr>
       <w:r>
         <w:rPr>
-          <w:rFonts w:ascii="Departure Mono" w:hAnsi="Departure Mono" w:cs="Departure Mono" w:eastAsia="Departure Mono"/>
+          <w:rFonts w:ascii="JetBrains Mono" w:hAnsi="JetBrains Mono" w:cs="JetBrains Mono" w:eastAsia="JetBrains Mono"/>
           <w:b w:val="0"/>
           <w:i w:val="0"/>
           <w:color w:val="3A3A3A"/>
@@ -121,7 +121,7 @@
       </w:pPr>
       <w:r>
         <w:rPr>
-          <w:rFonts w:ascii="Departure Mono" w:hAnsi="Departure Mono" w:cs="Departure Mono" w:eastAsia="Departure Mono"/>
+          <w:rFonts w:ascii="JetBrains Mono" w:hAnsi="JetBrains Mono" w:cs="JetBrains Mono" w:eastAsia="JetBrains Mono"/>
           <w:b w:val="0"/>
           <w:i w:val="0"/>
           <w:color w:val="A8A5A0"/>
@@ -132,7 +132,7 @@
       </w:r>
       <w:r>
         <w:rPr>
-          <w:rFonts w:ascii="Departure Mono" w:hAnsi="Departure Mono" w:cs="Departure Mono" w:eastAsia="Departure Mono"/>
+          <w:rFonts w:ascii="JetBrains Mono" w:hAnsi="JetBrains Mono" w:cs="JetBrains Mono" w:eastAsia="JetBrains Mono"/>
           <w:b w:val="0"/>
           <w:i w:val="0"/>
           <w:color w:val="1A1A1A"/>
@@ -148,7 +148,7 @@
       </w:pPr>
       <w:r>
         <w:rPr>
-          <w:rFonts w:ascii="Departure Mono" w:hAnsi="Departure Mono" w:cs="Departure Mono" w:eastAsia="Departure Mono"/>
+          <w:rFonts w:ascii="Inter" w:hAnsi="Inter" w:cs="Inter" w:eastAsia="Inter"/>
           <w:b w:val="0"/>
           <w:i w:val="0"/>
           <w:color w:val="3A3A3A"/>
@@ -166,7 +166,7 @@
       </w:pPr>
       <w:r>
         <w:rPr>
-          <w:rFonts w:ascii="Departure Mono" w:hAnsi="Departure Mono" w:cs="Departure Mono" w:eastAsia="Departure Mono"/>
+          <w:rFonts w:ascii="JetBrains Mono" w:hAnsi="JetBrains Mono" w:cs="JetBrains Mono" w:eastAsia="JetBrains Mono"/>
           <w:b w:val="0"/>
           <w:i w:val="0"/>
           <w:color w:val="A8A5A0"/>
@@ -177,7 +177,7 @@
       </w:r>
       <w:r>
         <w:rPr>
-          <w:rFonts w:ascii="Departure Mono" w:hAnsi="Departure Mono" w:cs="Departure Mono" w:eastAsia="Departure Mono"/>
+          <w:rFonts w:ascii="JetBrains Mono" w:hAnsi="JetBrains Mono" w:cs="JetBrains Mono" w:eastAsia="JetBrains Mono"/>
           <w:b w:val="0"/>
           <w:i w:val="0"/>
           <w:color w:val="1A1A1A"/>
@@ -193,7 +193,7 @@
       </w:pPr>
       <w:r>
         <w:rPr>
-          <w:rFonts w:ascii="Departure Mono" w:hAnsi="Departure Mono" w:cs="Departure Mono" w:eastAsia="Departure Mono"/>
+          <w:rFonts w:ascii="Inter" w:hAnsi="Inter" w:cs="Inter" w:eastAsia="Inter"/>
           <w:b w:val="0"/>
           <w:i w:val="0"/>
           <w:color w:val="3A3A3A"/>
@@ -203,7 +203,7 @@
       </w:r>
       <w:r>
         <w:rPr>
-          <w:rFonts w:ascii="Departure Mono" w:hAnsi="Departure Mono" w:cs="Departure Mono" w:eastAsia="Departure Mono"/>
+          <w:rFonts w:ascii="JetBrains Mono" w:hAnsi="JetBrains Mono" w:cs="JetBrains Mono" w:eastAsia="JetBrains Mono"/>
           <w:b w:val="0"/>
           <w:i w:val="0"/>
           <w:color w:val="A8A5A0"/>
@@ -213,7 +213,7 @@
       </w:r>
       <w:r>
         <w:rPr>
-          <w:rFonts w:ascii="Departure Mono" w:hAnsi="Departure Mono" w:cs="Departure Mono" w:eastAsia="Departure Mono"/>
+          <w:rFonts w:ascii="Inter" w:hAnsi="Inter" w:cs="Inter" w:eastAsia="Inter"/>
           <w:b w:val="0"/>
           <w:i w:val="0"/>
           <w:color w:val="3A3A3A"/>
@@ -223,7 +223,7 @@
       </w:r>
       <w:r>
         <w:rPr>
-          <w:rFonts w:ascii="Departure Mono" w:hAnsi="Departure Mono" w:cs="Departure Mono" w:eastAsia="Departure Mono"/>
+          <w:rFonts w:ascii="JetBrains Mono" w:hAnsi="JetBrains Mono" w:cs="JetBrains Mono" w:eastAsia="JetBrains Mono"/>
           <w:b w:val="0"/>
           <w:i w:val="0"/>
           <w:color w:val="A8A5A0"/>
@@ -233,7 +233,7 @@
       </w:r>
       <w:r>
         <w:rPr>
-          <w:rFonts w:ascii="Departure Mono" w:hAnsi="Departure Mono" w:cs="Departure Mono" w:eastAsia="Departure Mono"/>
+          <w:rFonts w:ascii="Inter" w:hAnsi="Inter" w:cs="Inter" w:eastAsia="Inter"/>
           <w:b w:val="0"/>
           <w:i w:val="0"/>
           <w:color w:val="3A3A3A"/>
@@ -243,7 +243,7 @@
       </w:r>
       <w:r>
         <w:rPr>
-          <w:rFonts w:ascii="Departure Mono" w:hAnsi="Departure Mono" w:cs="Departure Mono" w:eastAsia="Departure Mono"/>
+          <w:rFonts w:ascii="JetBrains Mono" w:hAnsi="JetBrains Mono" w:cs="JetBrains Mono" w:eastAsia="JetBrains Mono"/>
           <w:b w:val="0"/>
           <w:i w:val="0"/>
           <w:color w:val="A8A5A0"/>
@@ -253,7 +253,7 @@
       </w:r>
       <w:r>
         <w:rPr>
-          <w:rFonts w:ascii="Departure Mono" w:hAnsi="Departure Mono" w:cs="Departure Mono" w:eastAsia="Departure Mono"/>
+          <w:rFonts w:ascii="Inter" w:hAnsi="Inter" w:cs="Inter" w:eastAsia="Inter"/>
           <w:b w:val="0"/>
           <w:i w:val="0"/>
           <w:color w:val="3A3A3A"/>
@@ -263,7 +263,7 @@
       </w:r>
       <w:r>
         <w:rPr>
-          <w:rFonts w:ascii="Departure Mono" w:hAnsi="Departure Mono" w:cs="Departure Mono" w:eastAsia="Departure Mono"/>
+          <w:rFonts w:ascii="JetBrains Mono" w:hAnsi="JetBrains Mono" w:cs="JetBrains Mono" w:eastAsia="JetBrains Mono"/>
           <w:b w:val="0"/>
           <w:i w:val="0"/>
           <w:color w:val="A8A5A0"/>
@@ -273,7 +273,7 @@
       </w:r>
       <w:r>
         <w:rPr>
-          <w:rFonts w:ascii="Departure Mono" w:hAnsi="Departure Mono" w:cs="Departure Mono" w:eastAsia="Departure Mono"/>
+          <w:rFonts w:ascii="Inter" w:hAnsi="Inter" w:cs="Inter" w:eastAsia="Inter"/>
           <w:b w:val="0"/>
           <w:i w:val="0"/>
           <w:color w:val="3A3A3A"/>
@@ -283,7 +283,7 @@
       </w:r>
       <w:r>
         <w:rPr>
-          <w:rFonts w:ascii="Departure Mono" w:hAnsi="Departure Mono" w:cs="Departure Mono" w:eastAsia="Departure Mono"/>
+          <w:rFonts w:ascii="JetBrains Mono" w:hAnsi="JetBrains Mono" w:cs="JetBrains Mono" w:eastAsia="JetBrains Mono"/>
           <w:b w:val="0"/>
           <w:i w:val="0"/>
           <w:color w:val="A8A5A0"/>
@@ -293,7 +293,7 @@
       </w:r>
       <w:r>
         <w:rPr>
-          <w:rFonts w:ascii="Departure Mono" w:hAnsi="Departure Mono" w:cs="Departure Mono" w:eastAsia="Departure Mono"/>
+          <w:rFonts w:ascii="Inter" w:hAnsi="Inter" w:cs="Inter" w:eastAsia="Inter"/>
           <w:b w:val="0"/>
           <w:i w:val="0"/>
           <w:color w:val="3A3A3A"/>
@@ -303,7 +303,7 @@
       </w:r>
       <w:r>
         <w:rPr>
-          <w:rFonts w:ascii="Departure Mono" w:hAnsi="Departure Mono" w:cs="Departure Mono" w:eastAsia="Departure Mono"/>
+          <w:rFonts w:ascii="JetBrains Mono" w:hAnsi="JetBrains Mono" w:cs="JetBrains Mono" w:eastAsia="JetBrains Mono"/>
           <w:b w:val="0"/>
           <w:i w:val="0"/>
           <w:color w:val="A8A5A0"/>
@@ -313,7 +313,7 @@
       </w:r>
       <w:r>
         <w:rPr>
-          <w:rFonts w:ascii="Departure Mono" w:hAnsi="Departure Mono" w:cs="Departure Mono" w:eastAsia="Departure Mono"/>
+          <w:rFonts w:ascii="Inter" w:hAnsi="Inter" w:cs="Inter" w:eastAsia="Inter"/>
           <w:b w:val="0"/>
           <w:i w:val="0"/>
           <w:color w:val="3A3A3A"/>
@@ -323,7 +323,7 @@
       </w:r>
       <w:r>
         <w:rPr>
-          <w:rFonts w:ascii="Departure Mono" w:hAnsi="Departure Mono" w:cs="Departure Mono" w:eastAsia="Departure Mono"/>
+          <w:rFonts w:ascii="JetBrains Mono" w:hAnsi="JetBrains Mono" w:cs="JetBrains Mono" w:eastAsia="JetBrains Mono"/>
           <w:b w:val="0"/>
           <w:i w:val="0"/>
           <w:color w:val="A8A5A0"/>
@@ -333,7 +333,7 @@
       </w:r>
       <w:r>
         <w:rPr>
-          <w:rFonts w:ascii="Departure Mono" w:hAnsi="Departure Mono" w:cs="Departure Mono" w:eastAsia="Departure Mono"/>
+          <w:rFonts w:ascii="Inter" w:hAnsi="Inter" w:cs="Inter" w:eastAsia="Inter"/>
           <w:b w:val="0"/>
           <w:i w:val="0"/>
           <w:color w:val="3A3A3A"/>
@@ -351,7 +351,7 @@
       </w:pPr>
       <w:r>
         <w:rPr>
-          <w:rFonts w:ascii="Departure Mono" w:hAnsi="Departure Mono" w:cs="Departure Mono" w:eastAsia="Departure Mono"/>
+          <w:rFonts w:ascii="JetBrains Mono" w:hAnsi="JetBrains Mono" w:cs="JetBrains Mono" w:eastAsia="JetBrains Mono"/>
           <w:b w:val="0"/>
           <w:i w:val="0"/>
           <w:color w:val="A8A5A0"/>
@@ -362,7 +362,7 @@
       </w:r>
       <w:r>
         <w:rPr>
-          <w:rFonts w:ascii="Departure Mono" w:hAnsi="Departure Mono" w:cs="Departure Mono" w:eastAsia="Departure Mono"/>
+          <w:rFonts w:ascii="JetBrains Mono" w:hAnsi="JetBrains Mono" w:cs="JetBrains Mono" w:eastAsia="JetBrains Mono"/>
           <w:b w:val="0"/>
           <w:i w:val="0"/>
           <w:color w:val="1A1A1A"/>
@@ -381,7 +381,7 @@
       </w:pPr>
       <w:r>
         <w:rPr>
-          <w:rFonts w:ascii="Departure Mono" w:hAnsi="Departure Mono" w:cs="Departure Mono" w:eastAsia="Departure Mono"/>
+          <w:rFonts w:ascii="JetBrains Mono" w:hAnsi="JetBrains Mono" w:cs="JetBrains Mono" w:eastAsia="JetBrains Mono"/>
           <w:b w:val="0"/>
           <w:i w:val="0"/>
           <w:color w:val="154C8C"/>
@@ -392,7 +392,7 @@
       </w:r>
       <w:r>
         <w:rPr>
-          <w:rFonts w:ascii="Departure Mono" w:hAnsi="Departure Mono" w:cs="Departure Mono" w:eastAsia="Departure Mono"/>
+          <w:rFonts w:ascii="Inter Tight" w:hAnsi="Inter Tight" w:cs="Inter Tight" w:eastAsia="Inter Tight"/>
           <w:b w:val="0"/>
           <w:i w:val="0"/>
           <w:color w:val="1A1A1A"/>
@@ -405,7 +405,7 @@
       </w:r>
       <w:r>
         <w:rPr>
-          <w:rFonts w:ascii="Departure Mono" w:hAnsi="Departure Mono" w:cs="Departure Mono" w:eastAsia="Departure Mono"/>
+          <w:rFonts w:ascii="JetBrains Mono" w:hAnsi="JetBrains Mono" w:cs="JetBrains Mono" w:eastAsia="JetBrains Mono"/>
           <w:b w:val="0"/>
           <w:i w:val="0"/>
           <w:color w:val="6A6A6A"/>
@@ -421,7 +421,7 @@
       </w:pPr>
       <w:r>
         <w:rPr>
-          <w:rFonts w:ascii="Departure Mono" w:hAnsi="Departure Mono" w:cs="Departure Mono" w:eastAsia="Departure Mono"/>
+          <w:rFonts w:ascii="JetBrains Mono" w:hAnsi="JetBrains Mono" w:cs="JetBrains Mono" w:eastAsia="JetBrains Mono"/>
           <w:b w:val="0"/>
           <w:i w:val="0"/>
           <w:color w:val="3A3A3A"/>
@@ -432,7 +432,7 @@
       </w:r>
       <w:r>
         <w:rPr>
-          <w:rFonts w:ascii="Departure Mono" w:hAnsi="Departure Mono" w:cs="Departure Mono" w:eastAsia="Departure Mono"/>
+          <w:rFonts w:ascii="JetBrains Mono" w:hAnsi="JetBrains Mono" w:cs="JetBrains Mono" w:eastAsia="JetBrains Mono"/>
           <w:b w:val="0"/>
           <w:i w:val="0"/>
           <w:color w:val="A8A5A0"/>
@@ -442,7 +442,7 @@
       </w:r>
       <w:r>
         <w:rPr>
-          <w:rFonts w:ascii="Departure Mono" w:hAnsi="Departure Mono" w:cs="Departure Mono" w:eastAsia="Departure Mono"/>
+          <w:rFonts w:ascii="JetBrains Mono" w:hAnsi="JetBrains Mono" w:cs="JetBrains Mono" w:eastAsia="JetBrains Mono"/>
           <w:b w:val="0"/>
           <w:i w:val="0"/>
           <w:color w:val="6A6A6A"/>
@@ -458,7 +458,7 @@
       </w:pPr>
       <w:r>
         <w:rPr>
-          <w:rFonts w:ascii="Departure Mono" w:hAnsi="Departure Mono" w:cs="Departure Mono" w:eastAsia="Departure Mono"/>
+          <w:rFonts w:ascii="Inter" w:hAnsi="Inter" w:cs="Inter" w:eastAsia="Inter"/>
           <w:b w:val="0"/>
           <w:i w:val="0"/>
           <w:color w:val="154C8C"/>
@@ -468,7 +468,7 @@
       </w:r>
       <w:r>
         <w:rPr>
-          <w:rFonts w:ascii="Departure Mono" w:hAnsi="Departure Mono" w:cs="Departure Mono" w:eastAsia="Departure Mono"/>
+          <w:rFonts w:ascii="Inter" w:hAnsi="Inter" w:cs="Inter" w:eastAsia="Inter"/>
           <w:b w:val="0"/>
           <w:i w:val="0"/>
           <w:color w:val="3A3A3A"/>
@@ -484,7 +484,7 @@
       </w:pPr>
       <w:r>
         <w:rPr>
-          <w:rFonts w:ascii="Departure Mono" w:hAnsi="Departure Mono" w:cs="Departure Mono" w:eastAsia="Departure Mono"/>
+          <w:rFonts w:ascii="Inter" w:hAnsi="Inter" w:cs="Inter" w:eastAsia="Inter"/>
           <w:b w:val="0"/>
           <w:i w:val="0"/>
           <w:color w:val="154C8C"/>
@@ -494,7 +494,7 @@
       </w:r>
       <w:r>
         <w:rPr>
-          <w:rFonts w:ascii="Departure Mono" w:hAnsi="Departure Mono" w:cs="Departure Mono" w:eastAsia="Departure Mono"/>
+          <w:rFonts w:ascii="Inter" w:hAnsi="Inter" w:cs="Inter" w:eastAsia="Inter"/>
           <w:b w:val="0"/>
           <w:i w:val="0"/>
           <w:color w:val="3A3A3A"/>
@@ -510,7 +510,7 @@
       </w:pPr>
       <w:r>
         <w:rPr>
-          <w:rFonts w:ascii="Departure Mono" w:hAnsi="Departure Mono" w:cs="Departure Mono" w:eastAsia="Departure Mono"/>
+          <w:rFonts w:ascii="Inter" w:hAnsi="Inter" w:cs="Inter" w:eastAsia="Inter"/>
           <w:b w:val="0"/>
           <w:i w:val="0"/>
           <w:color w:val="154C8C"/>
@@ -520,7 +520,7 @@
       </w:r>
       <w:r>
         <w:rPr>
-          <w:rFonts w:ascii="Departure Mono" w:hAnsi="Departure Mono" w:cs="Departure Mono" w:eastAsia="Departure Mono"/>
+          <w:rFonts w:ascii="Inter" w:hAnsi="Inter" w:cs="Inter" w:eastAsia="Inter"/>
           <w:b w:val="0"/>
           <w:i w:val="0"/>
           <w:color w:val="3A3A3A"/>
@@ -538,7 +538,7 @@
       </w:pPr>
       <w:r>
         <w:rPr>
-          <w:rFonts w:ascii="Departure Mono" w:hAnsi="Departure Mono" w:cs="Departure Mono" w:eastAsia="Departure Mono"/>
+          <w:rFonts w:ascii="JetBrains Mono" w:hAnsi="JetBrains Mono" w:cs="JetBrains Mono" w:eastAsia="JetBrains Mono"/>
           <w:b w:val="0"/>
           <w:i w:val="0"/>
           <w:color w:val="154C8C"/>
@@ -549,7 +549,7 @@
       </w:r>
       <w:r>
         <w:rPr>
-          <w:rFonts w:ascii="Departure Mono" w:hAnsi="Departure Mono" w:cs="Departure Mono" w:eastAsia="Departure Mono"/>
+          <w:rFonts w:ascii="Inter Tight" w:hAnsi="Inter Tight" w:cs="Inter Tight" w:eastAsia="Inter Tight"/>
           <w:b w:val="0"/>
           <w:i w:val="0"/>
           <w:color w:val="1A1A1A"/>
@@ -562,7 +562,7 @@
       </w:r>
       <w:r>
         <w:rPr>
-          <w:rFonts w:ascii="Departure Mono" w:hAnsi="Departure Mono" w:cs="Departure Mono" w:eastAsia="Departure Mono"/>
+          <w:rFonts w:ascii="JetBrains Mono" w:hAnsi="JetBrains Mono" w:cs="JetBrains Mono" w:eastAsia="JetBrains Mono"/>
           <w:b w:val="0"/>
           <w:i w:val="0"/>
           <w:color w:val="6A6A6A"/>
@@ -578,7 +578,7 @@
       </w:pPr>
       <w:r>
         <w:rPr>
-          <w:rFonts w:ascii="Departure Mono" w:hAnsi="Departure Mono" w:cs="Departure Mono" w:eastAsia="Departure Mono"/>
+          <w:rFonts w:ascii="JetBrains Mono" w:hAnsi="JetBrains Mono" w:cs="JetBrains Mono" w:eastAsia="JetBrains Mono"/>
           <w:b w:val="0"/>
           <w:i w:val="0"/>
           <w:color w:val="3A3A3A"/>
@@ -589,7 +589,7 @@
       </w:r>
       <w:r>
         <w:rPr>
-          <w:rFonts w:ascii="Departure Mono" w:hAnsi="Departure Mono" w:cs="Departure Mono" w:eastAsia="Departure Mono"/>
+          <w:rFonts w:ascii="JetBrains Mono" w:hAnsi="JetBrains Mono" w:cs="JetBrains Mono" w:eastAsia="JetBrains Mono"/>
           <w:b w:val="0"/>
           <w:i w:val="0"/>
           <w:color w:val="A8A5A0"/>
@@ -599,7 +599,7 @@
       </w:r>
       <w:r>
         <w:rPr>
-          <w:rFonts w:ascii="Departure Mono" w:hAnsi="Departure Mono" w:cs="Departure Mono" w:eastAsia="Departure Mono"/>
+          <w:rFonts w:ascii="JetBrains Mono" w:hAnsi="JetBrains Mono" w:cs="JetBrains Mono" w:eastAsia="JetBrains Mono"/>
           <w:b w:val="0"/>
           <w:i w:val="0"/>
           <w:color w:val="6A6A6A"/>
@@ -615,7 +615,7 @@
       </w:pPr>
       <w:r>
         <w:rPr>
-          <w:rFonts w:ascii="Departure Mono" w:hAnsi="Departure Mono" w:cs="Departure Mono" w:eastAsia="Departure Mono"/>
+          <w:rFonts w:ascii="Inter" w:hAnsi="Inter" w:cs="Inter" w:eastAsia="Inter"/>
           <w:b w:val="0"/>
           <w:i w:val="0"/>
           <w:color w:val="154C8C"/>
@@ -625,7 +625,7 @@
       </w:r>
       <w:r>
         <w:rPr>
-          <w:rFonts w:ascii="Departure Mono" w:hAnsi="Departure Mono" w:cs="Departure Mono" w:eastAsia="Departure Mono"/>
+          <w:rFonts w:ascii="Inter" w:hAnsi="Inter" w:cs="Inter" w:eastAsia="Inter"/>
           <w:b w:val="0"/>
           <w:i w:val="0"/>
           <w:color w:val="3A3A3A"/>
@@ -643,7 +643,7 @@
       </w:pPr>
       <w:r>
         <w:rPr>
-          <w:rFonts w:ascii="Departure Mono" w:hAnsi="Departure Mono" w:cs="Departure Mono" w:eastAsia="Departure Mono"/>
+          <w:rFonts w:ascii="JetBrains Mono" w:hAnsi="JetBrains Mono" w:cs="JetBrains Mono" w:eastAsia="JetBrains Mono"/>
           <w:b w:val="0"/>
           <w:i w:val="0"/>
           <w:color w:val="154C8C"/>
@@ -654,7 +654,7 @@
       </w:r>
       <w:r>
         <w:rPr>
-          <w:rFonts w:ascii="Departure Mono" w:hAnsi="Departure Mono" w:cs="Departure Mono" w:eastAsia="Departure Mono"/>
+          <w:rFonts w:ascii="Inter Tight" w:hAnsi="Inter Tight" w:cs="Inter Tight" w:eastAsia="Inter Tight"/>
           <w:b w:val="0"/>
           <w:i w:val="0"/>
           <w:color w:val="1A1A1A"/>
@@ -667,7 +667,7 @@
       </w:r>
       <w:r>
         <w:rPr>
-          <w:rFonts w:ascii="Departure Mono" w:hAnsi="Departure Mono" w:cs="Departure Mono" w:eastAsia="Departure Mono"/>
+          <w:rFonts w:ascii="JetBrains Mono" w:hAnsi="JetBrains Mono" w:cs="JetBrains Mono" w:eastAsia="JetBrains Mono"/>
           <w:b w:val="0"/>
           <w:i w:val="0"/>
           <w:color w:val="6A6A6A"/>
@@ -683,7 +683,7 @@
       </w:pPr>
       <w:r>
         <w:rPr>
-          <w:rFonts w:ascii="Departure Mono" w:hAnsi="Departure Mono" w:cs="Departure Mono" w:eastAsia="Departure Mono"/>
+          <w:rFonts w:ascii="JetBrains Mono" w:hAnsi="JetBrains Mono" w:cs="JetBrains Mono" w:eastAsia="JetBrains Mono"/>
           <w:b w:val="0"/>
           <w:i w:val="0"/>
           <w:color w:val="3A3A3A"/>
@@ -694,7 +694,7 @@
       </w:r>
       <w:r>
         <w:rPr>
-          <w:rFonts w:ascii="Departure Mono" w:hAnsi="Departure Mono" w:cs="Departure Mono" w:eastAsia="Departure Mono"/>
+          <w:rFonts w:ascii="JetBrains Mono" w:hAnsi="JetBrains Mono" w:cs="JetBrains Mono" w:eastAsia="JetBrains Mono"/>
           <w:b w:val="0"/>
           <w:i w:val="0"/>
           <w:color w:val="A8A5A0"/>
@@ -704,7 +704,7 @@
       </w:r>
       <w:r>
         <w:rPr>
-          <w:rFonts w:ascii="Departure Mono" w:hAnsi="Departure Mono" w:cs="Departure Mono" w:eastAsia="Departure Mono"/>
+          <w:rFonts w:ascii="JetBrains Mono" w:hAnsi="JetBrains Mono" w:cs="JetBrains Mono" w:eastAsia="JetBrains Mono"/>
           <w:b w:val="0"/>
           <w:i w:val="0"/>
           <w:color w:val="6A6A6A"/>
@@ -720,7 +720,7 @@
       </w:pPr>
       <w:r>
         <w:rPr>
-          <w:rFonts w:ascii="Departure Mono" w:hAnsi="Departure Mono" w:cs="Departure Mono" w:eastAsia="Departure Mono"/>
+          <w:rFonts w:ascii="Inter" w:hAnsi="Inter" w:cs="Inter" w:eastAsia="Inter"/>
           <w:b w:val="0"/>
           <w:i w:val="0"/>
           <w:color w:val="154C8C"/>
@@ -730,7 +730,7 @@
       </w:r>
       <w:r>
         <w:rPr>
-          <w:rFonts w:ascii="Departure Mono" w:hAnsi="Departure Mono" w:cs="Departure Mono" w:eastAsia="Departure Mono"/>
+          <w:rFonts w:ascii="Inter" w:hAnsi="Inter" w:cs="Inter" w:eastAsia="Inter"/>
           <w:b w:val="0"/>
           <w:i w:val="0"/>
           <w:color w:val="3A3A3A"/>
@@ -748,7 +748,7 @@
       </w:pPr>
       <w:r>
         <w:rPr>
-          <w:rFonts w:ascii="Departure Mono" w:hAnsi="Departure Mono" w:cs="Departure Mono" w:eastAsia="Departure Mono"/>
+          <w:rFonts w:ascii="JetBrains Mono" w:hAnsi="JetBrains Mono" w:cs="JetBrains Mono" w:eastAsia="JetBrains Mono"/>
           <w:b w:val="0"/>
           <w:i w:val="0"/>
           <w:color w:val="154C8C"/>
@@ -759,7 +759,7 @@
       </w:r>
       <w:r>
         <w:rPr>
-          <w:rFonts w:ascii="Departure Mono" w:hAnsi="Departure Mono" w:cs="Departure Mono" w:eastAsia="Departure Mono"/>
+          <w:rFonts w:ascii="Inter Tight" w:hAnsi="Inter Tight" w:cs="Inter Tight" w:eastAsia="Inter Tight"/>
           <w:b w:val="0"/>
           <w:i w:val="0"/>
           <w:color w:val="1A1A1A"/>
@@ -772,7 +772,7 @@
       </w:r>
       <w:r>
         <w:rPr>
-          <w:rFonts w:ascii="Departure Mono" w:hAnsi="Departure Mono" w:cs="Departure Mono" w:eastAsia="Departure Mono"/>
+          <w:rFonts w:ascii="JetBrains Mono" w:hAnsi="JetBrains Mono" w:cs="JetBrains Mono" w:eastAsia="JetBrains Mono"/>
           <w:b w:val="0"/>
           <w:i w:val="0"/>
           <w:color w:val="6A6A6A"/>
@@ -788,7 +788,7 @@
       </w:pPr>
       <w:r>
         <w:rPr>
-          <w:rFonts w:ascii="Departure Mono" w:hAnsi="Departure Mono" w:cs="Departure Mono" w:eastAsia="Departure Mono"/>
+          <w:rFonts w:ascii="JetBrains Mono" w:hAnsi="JetBrains Mono" w:cs="JetBrains Mono" w:eastAsia="JetBrains Mono"/>
           <w:b w:val="0"/>
           <w:i w:val="0"/>
           <w:color w:val="3A3A3A"/>
@@ -799,7 +799,7 @@
       </w:r>
       <w:r>
         <w:rPr>
-          <w:rFonts w:ascii="Departure Mono" w:hAnsi="Departure Mono" w:cs="Departure Mono" w:eastAsia="Departure Mono"/>
+          <w:rFonts w:ascii="JetBrains Mono" w:hAnsi="JetBrains Mono" w:cs="JetBrains Mono" w:eastAsia="JetBrains Mono"/>
           <w:b w:val="0"/>
           <w:i w:val="0"/>
           <w:color w:val="A8A5A0"/>
@@ -809,7 +809,7 @@
       </w:r>
       <w:r>
         <w:rPr>
-          <w:rFonts w:ascii="Departure Mono" w:hAnsi="Departure Mono" w:cs="Departure Mono" w:eastAsia="Departure Mono"/>
+          <w:rFonts w:ascii="JetBrains Mono" w:hAnsi="JetBrains Mono" w:cs="JetBrains Mono" w:eastAsia="JetBrains Mono"/>
           <w:b w:val="0"/>
           <w:i w:val="0"/>
           <w:color w:val="6A6A6A"/>
@@ -825,7 +825,7 @@
       </w:pPr>
       <w:r>
         <w:rPr>
-          <w:rFonts w:ascii="Departure Mono" w:hAnsi="Departure Mono" w:cs="Departure Mono" w:eastAsia="Departure Mono"/>
+          <w:rFonts w:ascii="Inter" w:hAnsi="Inter" w:cs="Inter" w:eastAsia="Inter"/>
           <w:b w:val="0"/>
           <w:i w:val="0"/>
           <w:color w:val="154C8C"/>
@@ -835,7 +835,7 @@
       </w:r>
       <w:r>
         <w:rPr>
-          <w:rFonts w:ascii="Departure Mono" w:hAnsi="Departure Mono" w:cs="Departure Mono" w:eastAsia="Departure Mono"/>
+          <w:rFonts w:ascii="Inter" w:hAnsi="Inter" w:cs="Inter" w:eastAsia="Inter"/>
           <w:b w:val="0"/>
           <w:i w:val="0"/>
           <w:color w:val="3A3A3A"/>
@@ -853,7 +853,7 @@
       </w:pPr>
       <w:r>
         <w:rPr>
-          <w:rFonts w:ascii="Departure Mono" w:hAnsi="Departure Mono" w:cs="Departure Mono" w:eastAsia="Departure Mono"/>
+          <w:rFonts w:ascii="JetBrains Mono" w:hAnsi="JetBrains Mono" w:cs="JetBrains Mono" w:eastAsia="JetBrains Mono"/>
           <w:b w:val="0"/>
           <w:i w:val="0"/>
           <w:color w:val="154C8C"/>
@@ -864,7 +864,7 @@
       </w:r>
       <w:r>
         <w:rPr>
-          <w:rFonts w:ascii="Departure Mono" w:hAnsi="Departure Mono" w:cs="Departure Mono" w:eastAsia="Departure Mono"/>
+          <w:rFonts w:ascii="Inter Tight" w:hAnsi="Inter Tight" w:cs="Inter Tight" w:eastAsia="Inter Tight"/>
           <w:b w:val="0"/>
           <w:i w:val="0"/>
           <w:color w:val="1A1A1A"/>
@@ -877,7 +877,7 @@
       </w:r>
       <w:r>
         <w:rPr>
-          <w:rFonts w:ascii="Departure Mono" w:hAnsi="Departure Mono" w:cs="Departure Mono" w:eastAsia="Departure Mono"/>
+          <w:rFonts w:ascii="JetBrains Mono" w:hAnsi="JetBrains Mono" w:cs="JetBrains Mono" w:eastAsia="JetBrains Mono"/>
           <w:b w:val="0"/>
           <w:i w:val="0"/>
           <w:color w:val="6A6A6A"/>
@@ -893,7 +893,7 @@
       </w:pPr>
       <w:r>
         <w:rPr>
-          <w:rFonts w:ascii="Departure Mono" w:hAnsi="Departure Mono" w:cs="Departure Mono" w:eastAsia="Departure Mono"/>
+          <w:rFonts w:ascii="JetBrains Mono" w:hAnsi="JetBrains Mono" w:cs="JetBrains Mono" w:eastAsia="JetBrains Mono"/>
           <w:b w:val="0"/>
           <w:i w:val="0"/>
           <w:color w:val="3A3A3A"/>
@@ -904,7 +904,7 @@
       </w:r>
       <w:r>
         <w:rPr>
-          <w:rFonts w:ascii="Departure Mono" w:hAnsi="Departure Mono" w:cs="Departure Mono" w:eastAsia="Departure Mono"/>
+          <w:rFonts w:ascii="JetBrains Mono" w:hAnsi="JetBrains Mono" w:cs="JetBrains Mono" w:eastAsia="JetBrains Mono"/>
           <w:b w:val="0"/>
           <w:i w:val="0"/>
           <w:color w:val="A8A5A0"/>
@@ -914,7 +914,7 @@
       </w:r>
       <w:r>
         <w:rPr>
-          <w:rFonts w:ascii="Departure Mono" w:hAnsi="Departure Mono" w:cs="Departure Mono" w:eastAsia="Departure Mono"/>
+          <w:rFonts w:ascii="JetBrains Mono" w:hAnsi="JetBrains Mono" w:cs="JetBrains Mono" w:eastAsia="JetBrains Mono"/>
           <w:b w:val="0"/>
           <w:i w:val="0"/>
           <w:color w:val="6A6A6A"/>
@@ -930,7 +930,7 @@
       </w:pPr>
       <w:r>
         <w:rPr>
-          <w:rFonts w:ascii="Departure Mono" w:hAnsi="Departure Mono" w:cs="Departure Mono" w:eastAsia="Departure Mono"/>
+          <w:rFonts w:ascii="Inter" w:hAnsi="Inter" w:cs="Inter" w:eastAsia="Inter"/>
           <w:b w:val="0"/>
           <w:i w:val="0"/>
           <w:color w:val="154C8C"/>
@@ -940,7 +940,7 @@
       </w:r>
       <w:r>
         <w:rPr>
-          <w:rFonts w:ascii="Departure Mono" w:hAnsi="Departure Mono" w:cs="Departure Mono" w:eastAsia="Departure Mono"/>
+          <w:rFonts w:ascii="Inter" w:hAnsi="Inter" w:cs="Inter" w:eastAsia="Inter"/>
           <w:b w:val="0"/>
           <w:i w:val="0"/>
           <w:color w:val="3A3A3A"/>
@@ -958,7 +958,7 @@
       </w:pPr>
       <w:r>
         <w:rPr>
-          <w:rFonts w:ascii="Departure Mono" w:hAnsi="Departure Mono" w:cs="Departure Mono" w:eastAsia="Departure Mono"/>
+          <w:rFonts w:ascii="JetBrains Mono" w:hAnsi="JetBrains Mono" w:cs="JetBrains Mono" w:eastAsia="JetBrains Mono"/>
           <w:b w:val="0"/>
           <w:i w:val="0"/>
           <w:color w:val="154C8C"/>
@@ -969,7 +969,7 @@
       </w:r>
       <w:r>
         <w:rPr>
-          <w:rFonts w:ascii="Departure Mono" w:hAnsi="Departure Mono" w:cs="Departure Mono" w:eastAsia="Departure Mono"/>
+          <w:rFonts w:ascii="Inter Tight" w:hAnsi="Inter Tight" w:cs="Inter Tight" w:eastAsia="Inter Tight"/>
           <w:b w:val="0"/>
           <w:i w:val="0"/>
           <w:color w:val="1A1A1A"/>
@@ -982,7 +982,7 @@
       </w:r>
       <w:r>
         <w:rPr>
-          <w:rFonts w:ascii="Departure Mono" w:hAnsi="Departure Mono" w:cs="Departure Mono" w:eastAsia="Departure Mono"/>
+          <w:rFonts w:ascii="JetBrains Mono" w:hAnsi="JetBrains Mono" w:cs="JetBrains Mono" w:eastAsia="JetBrains Mono"/>
           <w:b w:val="0"/>
           <w:i w:val="0"/>
           <w:color w:val="6A6A6A"/>
@@ -998,7 +998,7 @@
       </w:pPr>
       <w:r>
         <w:rPr>
-          <w:rFonts w:ascii="Departure Mono" w:hAnsi="Departure Mono" w:cs="Departure Mono" w:eastAsia="Departure Mono"/>
+          <w:rFonts w:ascii="JetBrains Mono" w:hAnsi="JetBrains Mono" w:cs="JetBrains Mono" w:eastAsia="JetBrains Mono"/>
           <w:b w:val="0"/>
           <w:i w:val="0"/>
           <w:color w:val="3A3A3A"/>
@@ -1009,7 +1009,7 @@
       </w:r>
       <w:r>
         <w:rPr>
-          <w:rFonts w:ascii="Departure Mono" w:hAnsi="Departure Mono" w:cs="Departure Mono" w:eastAsia="Departure Mono"/>
+          <w:rFonts w:ascii="JetBrains Mono" w:hAnsi="JetBrains Mono" w:cs="JetBrains Mono" w:eastAsia="JetBrains Mono"/>
           <w:b w:val="0"/>
           <w:i w:val="0"/>
           <w:color w:val="A8A5A0"/>
@@ -1019,7 +1019,7 @@
       </w:r>
       <w:r>
         <w:rPr>
-          <w:rFonts w:ascii="Departure Mono" w:hAnsi="Departure Mono" w:cs="Departure Mono" w:eastAsia="Departure Mono"/>
+          <w:rFonts w:ascii="JetBrains Mono" w:hAnsi="JetBrains Mono" w:cs="JetBrains Mono" w:eastAsia="JetBrains Mono"/>
           <w:b w:val="0"/>
           <w:i w:val="0"/>
           <w:color w:val="6A6A6A"/>
@@ -1037,7 +1037,7 @@
       </w:pPr>
       <w:r>
         <w:rPr>
-          <w:rFonts w:ascii="Departure Mono" w:hAnsi="Departure Mono" w:cs="Departure Mono" w:eastAsia="Departure Mono"/>
+          <w:rFonts w:ascii="JetBrains Mono" w:hAnsi="JetBrains Mono" w:cs="JetBrains Mono" w:eastAsia="JetBrains Mono"/>
           <w:b w:val="0"/>
           <w:i w:val="0"/>
           <w:color w:val="A8A5A0"/>
@@ -1048,7 +1048,7 @@
       </w:r>
       <w:r>
         <w:rPr>
-          <w:rFonts w:ascii="Departure Mono" w:hAnsi="Departure Mono" w:cs="Departure Mono" w:eastAsia="Departure Mono"/>
+          <w:rFonts w:ascii="JetBrains Mono" w:hAnsi="JetBrains Mono" w:cs="JetBrains Mono" w:eastAsia="JetBrains Mono"/>
           <w:b w:val="0"/>
           <w:i w:val="0"/>
           <w:color w:val="1A1A1A"/>
@@ -1064,7 +1064,7 @@
       </w:pPr>
       <w:r>
         <w:rPr>
-          <w:rFonts w:ascii="Departure Mono" w:hAnsi="Departure Mono" w:cs="Departure Mono" w:eastAsia="Departure Mono"/>
+          <w:rFonts w:ascii="JetBrains Mono" w:hAnsi="JetBrains Mono" w:cs="JetBrains Mono" w:eastAsia="JetBrains Mono"/>
           <w:b w:val="0"/>
           <w:i w:val="0"/>
           <w:color w:val="1A1A1A"/>
@@ -1075,7 +1075,7 @@
       </w:r>
       <w:r>
         <w:rPr>
-          <w:rFonts w:ascii="Departure Mono" w:hAnsi="Departure Mono" w:cs="Departure Mono" w:eastAsia="Departure Mono"/>
+          <w:rFonts w:ascii="Inter" w:hAnsi="Inter" w:cs="Inter" w:eastAsia="Inter"/>
           <w:b w:val="0"/>
           <w:i w:val="0"/>
           <w:color w:val="3A3A3A"/>
@@ -1090,7 +1090,7 @@
       </w:pPr>
       <w:r>
         <w:rPr>
-          <w:rFonts w:ascii="Departure Mono" w:hAnsi="Departure Mono" w:cs="Departure Mono" w:eastAsia="Departure Mono"/>
+          <w:rFonts w:ascii="JetBrains Mono" w:hAnsi="JetBrains Mono" w:cs="JetBrains Mono" w:eastAsia="JetBrains Mono"/>
           <w:b w:val="0"/>
           <w:i w:val="0"/>
           <w:color w:val="1A1A1A"/>
@@ -1101,7 +1101,7 @@
       </w:r>
       <w:r>
         <w:rPr>
-          <w:rFonts w:ascii="Departure Mono" w:hAnsi="Departure Mono" w:cs="Departure Mono" w:eastAsia="Departure Mono"/>
+          <w:rFonts w:ascii="Inter" w:hAnsi="Inter" w:cs="Inter" w:eastAsia="Inter"/>
           <w:b w:val="0"/>
           <w:i w:val="0"/>
           <w:color w:val="3A3A3A"/>
@@ -1116,7 +1116,7 @@
       </w:pPr>
       <w:r>
         <w:rPr>
-          <w:rFonts w:ascii="Departure Mono" w:hAnsi="Departure Mono" w:cs="Departure Mono" w:eastAsia="Departure Mono"/>
+          <w:rFonts w:ascii="JetBrains Mono" w:hAnsi="JetBrains Mono" w:cs="JetBrains Mono" w:eastAsia="JetBrains Mono"/>
           <w:b w:val="0"/>
           <w:i w:val="0"/>
           <w:color w:val="1A1A1A"/>
@@ -1127,7 +1127,7 @@
       </w:r>
       <w:r>
         <w:rPr>
-          <w:rFonts w:ascii="Departure Mono" w:hAnsi="Departure Mono" w:cs="Departure Mono" w:eastAsia="Departure Mono"/>
+          <w:rFonts w:ascii="Inter" w:hAnsi="Inter" w:cs="Inter" w:eastAsia="Inter"/>
           <w:b w:val="0"/>
           <w:i w:val="0"/>
           <w:color w:val="3A3A3A"/>
@@ -1142,7 +1142,7 @@
       </w:pPr>
       <w:r>
         <w:rPr>
-          <w:rFonts w:ascii="Departure Mono" w:hAnsi="Departure Mono" w:cs="Departure Mono" w:eastAsia="Departure Mono"/>
+          <w:rFonts w:ascii="JetBrains Mono" w:hAnsi="JetBrains Mono" w:cs="JetBrains Mono" w:eastAsia="JetBrains Mono"/>
           <w:b w:val="0"/>
           <w:i w:val="0"/>
           <w:color w:val="1A1A1A"/>
@@ -1153,7 +1153,7 @@
       </w:r>
       <w:r>
         <w:rPr>
-          <w:rFonts w:ascii="Departure Mono" w:hAnsi="Departure Mono" w:cs="Departure Mono" w:eastAsia="Departure Mono"/>
+          <w:rFonts w:ascii="Inter" w:hAnsi="Inter" w:cs="Inter" w:eastAsia="Inter"/>
           <w:b w:val="0"/>
           <w:i w:val="0"/>
           <w:color w:val="3A3A3A"/>
@@ -1171,7 +1171,7 @@
       </w:pPr>
       <w:r>
         <w:rPr>
-          <w:rFonts w:ascii="Departure Mono" w:hAnsi="Departure Mono" w:cs="Departure Mono" w:eastAsia="Departure Mono"/>
+          <w:rFonts w:ascii="Inter" w:hAnsi="Inter" w:cs="Inter" w:eastAsia="Inter"/>
           <w:b w:val="0"/>
           <w:i w:val="0"/>
           <w:color w:val="3A3A3A"/>
@@ -1181,7 +1181,7 @@
       </w:r>
       <w:r>
         <w:rPr>
-          <w:rFonts w:ascii="Departure Mono" w:hAnsi="Departure Mono" w:cs="Departure Mono" w:eastAsia="Departure Mono"/>
+          <w:rFonts w:ascii="JetBrains Mono" w:hAnsi="JetBrains Mono" w:cs="JetBrains Mono" w:eastAsia="JetBrains Mono"/>
           <w:b w:val="0"/>
           <w:i w:val="0"/>
           <w:color w:val="A8A5A0"/>
@@ -1191,7 +1191,7 @@
       </w:r>
       <w:r>
         <w:rPr>
-          <w:rFonts w:ascii="Departure Mono" w:hAnsi="Departure Mono" w:cs="Departure Mono" w:eastAsia="Departure Mono"/>
+          <w:rFonts w:ascii="Inter" w:hAnsi="Inter" w:cs="Inter" w:eastAsia="Inter"/>
           <w:b w:val="0"/>
           <w:i w:val="0"/>
           <w:color w:val="3A3A3A"/>
@@ -1201,7 +1201,7 @@
       </w:r>
       <w:r>
         <w:rPr>
-          <w:rFonts w:ascii="Departure Mono" w:hAnsi="Departure Mono" w:cs="Departure Mono" w:eastAsia="Departure Mono"/>
+          <w:rFonts w:ascii="JetBrains Mono" w:hAnsi="JetBrains Mono" w:cs="JetBrains Mono" w:eastAsia="JetBrains Mono"/>
           <w:b w:val="0"/>
           <w:i w:val="0"/>
           <w:color w:val="A8A5A0"/>
@@ -1211,7 +1211,7 @@
       </w:r>
       <w:r>
         <w:rPr>
-          <w:rFonts w:ascii="Departure Mono" w:hAnsi="Departure Mono" w:cs="Departure Mono" w:eastAsia="Departure Mono"/>
+          <w:rFonts w:ascii="Inter" w:hAnsi="Inter" w:cs="Inter" w:eastAsia="Inter"/>
           <w:b w:val="0"/>
           <w:i w:val="0"/>
           <w:color w:val="3A3A3A"/>
@@ -1281,7 +1281,7 @@
     </w:pPr>
     <w:r>
       <w:rPr>
-        <w:rFonts w:ascii="Departure Mono" w:hAnsi="Departure Mono" w:cs="Departure Mono" w:eastAsia="Departure Mono"/>
+        <w:rFonts w:ascii="JetBrains Mono" w:hAnsi="JetBrains Mono" w:cs="JetBrains Mono" w:eastAsia="JetBrains Mono"/>
         <w:b w:val="0"/>
         <w:i w:val="0"/>
         <w:color w:val="6A6A6A"/>
@@ -1658,7 +1658,7 @@
     <w:qFormat/>
     <w:rsid w:val="00FC693F"/>
     <w:rPr>
-      <w:rFonts w:ascii="Departure Mono" w:hAnsi="Departure Mono"/>
+      <w:rFonts w:ascii="Inter" w:hAnsi="Inter"/>
       <w:color w:val="3A3A3A"/>
       <w:sz w:val="18"/>
     </w:rPr>

</xml_diff>

<commit_message>
Put the site's rainbow glow on the ai in the downloadable resume.
The letters stay white, and the halo keeps the same bright colors as the hero.

Co-authored-by: Cursor <cursoragent@cursor.com>
</commit_message>
<xml_diff>
--- a/uploads/Efrain_Plascencia_Resume.docx
+++ b/uploads/Efrain_Plascencia_Resume.docx
@@ -48,10 +48,45 @@
         <w:jc w:val="center"/>
       </w:pPr>
       <w:r>
+        <w:drawing>
+          <wp:inline xmlns:a="http://schemas.openxmlformats.org/drawingml/2006/main" xmlns:pic="http://schemas.openxmlformats.org/drawingml/2006/picture">
+            <wp:extent cx="1633537" cy="234950"/>
+            <wp:docPr id="2" name="Picture 2"/>
+            <wp:cNvGraphicFramePr>
+              <a:graphicFrameLocks noChangeAspect="1"/>
+            </wp:cNvGraphicFramePr>
+            <a:graphic>
+              <a:graphicData uri="http://schemas.openxmlformats.org/drawingml/2006/picture">
+                <pic:pic>
+                  <pic:nvPicPr>
+                    <pic:cNvPr id="0" name="_name_glow.png"/>
+                    <pic:cNvPicPr/>
+                  </pic:nvPicPr>
+                  <pic:blipFill>
+                    <a:blip r:embed="rId11"/>
+                    <a:stretch>
+                      <a:fillRect/>
+                    </a:stretch>
+                  </pic:blipFill>
+                  <pic:spPr>
+                    <a:xfrm>
+                      <a:off x="0" y="0"/>
+                      <a:ext cx="1633537" cy="234950"/>
+                    </a:xfrm>
+                    <a:prstGeom prst="rect"/>
+                  </pic:spPr>
+                </pic:pic>
+              </a:graphicData>
+            </a:graphic>
+          </wp:inline>
+        </w:drawing>
+      </w:r>
+      <w:r>
         <w:rPr>
           <w:rFonts w:ascii="Inter Tight" w:hAnsi="Inter Tight" w:cs="Inter Tight" w:eastAsia="Inter Tight"/>
           <w:b w:val="0"/>
           <w:i w:val="0"/>
+          <w:vanish/>
           <w:color w:val="1A1A1A"/>
           <w:sz w:val="36"/>
         </w:rPr>

</xml_diff>

<commit_message>
fix: regenerate downloadable resume with comic headshot
The live site already uses the comic assets in the hero; the PDF
linked from Download resume still had the old memoji. Rebuild so
the public download matches.
</commit_message>
<xml_diff>
--- a/uploads/Efrain_Plascencia_Resume.docx
+++ b/uploads/Efrain_Plascencia_Resume.docx
@@ -107,7 +107,7 @@
           <w:sz w:val="15"/>
           <w:spacing w:val="26"/>
         </w:rPr>
-        <w:t>AI SOLUTIONS ARCHITECT   ·   APPLIED AI &amp; AGENTIC SYSTEMS   ·   AUTOMOTIVE SOFTWARE</w:t>
+        <w:t>FORWARD-DEPLOYED AI ENGINEER   ·   13 YEARS IN AUTOMOTIVE SOFTWARE</w:t>
       </w:r>
     </w:p>
     <w:p>
@@ -189,7 +189,7 @@
           <w:color w:val="3A3A3A"/>
           <w:sz w:val="18"/>
         </w:rPr>
-        <w:t>AI solutions architect turning messy operational problems into shipped AI systems — not demos. At GEMMACON North America, designs and deploys the AI systems OEM engagements run on: agentic pipelines, document automation, and containerized FastAPI services. Fifteen years of connected-vehicle software at Toyota, Mercedes-Benz R&amp;D North America, Hyundai Autoever, and PACCAR.</w:t>
+        <w:t>I build AI tools that real teams use every day, not demos. At GEMMACON North America I write and ship the internal AI tooling we run the business on: agentic research pipelines, document automation, and containerized Python services. Before that, a decade of connected-vehicle software at Toyota, Mercedes-Benz R&amp;D, Hyundai, and PACCAR.</w:t>
       </w:r>
     </w:p>
     <w:p>

</xml_diff>

<commit_message>
fix: regenerate downloadable resume with comic headshot (#3)
The live site already uses the comic assets in the hero; the PDF
linked from Download resume still had the old memoji. Rebuild so
the public download matches.
</commit_message>
<xml_diff>
--- a/uploads/Efrain_Plascencia_Resume.docx
+++ b/uploads/Efrain_Plascencia_Resume.docx
@@ -107,7 +107,7 @@
           <w:sz w:val="15"/>
           <w:spacing w:val="26"/>
         </w:rPr>
-        <w:t>AI SOLUTIONS ARCHITECT   ·   APPLIED AI &amp; AGENTIC SYSTEMS   ·   AUTOMOTIVE SOFTWARE</w:t>
+        <w:t>FORWARD-DEPLOYED AI ENGINEER   ·   13 YEARS IN AUTOMOTIVE SOFTWARE</w:t>
       </w:r>
     </w:p>
     <w:p>
@@ -189,7 +189,7 @@
           <w:color w:val="3A3A3A"/>
           <w:sz w:val="18"/>
         </w:rPr>
-        <w:t>AI solutions architect turning messy operational problems into shipped AI systems — not demos. At GEMMACON North America, designs and deploys the AI systems OEM engagements run on: agentic pipelines, document automation, and containerized FastAPI services. Fifteen years of connected-vehicle software at Toyota, Mercedes-Benz R&amp;D North America, Hyundai Autoever, and PACCAR.</w:t>
+        <w:t>I build AI tools that real teams use every day, not demos. At GEMMACON North America I write and ship the internal AI tooling we run the business on: agentic research pipelines, document automation, and containerized Python services. Before that, a decade of connected-vehicle software at Toyota, Mercedes-Benz R&amp;D, Hyundai, and PACCAR.</w:t>
       </w:r>
     </w:p>
     <w:p>

</xml_diff>

<commit_message>
fix: make downloadable resume URLs and QR clickable
Contact email/LinkedIn/X/GitHub, the MIT xPRO credential (Emeritus
#acc.3MJw8mIU), and the companion-site QR plus caption are real
hyperlinks. DrawingML hlinkClick so the QR survives Word PDF export.
</commit_message>
<xml_diff>
--- a/uploads/Efrain_Plascencia_Resume.docx
+++ b/uploads/Efrain_Plascencia_Resume.docx
@@ -124,8 +124,54 @@
           <w:sz w:val="15"/>
           <w:spacing w:val="20"/>
         </w:rPr>
-        <w:t>DALLAS–FORT WORTH, TX   ·   213.***.7937   ·   EFRAIN@FRIN.BOT</w:t>
+        <w:t>DALLAS–FORT WORTH, TX</w:t>
       </w:r>
+      <w:r>
+        <w:rPr>
+          <w:rFonts w:ascii="JetBrains Mono" w:hAnsi="JetBrains Mono" w:cs="JetBrains Mono" w:eastAsia="JetBrains Mono"/>
+          <w:b w:val="0"/>
+          <w:i w:val="0"/>
+          <w:color w:val="3A3A3A"/>
+          <w:sz w:val="15"/>
+          <w:spacing w:val="20"/>
+        </w:rPr>
+        <w:t xml:space="preserve">   ·   </w:t>
+      </w:r>
+      <w:r>
+        <w:rPr>
+          <w:rFonts w:ascii="JetBrains Mono" w:hAnsi="JetBrains Mono" w:cs="JetBrains Mono" w:eastAsia="JetBrains Mono"/>
+          <w:b w:val="0"/>
+          <w:i w:val="0"/>
+          <w:color w:val="3A3A3A"/>
+          <w:sz w:val="15"/>
+          <w:spacing w:val="20"/>
+        </w:rPr>
+        <w:t>213.***.7937</w:t>
+      </w:r>
+      <w:r>
+        <w:rPr>
+          <w:rFonts w:ascii="JetBrains Mono" w:hAnsi="JetBrains Mono" w:cs="JetBrains Mono" w:eastAsia="JetBrains Mono"/>
+          <w:b w:val="0"/>
+          <w:i w:val="0"/>
+          <w:color w:val="3A3A3A"/>
+          <w:sz w:val="15"/>
+          <w:spacing w:val="20"/>
+        </w:rPr>
+        <w:t xml:space="preserve">   ·   </w:t>
+      </w:r>
+      <w:hyperlink r:id="rId12" w:history="1">
+        <w:r>
+          <w:rPr>
+            <w:rFonts w:ascii="JetBrains Mono" w:hAnsi="JetBrains Mono" w:cs="JetBrains Mono" w:eastAsia="JetBrains Mono"/>
+            <w:sz w:val="15"/>
+            <w:szCs w:val="15"/>
+            <w:color w:val="3A3A3A"/>
+            <w:u w:val="none"/>
+            <w:spacing w:val="20"/>
+          </w:rPr>
+          <w:t xml:space="preserve">EFRAIN@FRIN.BOT</w:t>
+        </w:r>
+      </w:hyperlink>
     </w:p>
     <w:p>
       <w:pPr>
@@ -135,6 +181,19 @@
           <w:bottom w:val="single" w:sz="4" w:space="4" w:color="DDD9D1"/>
         </w:pBdr>
       </w:pPr>
+      <w:hyperlink r:id="rId13" w:history="1">
+        <w:r>
+          <w:rPr>
+            <w:rFonts w:ascii="JetBrains Mono" w:hAnsi="JetBrains Mono" w:cs="JetBrains Mono" w:eastAsia="JetBrains Mono"/>
+            <w:sz w:val="15"/>
+            <w:szCs w:val="15"/>
+            <w:color w:val="3A3A3A"/>
+            <w:u w:val="none"/>
+            <w:spacing w:val="20"/>
+          </w:rPr>
+          <w:t xml:space="preserve">LINKEDIN.COM/IN/EFRAINP</w:t>
+        </w:r>
+      </w:hyperlink>
       <w:r>
         <w:rPr>
           <w:rFonts w:ascii="JetBrains Mono" w:hAnsi="JetBrains Mono" w:cs="JetBrains Mono" w:eastAsia="JetBrains Mono"/>
@@ -144,8 +203,45 @@
           <w:sz w:val="15"/>
           <w:spacing w:val="20"/>
         </w:rPr>
-        <w:t>LINKEDIN.COM/IN/EFRAINP   ·   X.COM/EFRAINPLASC   ·   GITHUB.COM/FRIN-BOT</w:t>
+        <w:t xml:space="preserve">   ·   </w:t>
       </w:r>
+      <w:hyperlink r:id="rId14" w:history="1">
+        <w:r>
+          <w:rPr>
+            <w:rFonts w:ascii="JetBrains Mono" w:hAnsi="JetBrains Mono" w:cs="JetBrains Mono" w:eastAsia="JetBrains Mono"/>
+            <w:sz w:val="15"/>
+            <w:szCs w:val="15"/>
+            <w:color w:val="3A3A3A"/>
+            <w:u w:val="none"/>
+            <w:spacing w:val="20"/>
+          </w:rPr>
+          <w:t xml:space="preserve">X.COM/EFRAINPLASC</w:t>
+        </w:r>
+      </w:hyperlink>
+      <w:r>
+        <w:rPr>
+          <w:rFonts w:ascii="JetBrains Mono" w:hAnsi="JetBrains Mono" w:cs="JetBrains Mono" w:eastAsia="JetBrains Mono"/>
+          <w:b w:val="0"/>
+          <w:i w:val="0"/>
+          <w:color w:val="3A3A3A"/>
+          <w:sz w:val="15"/>
+          <w:spacing w:val="20"/>
+        </w:rPr>
+        <w:t xml:space="preserve">   ·   </w:t>
+      </w:r>
+      <w:hyperlink r:id="rId15" w:history="1">
+        <w:r>
+          <w:rPr>
+            <w:rFonts w:ascii="JetBrains Mono" w:hAnsi="JetBrains Mono" w:cs="JetBrains Mono" w:eastAsia="JetBrains Mono"/>
+            <w:sz w:val="15"/>
+            <w:szCs w:val="15"/>
+            <w:color w:val="3A3A3A"/>
+            <w:u w:val="none"/>
+            <w:spacing w:val="20"/>
+          </w:rPr>
+          <w:t xml:space="preserve">GITHUB.COM/FRIN-BOT</w:t>
+        </w:r>
+      </w:hyperlink>
     </w:p>
     <w:p>
       <w:pPr>
@@ -1204,16 +1300,18 @@
           <w:top w:val="single" w:sz="4" w:space="4" w:color="DDD9D1"/>
         </w:pBdr>
       </w:pPr>
-      <w:r>
-        <w:rPr>
-          <w:rFonts w:ascii="Inter" w:hAnsi="Inter" w:cs="Inter" w:eastAsia="Inter"/>
-          <w:b w:val="0"/>
-          <w:i w:val="0"/>
-          <w:color w:val="3A3A3A"/>
-          <w:sz w:val="16"/>
-        </w:rPr>
-        <w:t>MIT xPRO 2025</w:t>
-      </w:r>
+      <w:hyperlink r:id="rId16" w:history="1">
+        <w:r>
+          <w:rPr>
+            <w:rFonts w:ascii="Inter" w:hAnsi="Inter" w:cs="Inter" w:eastAsia="Inter"/>
+            <w:sz w:val="16"/>
+            <w:szCs w:val="16"/>
+            <w:color w:val="3A3A3A"/>
+            <w:u w:val="none"/>
+          </w:rPr>
+          <w:t xml:space="preserve">MIT xPRO 2025</w:t>
+        </w:r>
+      </w:hyperlink>
       <w:r>
         <w:rPr>
           <w:rFonts w:ascii="JetBrains Mono" w:hAnsi="JetBrains Mono" w:cs="JetBrains Mono" w:eastAsia="JetBrains Mono"/>
@@ -1274,57 +1372,65 @@
       <w:spacing w:before="0" w:after="0"/>
       <w:jc w:val="right"/>
     </w:pPr>
-    <w:r>
-      <w:drawing>
-        <wp:inline xmlns:a="http://schemas.openxmlformats.org/drawingml/2006/main" xmlns:pic="http://schemas.openxmlformats.org/drawingml/2006/picture">
-          <wp:extent cx="475488" cy="475488"/>
-          <wp:docPr id="1" name="Picture 1"/>
-          <wp:cNvGraphicFramePr>
-            <a:graphicFrameLocks noChangeAspect="1"/>
-          </wp:cNvGraphicFramePr>
-          <a:graphic>
-            <a:graphicData uri="http://schemas.openxmlformats.org/drawingml/2006/picture">
-              <pic:pic>
-                <pic:nvPicPr>
-                  <pic:cNvPr id="0" name="qr_efrain_me.png"/>
-                  <pic:cNvPicPr/>
-                </pic:nvPicPr>
-                <pic:blipFill>
-                  <a:blip r:embed="rId1"/>
-                  <a:stretch>
-                    <a:fillRect/>
-                  </a:stretch>
-                </pic:blipFill>
-                <pic:spPr>
-                  <a:xfrm>
-                    <a:off x="0" y="0"/>
-                    <a:ext cx="475488" cy="475488"/>
-                  </a:xfrm>
-                  <a:prstGeom prst="rect"/>
-                </pic:spPr>
-              </pic:pic>
-            </a:graphicData>
-          </a:graphic>
-        </wp:inline>
-      </w:drawing>
-    </w:r>
+    <w:hyperlink r:id="rId2" w:history="1">
+      <w:r>
+        <w:drawing>
+          <wp:inline xmlns:a="http://schemas.openxmlformats.org/drawingml/2006/main" xmlns:pic="http://schemas.openxmlformats.org/drawingml/2006/picture">
+            <wp:extent cx="475488" cy="475488"/>
+            <wp:docPr id="1" name="Picture 1">
+              <a:hlinkClick r:id="rId2"/>
+            </wp:docPr>
+            <wp:cNvGraphicFramePr>
+              <a:graphicFrameLocks noChangeAspect="1"/>
+            </wp:cNvGraphicFramePr>
+            <a:graphic>
+              <a:graphicData uri="http://schemas.openxmlformats.org/drawingml/2006/picture">
+                <pic:pic>
+                  <pic:nvPicPr>
+                    <pic:cNvPr id="0" name="qr_efrain_me.png">
+                      <a:hlinkClick r:id="rId2"/>
+                    </pic:cNvPr>
+                    <pic:cNvPicPr/>
+                  </pic:nvPicPr>
+                  <pic:blipFill>
+                    <a:blip r:embed="rId1"/>
+                    <a:stretch>
+                      <a:fillRect/>
+                    </a:stretch>
+                  </pic:blipFill>
+                  <pic:spPr>
+                    <a:xfrm>
+                      <a:off x="0" y="0"/>
+                      <a:ext cx="475488" cy="475488"/>
+                    </a:xfrm>
+                    <a:prstGeom prst="rect"/>
+                  </pic:spPr>
+                </pic:pic>
+              </a:graphicData>
+            </a:graphic>
+          </wp:inline>
+        </w:drawing>
+      </w:r>
+    </w:hyperlink>
   </w:p>
   <w:p>
     <w:pPr>
       <w:spacing w:before="20" w:after="0"/>
       <w:jc w:val="right"/>
     </w:pPr>
-    <w:r>
-      <w:rPr>
-        <w:rFonts w:ascii="JetBrains Mono" w:hAnsi="JetBrains Mono" w:cs="JetBrains Mono" w:eastAsia="JetBrains Mono"/>
-        <w:b w:val="0"/>
-        <w:i w:val="0"/>
-        <w:color w:val="6A6A6A"/>
-        <w:sz w:val="13"/>
-        <w:spacing w:val="16"/>
-      </w:rPr>
-      <w:t>COMPANION SITE</w:t>
-    </w:r>
+    <w:hyperlink r:id="rId2" w:history="1">
+      <w:r>
+        <w:rPr>
+          <w:rFonts w:ascii="JetBrains Mono" w:hAnsi="JetBrains Mono" w:cs="JetBrains Mono" w:eastAsia="JetBrains Mono"/>
+          <w:sz w:val="13"/>
+          <w:szCs w:val="13"/>
+          <w:color w:val="6A6A6A"/>
+          <w:u w:val="none"/>
+          <w:spacing w:val="16"/>
+        </w:rPr>
+        <w:t xml:space="preserve">COMPANION SITE</w:t>
+      </w:r>
+    </w:hyperlink>
   </w:p>
 </w:ftr>
 </file>

</xml_diff>

<commit_message>
fix: make downloadable resume URLs and QR clickable (#4)
Contact email/LinkedIn/X/GitHub, the MIT xPRO credential (Emeritus
#acc.3MJw8mIU), and the companion-site QR plus caption are real
hyperlinks. DrawingML hlinkClick so the QR survives Word PDF export.
</commit_message>
<xml_diff>
--- a/uploads/Efrain_Plascencia_Resume.docx
+++ b/uploads/Efrain_Plascencia_Resume.docx
@@ -124,8 +124,54 @@
           <w:sz w:val="15"/>
           <w:spacing w:val="20"/>
         </w:rPr>
-        <w:t>DALLAS–FORT WORTH, TX   ·   213.***.7937   ·   EFRAIN@FRIN.BOT</w:t>
+        <w:t>DALLAS–FORT WORTH, TX</w:t>
       </w:r>
+      <w:r>
+        <w:rPr>
+          <w:rFonts w:ascii="JetBrains Mono" w:hAnsi="JetBrains Mono" w:cs="JetBrains Mono" w:eastAsia="JetBrains Mono"/>
+          <w:b w:val="0"/>
+          <w:i w:val="0"/>
+          <w:color w:val="3A3A3A"/>
+          <w:sz w:val="15"/>
+          <w:spacing w:val="20"/>
+        </w:rPr>
+        <w:t xml:space="preserve">   ·   </w:t>
+      </w:r>
+      <w:r>
+        <w:rPr>
+          <w:rFonts w:ascii="JetBrains Mono" w:hAnsi="JetBrains Mono" w:cs="JetBrains Mono" w:eastAsia="JetBrains Mono"/>
+          <w:b w:val="0"/>
+          <w:i w:val="0"/>
+          <w:color w:val="3A3A3A"/>
+          <w:sz w:val="15"/>
+          <w:spacing w:val="20"/>
+        </w:rPr>
+        <w:t>213.***.7937</w:t>
+      </w:r>
+      <w:r>
+        <w:rPr>
+          <w:rFonts w:ascii="JetBrains Mono" w:hAnsi="JetBrains Mono" w:cs="JetBrains Mono" w:eastAsia="JetBrains Mono"/>
+          <w:b w:val="0"/>
+          <w:i w:val="0"/>
+          <w:color w:val="3A3A3A"/>
+          <w:sz w:val="15"/>
+          <w:spacing w:val="20"/>
+        </w:rPr>
+        <w:t xml:space="preserve">   ·   </w:t>
+      </w:r>
+      <w:hyperlink r:id="rId12" w:history="1">
+        <w:r>
+          <w:rPr>
+            <w:rFonts w:ascii="JetBrains Mono" w:hAnsi="JetBrains Mono" w:cs="JetBrains Mono" w:eastAsia="JetBrains Mono"/>
+            <w:sz w:val="15"/>
+            <w:szCs w:val="15"/>
+            <w:color w:val="3A3A3A"/>
+            <w:u w:val="none"/>
+            <w:spacing w:val="20"/>
+          </w:rPr>
+          <w:t xml:space="preserve">EFRAIN@FRIN.BOT</w:t>
+        </w:r>
+      </w:hyperlink>
     </w:p>
     <w:p>
       <w:pPr>
@@ -135,6 +181,19 @@
           <w:bottom w:val="single" w:sz="4" w:space="4" w:color="DDD9D1"/>
         </w:pBdr>
       </w:pPr>
+      <w:hyperlink r:id="rId13" w:history="1">
+        <w:r>
+          <w:rPr>
+            <w:rFonts w:ascii="JetBrains Mono" w:hAnsi="JetBrains Mono" w:cs="JetBrains Mono" w:eastAsia="JetBrains Mono"/>
+            <w:sz w:val="15"/>
+            <w:szCs w:val="15"/>
+            <w:color w:val="3A3A3A"/>
+            <w:u w:val="none"/>
+            <w:spacing w:val="20"/>
+          </w:rPr>
+          <w:t xml:space="preserve">LINKEDIN.COM/IN/EFRAINP</w:t>
+        </w:r>
+      </w:hyperlink>
       <w:r>
         <w:rPr>
           <w:rFonts w:ascii="JetBrains Mono" w:hAnsi="JetBrains Mono" w:cs="JetBrains Mono" w:eastAsia="JetBrains Mono"/>
@@ -144,8 +203,45 @@
           <w:sz w:val="15"/>
           <w:spacing w:val="20"/>
         </w:rPr>
-        <w:t>LINKEDIN.COM/IN/EFRAINP   ·   X.COM/EFRAINPLASC   ·   GITHUB.COM/FRIN-BOT</w:t>
+        <w:t xml:space="preserve">   ·   </w:t>
       </w:r>
+      <w:hyperlink r:id="rId14" w:history="1">
+        <w:r>
+          <w:rPr>
+            <w:rFonts w:ascii="JetBrains Mono" w:hAnsi="JetBrains Mono" w:cs="JetBrains Mono" w:eastAsia="JetBrains Mono"/>
+            <w:sz w:val="15"/>
+            <w:szCs w:val="15"/>
+            <w:color w:val="3A3A3A"/>
+            <w:u w:val="none"/>
+            <w:spacing w:val="20"/>
+          </w:rPr>
+          <w:t xml:space="preserve">X.COM/EFRAINPLASC</w:t>
+        </w:r>
+      </w:hyperlink>
+      <w:r>
+        <w:rPr>
+          <w:rFonts w:ascii="JetBrains Mono" w:hAnsi="JetBrains Mono" w:cs="JetBrains Mono" w:eastAsia="JetBrains Mono"/>
+          <w:b w:val="0"/>
+          <w:i w:val="0"/>
+          <w:color w:val="3A3A3A"/>
+          <w:sz w:val="15"/>
+          <w:spacing w:val="20"/>
+        </w:rPr>
+        <w:t xml:space="preserve">   ·   </w:t>
+      </w:r>
+      <w:hyperlink r:id="rId15" w:history="1">
+        <w:r>
+          <w:rPr>
+            <w:rFonts w:ascii="JetBrains Mono" w:hAnsi="JetBrains Mono" w:cs="JetBrains Mono" w:eastAsia="JetBrains Mono"/>
+            <w:sz w:val="15"/>
+            <w:szCs w:val="15"/>
+            <w:color w:val="3A3A3A"/>
+            <w:u w:val="none"/>
+            <w:spacing w:val="20"/>
+          </w:rPr>
+          <w:t xml:space="preserve">GITHUB.COM/FRIN-BOT</w:t>
+        </w:r>
+      </w:hyperlink>
     </w:p>
     <w:p>
       <w:pPr>
@@ -1204,16 +1300,18 @@
           <w:top w:val="single" w:sz="4" w:space="4" w:color="DDD9D1"/>
         </w:pBdr>
       </w:pPr>
-      <w:r>
-        <w:rPr>
-          <w:rFonts w:ascii="Inter" w:hAnsi="Inter" w:cs="Inter" w:eastAsia="Inter"/>
-          <w:b w:val="0"/>
-          <w:i w:val="0"/>
-          <w:color w:val="3A3A3A"/>
-          <w:sz w:val="16"/>
-        </w:rPr>
-        <w:t>MIT xPRO 2025</w:t>
-      </w:r>
+      <w:hyperlink r:id="rId16" w:history="1">
+        <w:r>
+          <w:rPr>
+            <w:rFonts w:ascii="Inter" w:hAnsi="Inter" w:cs="Inter" w:eastAsia="Inter"/>
+            <w:sz w:val="16"/>
+            <w:szCs w:val="16"/>
+            <w:color w:val="3A3A3A"/>
+            <w:u w:val="none"/>
+          </w:rPr>
+          <w:t xml:space="preserve">MIT xPRO 2025</w:t>
+        </w:r>
+      </w:hyperlink>
       <w:r>
         <w:rPr>
           <w:rFonts w:ascii="JetBrains Mono" w:hAnsi="JetBrains Mono" w:cs="JetBrains Mono" w:eastAsia="JetBrains Mono"/>
@@ -1274,57 +1372,65 @@
       <w:spacing w:before="0" w:after="0"/>
       <w:jc w:val="right"/>
     </w:pPr>
-    <w:r>
-      <w:drawing>
-        <wp:inline xmlns:a="http://schemas.openxmlformats.org/drawingml/2006/main" xmlns:pic="http://schemas.openxmlformats.org/drawingml/2006/picture">
-          <wp:extent cx="475488" cy="475488"/>
-          <wp:docPr id="1" name="Picture 1"/>
-          <wp:cNvGraphicFramePr>
-            <a:graphicFrameLocks noChangeAspect="1"/>
-          </wp:cNvGraphicFramePr>
-          <a:graphic>
-            <a:graphicData uri="http://schemas.openxmlformats.org/drawingml/2006/picture">
-              <pic:pic>
-                <pic:nvPicPr>
-                  <pic:cNvPr id="0" name="qr_efrain_me.png"/>
-                  <pic:cNvPicPr/>
-                </pic:nvPicPr>
-                <pic:blipFill>
-                  <a:blip r:embed="rId1"/>
-                  <a:stretch>
-                    <a:fillRect/>
-                  </a:stretch>
-                </pic:blipFill>
-                <pic:spPr>
-                  <a:xfrm>
-                    <a:off x="0" y="0"/>
-                    <a:ext cx="475488" cy="475488"/>
-                  </a:xfrm>
-                  <a:prstGeom prst="rect"/>
-                </pic:spPr>
-              </pic:pic>
-            </a:graphicData>
-          </a:graphic>
-        </wp:inline>
-      </w:drawing>
-    </w:r>
+    <w:hyperlink r:id="rId2" w:history="1">
+      <w:r>
+        <w:drawing>
+          <wp:inline xmlns:a="http://schemas.openxmlformats.org/drawingml/2006/main" xmlns:pic="http://schemas.openxmlformats.org/drawingml/2006/picture">
+            <wp:extent cx="475488" cy="475488"/>
+            <wp:docPr id="1" name="Picture 1">
+              <a:hlinkClick r:id="rId2"/>
+            </wp:docPr>
+            <wp:cNvGraphicFramePr>
+              <a:graphicFrameLocks noChangeAspect="1"/>
+            </wp:cNvGraphicFramePr>
+            <a:graphic>
+              <a:graphicData uri="http://schemas.openxmlformats.org/drawingml/2006/picture">
+                <pic:pic>
+                  <pic:nvPicPr>
+                    <pic:cNvPr id="0" name="qr_efrain_me.png">
+                      <a:hlinkClick r:id="rId2"/>
+                    </pic:cNvPr>
+                    <pic:cNvPicPr/>
+                  </pic:nvPicPr>
+                  <pic:blipFill>
+                    <a:blip r:embed="rId1"/>
+                    <a:stretch>
+                      <a:fillRect/>
+                    </a:stretch>
+                  </pic:blipFill>
+                  <pic:spPr>
+                    <a:xfrm>
+                      <a:off x="0" y="0"/>
+                      <a:ext cx="475488" cy="475488"/>
+                    </a:xfrm>
+                    <a:prstGeom prst="rect"/>
+                  </pic:spPr>
+                </pic:pic>
+              </a:graphicData>
+            </a:graphic>
+          </wp:inline>
+        </w:drawing>
+      </w:r>
+    </w:hyperlink>
   </w:p>
   <w:p>
     <w:pPr>
       <w:spacing w:before="20" w:after="0"/>
       <w:jc w:val="right"/>
     </w:pPr>
-    <w:r>
-      <w:rPr>
-        <w:rFonts w:ascii="JetBrains Mono" w:hAnsi="JetBrains Mono" w:cs="JetBrains Mono" w:eastAsia="JetBrains Mono"/>
-        <w:b w:val="0"/>
-        <w:i w:val="0"/>
-        <w:color w:val="6A6A6A"/>
-        <w:sz w:val="13"/>
-        <w:spacing w:val="16"/>
-      </w:rPr>
-      <w:t>COMPANION SITE</w:t>
-    </w:r>
+    <w:hyperlink r:id="rId2" w:history="1">
+      <w:r>
+        <w:rPr>
+          <w:rFonts w:ascii="JetBrains Mono" w:hAnsi="JetBrains Mono" w:cs="JetBrains Mono" w:eastAsia="JetBrains Mono"/>
+          <w:sz w:val="13"/>
+          <w:szCs w:val="13"/>
+          <w:color w:val="6A6A6A"/>
+          <w:u w:val="none"/>
+          <w:spacing w:val="16"/>
+        </w:rPr>
+        <w:t xml:space="preserve">COMPANION SITE</w:t>
+      </w:r>
+    </w:hyperlink>
   </w:p>
 </w:ftr>
 </file>

</xml_diff>

<commit_message>
fix: drop Technical pre-sales; show resume links as blue underline
Compact core competencies no longer include Technical pre-sales.
Hyperlinks render as underlined #0563C1 so they read as links on the PDF.
</commit_message>
<xml_diff>
--- a/uploads/Efrain_Plascencia_Resume.docx
+++ b/uploads/Efrain_Plascencia_Resume.docx
@@ -165,8 +165,8 @@
             <w:rFonts w:ascii="JetBrains Mono" w:hAnsi="JetBrains Mono" w:cs="JetBrains Mono" w:eastAsia="JetBrains Mono"/>
             <w:sz w:val="15"/>
             <w:szCs w:val="15"/>
-            <w:color w:val="3A3A3A"/>
-            <w:u w:val="none"/>
+            <w:color w:val="0563C1"/>
+            <w:u w:val="single" w:color="0563C1"/>
             <w:spacing w:val="20"/>
           </w:rPr>
           <w:t xml:space="preserve">EFRAIN@FRIN.BOT</w:t>
@@ -187,8 +187,8 @@
             <w:rFonts w:ascii="JetBrains Mono" w:hAnsi="JetBrains Mono" w:cs="JetBrains Mono" w:eastAsia="JetBrains Mono"/>
             <w:sz w:val="15"/>
             <w:szCs w:val="15"/>
-            <w:color w:val="3A3A3A"/>
-            <w:u w:val="none"/>
+            <w:color w:val="0563C1"/>
+            <w:u w:val="single" w:color="0563C1"/>
             <w:spacing w:val="20"/>
           </w:rPr>
           <w:t xml:space="preserve">LINKEDIN.COM/IN/EFRAINP</w:t>
@@ -211,8 +211,8 @@
             <w:rFonts w:ascii="JetBrains Mono" w:hAnsi="JetBrains Mono" w:cs="JetBrains Mono" w:eastAsia="JetBrains Mono"/>
             <w:sz w:val="15"/>
             <w:szCs w:val="15"/>
-            <w:color w:val="3A3A3A"/>
-            <w:u w:val="none"/>
+            <w:color w:val="0563C1"/>
+            <w:u w:val="single" w:color="0563C1"/>
             <w:spacing w:val="20"/>
           </w:rPr>
           <w:t xml:space="preserve">X.COM/EFRAINPLASC</w:t>
@@ -235,8 +235,8 @@
             <w:rFonts w:ascii="JetBrains Mono" w:hAnsi="JetBrains Mono" w:cs="JetBrains Mono" w:eastAsia="JetBrains Mono"/>
             <w:sz w:val="15"/>
             <w:szCs w:val="15"/>
-            <w:color w:val="3A3A3A"/>
-            <w:u w:val="none"/>
+            <w:color w:val="0563C1"/>
+            <w:u w:val="single" w:color="0563C1"/>
             <w:spacing w:val="20"/>
           </w:rPr>
           <w:t xml:space="preserve">GITHUB.COM/FRIN-BOT</w:t>
@@ -411,26 +411,6 @@
           <w:sz w:val="18"/>
         </w:rPr>
         <w:t>Requirements &amp; scoping</w:t>
-      </w:r>
-      <w:r>
-        <w:rPr>
-          <w:rFonts w:ascii="JetBrains Mono" w:hAnsi="JetBrains Mono" w:cs="JetBrains Mono" w:eastAsia="JetBrains Mono"/>
-          <w:b w:val="0"/>
-          <w:i w:val="0"/>
-          <w:color w:val="A8A5A0"/>
-          <w:sz w:val="16"/>
-        </w:rPr>
-        <w:t xml:space="preserve">  ·  </w:t>
-      </w:r>
-      <w:r>
-        <w:rPr>
-          <w:rFonts w:ascii="Inter" w:hAnsi="Inter" w:cs="Inter" w:eastAsia="Inter"/>
-          <w:b w:val="0"/>
-          <w:i w:val="0"/>
-          <w:color w:val="3A3A3A"/>
-          <w:sz w:val="18"/>
-        </w:rPr>
-        <w:t>Technical pre-sales</w:t>
       </w:r>
       <w:r>
         <w:rPr>
@@ -1306,8 +1286,8 @@
             <w:rFonts w:ascii="Inter" w:hAnsi="Inter" w:cs="Inter" w:eastAsia="Inter"/>
             <w:sz w:val="16"/>
             <w:szCs w:val="16"/>
-            <w:color w:val="3A3A3A"/>
-            <w:u w:val="none"/>
+            <w:color w:val="0563C1"/>
+            <w:u w:val="single" w:color="0563C1"/>
           </w:rPr>
           <w:t xml:space="preserve">MIT xPRO 2025</w:t>
         </w:r>
@@ -1424,8 +1404,8 @@
           <w:rFonts w:ascii="JetBrains Mono" w:hAnsi="JetBrains Mono" w:cs="JetBrains Mono" w:eastAsia="JetBrains Mono"/>
           <w:sz w:val="13"/>
           <w:szCs w:val="13"/>
-          <w:color w:val="6A6A6A"/>
-          <w:u w:val="none"/>
+          <w:color w:val="0563C1"/>
+          <w:u w:val="single" w:color="0563C1"/>
           <w:spacing w:val="16"/>
         </w:rPr>
         <w:t xml:space="preserve">COMPANION SITE</w:t>

</xml_diff>

<commit_message>
fix: drop Technical pre-sales; show resume links as blue underline (#5)
Compact core competencies no longer include Technical pre-sales.
Hyperlinks render as underlined #0563C1 so they read as links on the PDF.
</commit_message>
<xml_diff>
--- a/uploads/Efrain_Plascencia_Resume.docx
+++ b/uploads/Efrain_Plascencia_Resume.docx
@@ -165,8 +165,8 @@
             <w:rFonts w:ascii="JetBrains Mono" w:hAnsi="JetBrains Mono" w:cs="JetBrains Mono" w:eastAsia="JetBrains Mono"/>
             <w:sz w:val="15"/>
             <w:szCs w:val="15"/>
-            <w:color w:val="3A3A3A"/>
-            <w:u w:val="none"/>
+            <w:color w:val="0563C1"/>
+            <w:u w:val="single" w:color="0563C1"/>
             <w:spacing w:val="20"/>
           </w:rPr>
           <w:t xml:space="preserve">EFRAIN@FRIN.BOT</w:t>
@@ -187,8 +187,8 @@
             <w:rFonts w:ascii="JetBrains Mono" w:hAnsi="JetBrains Mono" w:cs="JetBrains Mono" w:eastAsia="JetBrains Mono"/>
             <w:sz w:val="15"/>
             <w:szCs w:val="15"/>
-            <w:color w:val="3A3A3A"/>
-            <w:u w:val="none"/>
+            <w:color w:val="0563C1"/>
+            <w:u w:val="single" w:color="0563C1"/>
             <w:spacing w:val="20"/>
           </w:rPr>
           <w:t xml:space="preserve">LINKEDIN.COM/IN/EFRAINP</w:t>
@@ -211,8 +211,8 @@
             <w:rFonts w:ascii="JetBrains Mono" w:hAnsi="JetBrains Mono" w:cs="JetBrains Mono" w:eastAsia="JetBrains Mono"/>
             <w:sz w:val="15"/>
             <w:szCs w:val="15"/>
-            <w:color w:val="3A3A3A"/>
-            <w:u w:val="none"/>
+            <w:color w:val="0563C1"/>
+            <w:u w:val="single" w:color="0563C1"/>
             <w:spacing w:val="20"/>
           </w:rPr>
           <w:t xml:space="preserve">X.COM/EFRAINPLASC</w:t>
@@ -235,8 +235,8 @@
             <w:rFonts w:ascii="JetBrains Mono" w:hAnsi="JetBrains Mono" w:cs="JetBrains Mono" w:eastAsia="JetBrains Mono"/>
             <w:sz w:val="15"/>
             <w:szCs w:val="15"/>
-            <w:color w:val="3A3A3A"/>
-            <w:u w:val="none"/>
+            <w:color w:val="0563C1"/>
+            <w:u w:val="single" w:color="0563C1"/>
             <w:spacing w:val="20"/>
           </w:rPr>
           <w:t xml:space="preserve">GITHUB.COM/FRIN-BOT</w:t>
@@ -411,26 +411,6 @@
           <w:sz w:val="18"/>
         </w:rPr>
         <w:t>Requirements &amp; scoping</w:t>
-      </w:r>
-      <w:r>
-        <w:rPr>
-          <w:rFonts w:ascii="JetBrains Mono" w:hAnsi="JetBrains Mono" w:cs="JetBrains Mono" w:eastAsia="JetBrains Mono"/>
-          <w:b w:val="0"/>
-          <w:i w:val="0"/>
-          <w:color w:val="A8A5A0"/>
-          <w:sz w:val="16"/>
-        </w:rPr>
-        <w:t xml:space="preserve">  ·  </w:t>
-      </w:r>
-      <w:r>
-        <w:rPr>
-          <w:rFonts w:ascii="Inter" w:hAnsi="Inter" w:cs="Inter" w:eastAsia="Inter"/>
-          <w:b w:val="0"/>
-          <w:i w:val="0"/>
-          <w:color w:val="3A3A3A"/>
-          <w:sz w:val="18"/>
-        </w:rPr>
-        <w:t>Technical pre-sales</w:t>
       </w:r>
       <w:r>
         <w:rPr>
@@ -1306,8 +1286,8 @@
             <w:rFonts w:ascii="Inter" w:hAnsi="Inter" w:cs="Inter" w:eastAsia="Inter"/>
             <w:sz w:val="16"/>
             <w:szCs w:val="16"/>
-            <w:color w:val="3A3A3A"/>
-            <w:u w:val="none"/>
+            <w:color w:val="0563C1"/>
+            <w:u w:val="single" w:color="0563C1"/>
           </w:rPr>
           <w:t xml:space="preserve">MIT xPRO 2025</w:t>
         </w:r>
@@ -1424,8 +1404,8 @@
           <w:rFonts w:ascii="JetBrains Mono" w:hAnsi="JetBrains Mono" w:cs="JetBrains Mono" w:eastAsia="JetBrains Mono"/>
           <w:sz w:val="13"/>
           <w:szCs w:val="13"/>
-          <w:color w:val="6A6A6A"/>
-          <w:u w:val="none"/>
+          <w:color w:val="0563C1"/>
+          <w:u w:val="single" w:color="0563C1"/>
           <w:spacing w:val="16"/>
         </w:rPr>
         <w:t xml:space="preserve">COMPANION SITE</w:t>

</xml_diff>

<commit_message>
Update experience copy and make job-card links real.
Replace each role's site bullets and resume bullets with the approved text, render http(s) markdown links as anchors on the page, and keep the downloadable resume as plain text without the old headcount claim.

Co-authored-by: frin-bot <frin-bot@users.noreply.github.com>
</commit_message>
<xml_diff>
--- a/uploads/Efrain_Plascencia_Resume.docx
+++ b/uploads/Efrain_Plascencia_Resume.docx
@@ -50,7 +50,7 @@
       <w:r>
         <w:drawing>
           <wp:inline xmlns:a="http://schemas.openxmlformats.org/drawingml/2006/main" xmlns:pic="http://schemas.openxmlformats.org/drawingml/2006/picture">
-            <wp:extent cx="1633537" cy="234950"/>
+            <wp:extent cx="1631950" cy="234950"/>
             <wp:docPr id="2" name="Picture 2"/>
             <wp:cNvGraphicFramePr>
               <a:graphicFrameLocks noChangeAspect="1"/>
@@ -71,7 +71,7 @@
                   <pic:spPr>
                     <a:xfrm>
                       <a:off x="0" y="0"/>
-                      <a:ext cx="1633537" cy="234950"/>
+                      <a:ext cx="1631950" cy="234950"/>
                     </a:xfrm>
                     <a:prstGeom prst="rect"/>
                   </pic:spPr>
@@ -245,7 +245,7 @@
     </w:p>
     <w:p>
       <w:pPr>
-        <w:spacing w:before="160" w:after="60"/>
+        <w:spacing w:before="120" w:after="60"/>
         <w:pBdr>
           <w:bottom w:val="single" w:sz="4" w:space="4" w:color="DDD9D1"/>
         </w:pBdr>
@@ -275,7 +275,7 @@
     </w:p>
     <w:p>
       <w:pPr>
-        <w:spacing w:after="40" w:line="276" w:lineRule="auto"/>
+        <w:spacing w:after="40" w:line="240" w:lineRule="auto"/>
       </w:pPr>
       <w:r>
         <w:rPr>
@@ -290,7 +290,7 @@
     </w:p>
     <w:p>
       <w:pPr>
-        <w:spacing w:before="160" w:after="60"/>
+        <w:spacing w:before="120" w:after="60"/>
         <w:pBdr>
           <w:bottom w:val="single" w:sz="4" w:space="4" w:color="DDD9D1"/>
         </w:pBdr>
@@ -320,7 +320,7 @@
     </w:p>
     <w:p>
       <w:pPr>
-        <w:spacing w:after="40" w:line="276" w:lineRule="auto"/>
+        <w:spacing w:after="40" w:line="240" w:lineRule="auto"/>
       </w:pPr>
       <w:r>
         <w:rPr>
@@ -455,7 +455,7 @@
     </w:p>
     <w:p>
       <w:pPr>
-        <w:spacing w:before="160" w:after="60"/>
+        <w:spacing w:before="120" w:after="60"/>
         <w:pBdr>
           <w:bottom w:val="single" w:sz="4" w:space="4" w:color="DDD9D1"/>
         </w:pBdr>
@@ -485,7 +485,7 @@
     </w:p>
     <w:p>
       <w:pPr>
-        <w:spacing w:before="100" w:after="0"/>
+        <w:spacing w:before="60" w:after="0"/>
         <w:tabs>
           <w:tab w:val="right" w:pos="10800"/>
         </w:tabs>
@@ -564,7 +564,7 @@
     </w:p>
     <w:p>
       <w:pPr>
-        <w:spacing w:before="20" w:after="20" w:line="269" w:lineRule="auto"/>
+        <w:spacing w:before="20" w:after="20" w:line="240" w:lineRule="auto"/>
         <w:ind w:left="259" w:hanging="259"/>
       </w:pPr>
       <w:r>
@@ -585,12 +585,12 @@
           <w:color w:val="3A3A3A"/>
           <w:sz w:val="18"/>
         </w:rPr>
-        <w:t>Joined as OTA Test Manager; promoted twice in two years to Director of AI Deployment &amp; Solutions — leading NA AI systems, commercial strategy, and technical recruiting across Mercedes-Benz, Porsche, and NVIDIA engagements.</w:t>
+        <w:t>Promoted twice in two years, from OTA Test Manager to Director of AI Deployment &amp; Solutions, on Mercedes-Benz, Porsche, and NVIDIA engagements.</w:t>
       </w:r>
     </w:p>
     <w:p>
       <w:pPr>
-        <w:spacing w:before="20" w:after="20" w:line="269" w:lineRule="auto"/>
+        <w:spacing w:before="20" w:after="20" w:line="240" w:lineRule="auto"/>
         <w:ind w:left="259" w:hanging="259"/>
       </w:pPr>
       <w:r>
@@ -611,12 +611,12 @@
           <w:color w:val="3A3A3A"/>
           <w:sz w:val="18"/>
         </w:rPr>
-        <w:t>Shipped production AI: an agentic intelligence pipeline with rubric scoring and threshold gating; a containerized FastAPI billing service for NVIDIA; Python pipelines that turn JIRA exports into executive decks and score candidates against job descriptions.</w:t>
+        <w:t>Led North American OTA validation for Porsche's E³ 1.2 architecture on the all-electric Macan, and helped grow the company from 7 to 35 employees.</w:t>
       </w:r>
     </w:p>
     <w:p>
       <w:pPr>
-        <w:spacing w:before="20" w:after="20" w:line="269" w:lineRule="auto"/>
+        <w:spacing w:before="20" w:after="20" w:line="240" w:lineRule="auto"/>
         <w:ind w:left="259" w:hanging="259"/>
       </w:pPr>
       <w:r>
@@ -637,12 +637,12 @@
           <w:color w:val="3A3A3A"/>
           <w:sz w:val="18"/>
         </w:rPr>
-        <w:t>Built the NA engineering team from scratch — 300% headcount growth — and served as primary technical liaison on infotainment, domain-controller, and SDV programs.</w:t>
+        <w:t>Built production AI tools: a weekly intelligence system screening 25 companies, an NVIDIA billing service saving about 100 hours a month, and a deck pipeline that cut a week of work to 15 minutes.</w:t>
       </w:r>
     </w:p>
     <w:p>
       <w:pPr>
-        <w:spacing w:before="100" w:after="0"/>
+        <w:spacing w:before="60" w:after="0"/>
         <w:tabs>
           <w:tab w:val="right" w:pos="10800"/>
         </w:tabs>
@@ -721,7 +721,7 @@
     </w:p>
     <w:p>
       <w:pPr>
-        <w:spacing w:before="20" w:after="20" w:line="269" w:lineRule="auto"/>
+        <w:spacing w:before="20" w:after="20" w:line="240" w:lineRule="auto"/>
         <w:ind w:left="259" w:hanging="259"/>
       </w:pPr>
       <w:r>
@@ -742,12 +742,12 @@
           <w:color w:val="3A3A3A"/>
           <w:sz w:val="18"/>
         </w:rPr>
-        <w:t>Led end-to-end validation of a new commercial-vehicle E/E architecture — ECU communication, diagnostics, and backend integration — coordinating Tier-1s and embedded teams to aggressive release milestones.</w:t>
+        <w:t>Tested PACCAR's next-generation Ethernet-based EMUX architecture for Kenworth and Peterbilt trucks, including dual-boot ECUs, working with Tier-1 suppliers.</w:t>
       </w:r>
     </w:p>
     <w:p>
       <w:pPr>
-        <w:spacing w:before="100" w:after="0"/>
+        <w:spacing w:before="60" w:after="0"/>
         <w:tabs>
           <w:tab w:val="right" w:pos="10800"/>
         </w:tabs>
@@ -826,7 +826,7 @@
     </w:p>
     <w:p>
       <w:pPr>
-        <w:spacing w:before="20" w:after="20" w:line="269" w:lineRule="auto"/>
+        <w:spacing w:before="20" w:after="20" w:line="240" w:lineRule="auto"/>
         <w:ind w:left="259" w:hanging="259"/>
       </w:pPr>
       <w:r>
@@ -847,12 +847,12 @@
           <w:color w:val="3A3A3A"/>
           <w:sz w:val="18"/>
         </w:rPr>
-        <w:t>Owned end-to-end validation of user-profile, registration, and account-activation flows across app, head unit, and cloud for Toyota connected services — technical escalation and global defect triage with Japan HQ.</w:t>
+        <w:t>Validated registration, enrollment, and payment flows for Toyota and Lexus connected services across app, head unit, and cloud, with weekly deployments and smoke testing.</w:t>
       </w:r>
     </w:p>
     <w:p>
       <w:pPr>
-        <w:spacing w:before="100" w:after="0"/>
+        <w:spacing w:before="60" w:after="0"/>
         <w:tabs>
           <w:tab w:val="right" w:pos="10800"/>
         </w:tabs>
@@ -931,7 +931,7 @@
     </w:p>
     <w:p>
       <w:pPr>
-        <w:spacing w:before="20" w:after="20" w:line="269" w:lineRule="auto"/>
+        <w:spacing w:before="20" w:after="20" w:line="240" w:lineRule="auto"/>
         <w:ind w:left="259" w:hanging="259"/>
       </w:pPr>
       <w:r>
@@ -952,12 +952,12 @@
           <w:color w:val="3A3A3A"/>
           <w:sz w:val="18"/>
         </w:rPr>
-        <w:t>Led end-to-end testing of integrated vehicle systems — head unit, smartphones, digital assistants (Siri, Alexa), wearables, and IoT devices — on premium infotainment and telematics platforms, closing cross-system integration defects for multi-market launches.</w:t>
+        <w:t>Led end-to-end testing of Mercedes me and MBUX across 14 models and up to 3 head unit variants, supporting the US and Mexico launch.</w:t>
       </w:r>
     </w:p>
     <w:p>
       <w:pPr>
-        <w:spacing w:before="100" w:after="0"/>
+        <w:spacing w:before="60" w:after="0"/>
         <w:tabs>
           <w:tab w:val="right" w:pos="10800"/>
         </w:tabs>
@@ -1036,7 +1036,7 @@
     </w:p>
     <w:p>
       <w:pPr>
-        <w:spacing w:before="20" w:after="20" w:line="269" w:lineRule="auto"/>
+        <w:spacing w:before="20" w:after="20" w:line="240" w:lineRule="auto"/>
         <w:ind w:left="259" w:hanging="259"/>
       </w:pPr>
       <w:r>
@@ -1057,12 +1057,12 @@
           <w:color w:val="3A3A3A"/>
           <w:sz w:val="18"/>
         </w:rPr>
-        <w:t>Designed QA processes for Hyundai telematics — DCM, head unit, and backend connectivity — validating hardware–software integrations across embedded firmware, cloud APIs, and mobile clients in a startup-scale environment.</w:t>
+        <w:t>Supported QA for Hyundai Blue Link and Kia UVO telematics across 20+ models, on a platform recognized at CES 2014 and 2015.</w:t>
       </w:r>
     </w:p>
     <w:p>
       <w:pPr>
-        <w:spacing w:before="100" w:after="0"/>
+        <w:spacing w:before="60" w:after="0"/>
         <w:tabs>
           <w:tab w:val="right" w:pos="10800"/>
         </w:tabs>
@@ -1141,7 +1141,7 @@
     </w:p>
     <w:p>
       <w:pPr>
-        <w:spacing w:before="160" w:after="60"/>
+        <w:spacing w:before="120" w:after="60"/>
         <w:pBdr>
           <w:bottom w:val="single" w:sz="4" w:space="4" w:color="DDD9D1"/>
         </w:pBdr>
@@ -1171,7 +1171,7 @@
     </w:p>
     <w:p>
       <w:pPr>
-        <w:spacing w:before="20" w:after="20" w:line="264" w:lineRule="auto"/>
+        <w:spacing w:before="20" w:after="20" w:line="240" w:lineRule="auto"/>
       </w:pPr>
       <w:r>
         <w:rPr>
@@ -1197,7 +1197,7 @@
     </w:p>
     <w:p>
       <w:pPr>
-        <w:spacing w:before="20" w:after="20" w:line="264" w:lineRule="auto"/>
+        <w:spacing w:before="20" w:after="20" w:line="240" w:lineRule="auto"/>
       </w:pPr>
       <w:r>
         <w:rPr>
@@ -1223,7 +1223,7 @@
     </w:p>
     <w:p>
       <w:pPr>
-        <w:spacing w:before="20" w:after="20" w:line="264" w:lineRule="auto"/>
+        <w:spacing w:before="20" w:after="20" w:line="240" w:lineRule="auto"/>
       </w:pPr>
       <w:r>
         <w:rPr>
@@ -1249,7 +1249,7 @@
     </w:p>
     <w:p>
       <w:pPr>
-        <w:spacing w:before="20" w:after="20" w:line="264" w:lineRule="auto"/>
+        <w:spacing w:before="20" w:after="20" w:line="240" w:lineRule="auto"/>
       </w:pPr>
       <w:r>
         <w:rPr>
@@ -1275,7 +1275,7 @@
     </w:p>
     <w:p>
       <w:pPr>
-        <w:spacing w:before="120" w:after="0" w:line="264" w:lineRule="auto"/>
+        <w:spacing w:before="80" w:after="0" w:line="240" w:lineRule="auto"/>
         <w:pBdr>
           <w:top w:val="single" w:sz="4" w:space="4" w:color="DDD9D1"/>
         </w:pBdr>

</xml_diff>

<commit_message>
Update experience copy and make job-card links real. (#6)
Replace each role's site bullets and resume bullets with the approved text, render http(s) markdown links as anchors on the page, and keep the downloadable resume as plain text without the old headcount claim.

Co-authored-by: Cursor Agent <cursoragent@cursor.com>
Co-authored-by: frin-bot <frin-bot@users.noreply.github.com>
</commit_message>
<xml_diff>
--- a/uploads/Efrain_Plascencia_Resume.docx
+++ b/uploads/Efrain_Plascencia_Resume.docx
@@ -50,7 +50,7 @@
       <w:r>
         <w:drawing>
           <wp:inline xmlns:a="http://schemas.openxmlformats.org/drawingml/2006/main" xmlns:pic="http://schemas.openxmlformats.org/drawingml/2006/picture">
-            <wp:extent cx="1633537" cy="234950"/>
+            <wp:extent cx="1631950" cy="234950"/>
             <wp:docPr id="2" name="Picture 2"/>
             <wp:cNvGraphicFramePr>
               <a:graphicFrameLocks noChangeAspect="1"/>
@@ -71,7 +71,7 @@
                   <pic:spPr>
                     <a:xfrm>
                       <a:off x="0" y="0"/>
-                      <a:ext cx="1633537" cy="234950"/>
+                      <a:ext cx="1631950" cy="234950"/>
                     </a:xfrm>
                     <a:prstGeom prst="rect"/>
                   </pic:spPr>
@@ -245,7 +245,7 @@
     </w:p>
     <w:p>
       <w:pPr>
-        <w:spacing w:before="160" w:after="60"/>
+        <w:spacing w:before="120" w:after="60"/>
         <w:pBdr>
           <w:bottom w:val="single" w:sz="4" w:space="4" w:color="DDD9D1"/>
         </w:pBdr>
@@ -275,7 +275,7 @@
     </w:p>
     <w:p>
       <w:pPr>
-        <w:spacing w:after="40" w:line="276" w:lineRule="auto"/>
+        <w:spacing w:after="40" w:line="240" w:lineRule="auto"/>
       </w:pPr>
       <w:r>
         <w:rPr>
@@ -290,7 +290,7 @@
     </w:p>
     <w:p>
       <w:pPr>
-        <w:spacing w:before="160" w:after="60"/>
+        <w:spacing w:before="120" w:after="60"/>
         <w:pBdr>
           <w:bottom w:val="single" w:sz="4" w:space="4" w:color="DDD9D1"/>
         </w:pBdr>
@@ -320,7 +320,7 @@
     </w:p>
     <w:p>
       <w:pPr>
-        <w:spacing w:after="40" w:line="276" w:lineRule="auto"/>
+        <w:spacing w:after="40" w:line="240" w:lineRule="auto"/>
       </w:pPr>
       <w:r>
         <w:rPr>
@@ -455,7 +455,7 @@
     </w:p>
     <w:p>
       <w:pPr>
-        <w:spacing w:before="160" w:after="60"/>
+        <w:spacing w:before="120" w:after="60"/>
         <w:pBdr>
           <w:bottom w:val="single" w:sz="4" w:space="4" w:color="DDD9D1"/>
         </w:pBdr>
@@ -485,7 +485,7 @@
     </w:p>
     <w:p>
       <w:pPr>
-        <w:spacing w:before="100" w:after="0"/>
+        <w:spacing w:before="60" w:after="0"/>
         <w:tabs>
           <w:tab w:val="right" w:pos="10800"/>
         </w:tabs>
@@ -564,7 +564,7 @@
     </w:p>
     <w:p>
       <w:pPr>
-        <w:spacing w:before="20" w:after="20" w:line="269" w:lineRule="auto"/>
+        <w:spacing w:before="20" w:after="20" w:line="240" w:lineRule="auto"/>
         <w:ind w:left="259" w:hanging="259"/>
       </w:pPr>
       <w:r>
@@ -585,12 +585,12 @@
           <w:color w:val="3A3A3A"/>
           <w:sz w:val="18"/>
         </w:rPr>
-        <w:t>Joined as OTA Test Manager; promoted twice in two years to Director of AI Deployment &amp; Solutions — leading NA AI systems, commercial strategy, and technical recruiting across Mercedes-Benz, Porsche, and NVIDIA engagements.</w:t>
+        <w:t>Promoted twice in two years, from OTA Test Manager to Director of AI Deployment &amp; Solutions, on Mercedes-Benz, Porsche, and NVIDIA engagements.</w:t>
       </w:r>
     </w:p>
     <w:p>
       <w:pPr>
-        <w:spacing w:before="20" w:after="20" w:line="269" w:lineRule="auto"/>
+        <w:spacing w:before="20" w:after="20" w:line="240" w:lineRule="auto"/>
         <w:ind w:left="259" w:hanging="259"/>
       </w:pPr>
       <w:r>
@@ -611,12 +611,12 @@
           <w:color w:val="3A3A3A"/>
           <w:sz w:val="18"/>
         </w:rPr>
-        <w:t>Shipped production AI: an agentic intelligence pipeline with rubric scoring and threshold gating; a containerized FastAPI billing service for NVIDIA; Python pipelines that turn JIRA exports into executive decks and score candidates against job descriptions.</w:t>
+        <w:t>Led North American OTA validation for Porsche's E³ 1.2 architecture on the all-electric Macan, and helped grow the company from 7 to 35 employees.</w:t>
       </w:r>
     </w:p>
     <w:p>
       <w:pPr>
-        <w:spacing w:before="20" w:after="20" w:line="269" w:lineRule="auto"/>
+        <w:spacing w:before="20" w:after="20" w:line="240" w:lineRule="auto"/>
         <w:ind w:left="259" w:hanging="259"/>
       </w:pPr>
       <w:r>
@@ -637,12 +637,12 @@
           <w:color w:val="3A3A3A"/>
           <w:sz w:val="18"/>
         </w:rPr>
-        <w:t>Built the NA engineering team from scratch — 300% headcount growth — and served as primary technical liaison on infotainment, domain-controller, and SDV programs.</w:t>
+        <w:t>Built production AI tools: a weekly intelligence system screening 25 companies, an NVIDIA billing service saving about 100 hours a month, and a deck pipeline that cut a week of work to 15 minutes.</w:t>
       </w:r>
     </w:p>
     <w:p>
       <w:pPr>
-        <w:spacing w:before="100" w:after="0"/>
+        <w:spacing w:before="60" w:after="0"/>
         <w:tabs>
           <w:tab w:val="right" w:pos="10800"/>
         </w:tabs>
@@ -721,7 +721,7 @@
     </w:p>
     <w:p>
       <w:pPr>
-        <w:spacing w:before="20" w:after="20" w:line="269" w:lineRule="auto"/>
+        <w:spacing w:before="20" w:after="20" w:line="240" w:lineRule="auto"/>
         <w:ind w:left="259" w:hanging="259"/>
       </w:pPr>
       <w:r>
@@ -742,12 +742,12 @@
           <w:color w:val="3A3A3A"/>
           <w:sz w:val="18"/>
         </w:rPr>
-        <w:t>Led end-to-end validation of a new commercial-vehicle E/E architecture — ECU communication, diagnostics, and backend integration — coordinating Tier-1s and embedded teams to aggressive release milestones.</w:t>
+        <w:t>Tested PACCAR's next-generation Ethernet-based EMUX architecture for Kenworth and Peterbilt trucks, including dual-boot ECUs, working with Tier-1 suppliers.</w:t>
       </w:r>
     </w:p>
     <w:p>
       <w:pPr>
-        <w:spacing w:before="100" w:after="0"/>
+        <w:spacing w:before="60" w:after="0"/>
         <w:tabs>
           <w:tab w:val="right" w:pos="10800"/>
         </w:tabs>
@@ -826,7 +826,7 @@
     </w:p>
     <w:p>
       <w:pPr>
-        <w:spacing w:before="20" w:after="20" w:line="269" w:lineRule="auto"/>
+        <w:spacing w:before="20" w:after="20" w:line="240" w:lineRule="auto"/>
         <w:ind w:left="259" w:hanging="259"/>
       </w:pPr>
       <w:r>
@@ -847,12 +847,12 @@
           <w:color w:val="3A3A3A"/>
           <w:sz w:val="18"/>
         </w:rPr>
-        <w:t>Owned end-to-end validation of user-profile, registration, and account-activation flows across app, head unit, and cloud for Toyota connected services — technical escalation and global defect triage with Japan HQ.</w:t>
+        <w:t>Validated registration, enrollment, and payment flows for Toyota and Lexus connected services across app, head unit, and cloud, with weekly deployments and smoke testing.</w:t>
       </w:r>
     </w:p>
     <w:p>
       <w:pPr>
-        <w:spacing w:before="100" w:after="0"/>
+        <w:spacing w:before="60" w:after="0"/>
         <w:tabs>
           <w:tab w:val="right" w:pos="10800"/>
         </w:tabs>
@@ -931,7 +931,7 @@
     </w:p>
     <w:p>
       <w:pPr>
-        <w:spacing w:before="20" w:after="20" w:line="269" w:lineRule="auto"/>
+        <w:spacing w:before="20" w:after="20" w:line="240" w:lineRule="auto"/>
         <w:ind w:left="259" w:hanging="259"/>
       </w:pPr>
       <w:r>
@@ -952,12 +952,12 @@
           <w:color w:val="3A3A3A"/>
           <w:sz w:val="18"/>
         </w:rPr>
-        <w:t>Led end-to-end testing of integrated vehicle systems — head unit, smartphones, digital assistants (Siri, Alexa), wearables, and IoT devices — on premium infotainment and telematics platforms, closing cross-system integration defects for multi-market launches.</w:t>
+        <w:t>Led end-to-end testing of Mercedes me and MBUX across 14 models and up to 3 head unit variants, supporting the US and Mexico launch.</w:t>
       </w:r>
     </w:p>
     <w:p>
       <w:pPr>
-        <w:spacing w:before="100" w:after="0"/>
+        <w:spacing w:before="60" w:after="0"/>
         <w:tabs>
           <w:tab w:val="right" w:pos="10800"/>
         </w:tabs>
@@ -1036,7 +1036,7 @@
     </w:p>
     <w:p>
       <w:pPr>
-        <w:spacing w:before="20" w:after="20" w:line="269" w:lineRule="auto"/>
+        <w:spacing w:before="20" w:after="20" w:line="240" w:lineRule="auto"/>
         <w:ind w:left="259" w:hanging="259"/>
       </w:pPr>
       <w:r>
@@ -1057,12 +1057,12 @@
           <w:color w:val="3A3A3A"/>
           <w:sz w:val="18"/>
         </w:rPr>
-        <w:t>Designed QA processes for Hyundai telematics — DCM, head unit, and backend connectivity — validating hardware–software integrations across embedded firmware, cloud APIs, and mobile clients in a startup-scale environment.</w:t>
+        <w:t>Supported QA for Hyundai Blue Link and Kia UVO telematics across 20+ models, on a platform recognized at CES 2014 and 2015.</w:t>
       </w:r>
     </w:p>
     <w:p>
       <w:pPr>
-        <w:spacing w:before="100" w:after="0"/>
+        <w:spacing w:before="60" w:after="0"/>
         <w:tabs>
           <w:tab w:val="right" w:pos="10800"/>
         </w:tabs>
@@ -1141,7 +1141,7 @@
     </w:p>
     <w:p>
       <w:pPr>
-        <w:spacing w:before="160" w:after="60"/>
+        <w:spacing w:before="120" w:after="60"/>
         <w:pBdr>
           <w:bottom w:val="single" w:sz="4" w:space="4" w:color="DDD9D1"/>
         </w:pBdr>
@@ -1171,7 +1171,7 @@
     </w:p>
     <w:p>
       <w:pPr>
-        <w:spacing w:before="20" w:after="20" w:line="264" w:lineRule="auto"/>
+        <w:spacing w:before="20" w:after="20" w:line="240" w:lineRule="auto"/>
       </w:pPr>
       <w:r>
         <w:rPr>
@@ -1197,7 +1197,7 @@
     </w:p>
     <w:p>
       <w:pPr>
-        <w:spacing w:before="20" w:after="20" w:line="264" w:lineRule="auto"/>
+        <w:spacing w:before="20" w:after="20" w:line="240" w:lineRule="auto"/>
       </w:pPr>
       <w:r>
         <w:rPr>
@@ -1223,7 +1223,7 @@
     </w:p>
     <w:p>
       <w:pPr>
-        <w:spacing w:before="20" w:after="20" w:line="264" w:lineRule="auto"/>
+        <w:spacing w:before="20" w:after="20" w:line="240" w:lineRule="auto"/>
       </w:pPr>
       <w:r>
         <w:rPr>
@@ -1249,7 +1249,7 @@
     </w:p>
     <w:p>
       <w:pPr>
-        <w:spacing w:before="20" w:after="20" w:line="264" w:lineRule="auto"/>
+        <w:spacing w:before="20" w:after="20" w:line="240" w:lineRule="auto"/>
       </w:pPr>
       <w:r>
         <w:rPr>
@@ -1275,7 +1275,7 @@
     </w:p>
     <w:p>
       <w:pPr>
-        <w:spacing w:before="120" w:after="0" w:line="264" w:lineRule="auto"/>
+        <w:spacing w:before="80" w:after="0" w:line="240" w:lineRule="auto"/>
         <w:pBdr>
           <w:top w:val="single" w:sz="4" w:space="4" w:color="DDD9D1"/>
         </w:pBdr>

</xml_diff>